<commit_message>
ta paian enghiad tarahi zaban
</commit_message>
<xml_diff>
--- a/طراحی زبان/پروژه طراحی زبان.docx
+++ b/طراحی زبان/پروژه طراحی زبان.docx
@@ -794,10 +794,63 @@
           <w:lang w:bidi="fa-IR"/>
         </w:rPr>
       </w:pPr>
-    </w:p>
-    <w:p>
-      <w:pPr>
-        <w:bidi/>
+      <w:r>
+        <w:rPr>
+          <w:rFonts w:cs="B Nazanin"/>
+          <w:sz w:val="28"/>
+          <w:szCs w:val="28"/>
+          <w:rtl/>
+          <w:lang w:bidi="fa-IR"/>
+        </w:rPr>
+        <w:drawing>
+          <wp:inline distT="0" distB="0" distL="0" distR="0" wp14:anchorId="04E118B5" wp14:editId="639C6346">
+            <wp:extent cx="5943600" cy="732155"/>
+            <wp:effectExtent l="0" t="0" r="0" b="0"/>
+            <wp:docPr id="585107832" name="Picture 1"/>
+            <wp:cNvGraphicFramePr>
+              <a:graphicFrameLocks xmlns:a="http://schemas.openxmlformats.org/drawingml/2006/main" noChangeAspect="1"/>
+            </wp:cNvGraphicFramePr>
+            <a:graphic xmlns:a="http://schemas.openxmlformats.org/drawingml/2006/main">
+              <a:graphicData uri="http://schemas.openxmlformats.org/drawingml/2006/picture">
+                <pic:pic xmlns:pic="http://schemas.openxmlformats.org/drawingml/2006/picture">
+                  <pic:nvPicPr>
+                    <pic:cNvPr id="585107832" name=""/>
+                    <pic:cNvPicPr/>
+                  </pic:nvPicPr>
+                  <pic:blipFill>
+                    <a:blip r:embed="rId5"/>
+                    <a:stretch>
+                      <a:fillRect/>
+                    </a:stretch>
+                  </pic:blipFill>
+                  <pic:spPr>
+                    <a:xfrm>
+                      <a:off x="0" y="0"/>
+                      <a:ext cx="5943600" cy="732155"/>
+                    </a:xfrm>
+                    <a:prstGeom prst="rect">
+                      <a:avLst/>
+                    </a:prstGeom>
+                  </pic:spPr>
+                </pic:pic>
+              </a:graphicData>
+            </a:graphic>
+          </wp:inline>
+        </w:drawing>
+      </w:r>
+    </w:p>
+    <w:p>
+      <w:pPr>
+        <w:bidi/>
+        <w:rPr>
+          <w:rFonts w:cs="B Nazanin"/>
+          <w:sz w:val="28"/>
+          <w:szCs w:val="28"/>
+          <w:rtl/>
+          <w:lang w:bidi="fa-IR"/>
+        </w:rPr>
+      </w:pPr>
+      <w:r>
         <w:rPr>
           <w:rFonts w:cs="B Nazanin" w:hint="cs"/>
           <w:sz w:val="28"/>
@@ -805,23 +858,57 @@
           <w:rtl/>
           <w:lang w:bidi="fa-IR"/>
         </w:rPr>
-      </w:pPr>
-    </w:p>
-    <w:p>
-      <w:pPr>
-        <w:rPr>
-          <w:rFonts w:cs="B Nazanin"/>
-          <w:sz w:val="28"/>
-          <w:szCs w:val="28"/>
-          <w:rtl/>
-        </w:rPr>
-      </w:pPr>
-      <w:r>
-        <w:rPr>
-          <w:rFonts w:cs="B Nazanin"/>
-          <w:sz w:val="28"/>
-          <w:szCs w:val="28"/>
-          <w:rtl/>
+        <w:t xml:space="preserve">در قطعه کد بالا اول کد به شکل کامپایلری به بایت کد تبدیل میشود و سپس توسط </w:t>
+      </w:r>
+      <w:r>
+        <w:rPr>
+          <w:rFonts w:cs="B Nazanin"/>
+          <w:sz w:val="28"/>
+          <w:szCs w:val="28"/>
+          <w:lang w:bidi="fa-IR"/>
+        </w:rPr>
+        <w:t xml:space="preserve">PVM </w:t>
+      </w:r>
+      <w:r>
+        <w:rPr>
+          <w:rFonts w:cs="B Nazanin" w:hint="cs"/>
+          <w:sz w:val="28"/>
+          <w:szCs w:val="28"/>
+          <w:rtl/>
+          <w:lang w:bidi="fa-IR"/>
+        </w:rPr>
+        <w:t xml:space="preserve"> و به شکل تفسیری اجرا میشود.</w:t>
+      </w:r>
+    </w:p>
+    <w:p>
+      <w:pPr>
+        <w:bidi/>
+        <w:rPr>
+          <w:rFonts w:cs="B Nazanin"/>
+          <w:sz w:val="28"/>
+          <w:szCs w:val="28"/>
+          <w:rtl/>
+          <w:lang w:bidi="fa-IR"/>
+        </w:rPr>
+      </w:pPr>
+    </w:p>
+    <w:p>
+      <w:pPr>
+        <w:rPr>
+          <w:rFonts w:cs="B Nazanin"/>
+          <w:sz w:val="28"/>
+          <w:szCs w:val="28"/>
+          <w:rtl/>
+          <w:lang w:bidi="fa-IR"/>
+        </w:rPr>
+      </w:pPr>
+      <w:r>
+        <w:rPr>
+          <w:rFonts w:cs="B Nazanin"/>
+          <w:sz w:val="28"/>
+          <w:szCs w:val="28"/>
+          <w:rtl/>
+          <w:lang w:bidi="fa-IR"/>
         </w:rPr>
         <w:br w:type="page"/>
       </w:r>
@@ -830,12 +917,57 @@
       <w:pPr>
         <w:bidi/>
         <w:rPr>
+          <w:rFonts w:cs="B Titr"/>
+          <w:sz w:val="28"/>
+          <w:szCs w:val="28"/>
+          <w:rtl/>
+          <w:lang w:bidi="fa-IR"/>
+        </w:rPr>
+      </w:pPr>
+      <w:r>
+        <w:rPr>
+          <w:rFonts w:cs="B Titr" w:hint="cs"/>
+          <w:sz w:val="28"/>
+          <w:szCs w:val="28"/>
+          <w:rtl/>
+          <w:lang w:bidi="fa-IR"/>
+        </w:rPr>
+        <w:lastRenderedPageBreak/>
+        <w:t>زمان انقیاد در پایتون:</w:t>
+      </w:r>
+    </w:p>
+    <w:p>
+      <w:pPr>
+        <w:bidi/>
+        <w:rPr>
+          <w:rFonts w:cs="B Nazanin"/>
+          <w:sz w:val="28"/>
+          <w:szCs w:val="28"/>
+          <w:rtl/>
+          <w:lang w:bidi="fa-IR"/>
+        </w:rPr>
+      </w:pPr>
+      <w:r>
+        <w:rPr>
           <w:rFonts w:cs="B Nazanin" w:hint="cs"/>
           <w:sz w:val="28"/>
           <w:szCs w:val="28"/>
           <w:rtl/>
           <w:lang w:bidi="fa-IR"/>
         </w:rPr>
+        <w:t xml:space="preserve">زمان انقیاد به دو دسته زود رس و دیر رس تقسیم بندی میشود که در حالت زود رس یعنی در زمان کامپایل نوع و رفتار یک متغییر مشخص میشود و در حالت دیر رس به این شکل است که در زمان اجرا برنامه نوع متغییر مشخص میشود. </w:t>
+      </w:r>
+    </w:p>
+    <w:p>
+      <w:pPr>
+        <w:bidi/>
+        <w:rPr>
+          <w:rFonts w:cs="B Nazanin"/>
+          <w:sz w:val="28"/>
+          <w:szCs w:val="28"/>
+          <w:rtl/>
+          <w:lang w:bidi="fa-IR"/>
+        </w:rPr>
       </w:pPr>
       <w:r>
         <w:rPr>
@@ -843,9 +975,269 @@
           <w:sz w:val="28"/>
           <w:szCs w:val="28"/>
           <w:rtl/>
+          <w:lang w:bidi="fa-IR"/>
+        </w:rPr>
+        <w:t>زبان پایتون به طور کلی از انقیاد دیر رس استفاده میکند. این به این معنی است که در زمان اجرا برنامه نوع متغییر مشخص میشود این رفتار زبان رو در کد زیر بهتر درک میکنیم:</w:t>
+      </w:r>
+    </w:p>
+    <w:p>
+      <w:pPr>
+        <w:bidi/>
+        <w:rPr>
+          <w:rFonts w:cs="B Nazanin"/>
+          <w:sz w:val="28"/>
+          <w:szCs w:val="28"/>
+          <w:rtl/>
+          <w:lang w:bidi="fa-IR"/>
+        </w:rPr>
+      </w:pPr>
+      <w:r>
+        <w:rPr>
+          <w:noProof/>
+        </w:rPr>
+        <w:drawing>
+          <wp:inline distT="0" distB="0" distL="0" distR="0" wp14:anchorId="7C553A61" wp14:editId="11AA69ED">
+            <wp:extent cx="5943600" cy="2072640"/>
+            <wp:effectExtent l="0" t="0" r="0" b="3810"/>
+            <wp:docPr id="16703723" name="Picture 1"/>
+            <wp:cNvGraphicFramePr>
+              <a:graphicFrameLocks xmlns:a="http://schemas.openxmlformats.org/drawingml/2006/main" noChangeAspect="1"/>
+            </wp:cNvGraphicFramePr>
+            <a:graphic xmlns:a="http://schemas.openxmlformats.org/drawingml/2006/main">
+              <a:graphicData uri="http://schemas.openxmlformats.org/drawingml/2006/picture">
+                <pic:pic xmlns:pic="http://schemas.openxmlformats.org/drawingml/2006/picture">
+                  <pic:nvPicPr>
+                    <pic:cNvPr id="16703723" name=""/>
+                    <pic:cNvPicPr/>
+                  </pic:nvPicPr>
+                  <pic:blipFill>
+                    <a:blip r:embed="rId6"/>
+                    <a:stretch>
+                      <a:fillRect/>
+                    </a:stretch>
+                  </pic:blipFill>
+                  <pic:spPr>
+                    <a:xfrm>
+                      <a:off x="0" y="0"/>
+                      <a:ext cx="5943600" cy="2072640"/>
+                    </a:xfrm>
+                    <a:prstGeom prst="rect">
+                      <a:avLst/>
+                    </a:prstGeom>
+                  </pic:spPr>
+                </pic:pic>
+              </a:graphicData>
+            </a:graphic>
+          </wp:inline>
+        </w:drawing>
+      </w:r>
+    </w:p>
+    <w:p>
+      <w:pPr>
+        <w:bidi/>
+        <w:rPr>
+          <w:rFonts w:cs="B Nazanin"/>
+          <w:sz w:val="28"/>
+          <w:szCs w:val="28"/>
+          <w:rtl/>
+          <w:lang w:bidi="fa-IR"/>
+        </w:rPr>
+      </w:pPr>
+      <w:r>
+        <w:rPr>
+          <w:rFonts w:cs="B Nazanin" w:hint="cs"/>
+          <w:sz w:val="28"/>
+          <w:szCs w:val="28"/>
+          <w:rtl/>
+          <w:lang w:bidi="fa-IR"/>
+        </w:rPr>
+        <w:t xml:space="preserve">در این کد ما در لیست </w:t>
+      </w:r>
+      <w:r>
+        <w:rPr>
+          <w:rFonts w:cs="B Nazanin"/>
+          <w:sz w:val="28"/>
+          <w:szCs w:val="28"/>
+          <w:lang w:bidi="fa-IR"/>
+        </w:rPr>
+        <w:t xml:space="preserve">colors </w:t>
+      </w:r>
+      <w:r>
+        <w:rPr>
+          <w:rFonts w:cs="B Nazanin" w:hint="cs"/>
+          <w:sz w:val="28"/>
+          <w:szCs w:val="28"/>
+          <w:rtl/>
+          <w:lang w:bidi="fa-IR"/>
+        </w:rPr>
+        <w:t xml:space="preserve"> سه تابع قرار دادیم که توقع داریم در هر تابع یک رنگ مجزا چاپ شود ولی خروجی که برگردانده شده نشان میدهد که همه تابع ها به ما رنگ آخری که بعنوان </w:t>
+      </w:r>
+      <w:r>
+        <w:rPr>
+          <w:rFonts w:cs="B Nazanin"/>
+          <w:sz w:val="28"/>
+          <w:szCs w:val="28"/>
+          <w:lang w:bidi="fa-IR"/>
+        </w:rPr>
+        <w:t xml:space="preserve">color </w:t>
+      </w:r>
+      <w:r>
+        <w:rPr>
+          <w:rFonts w:cs="B Nazanin" w:hint="cs"/>
+          <w:sz w:val="28"/>
+          <w:szCs w:val="28"/>
+          <w:rtl/>
+          <w:lang w:bidi="fa-IR"/>
+        </w:rPr>
+        <w:t xml:space="preserve"> قرار گرفته است را برمیگرداند و این مشکل از انقیاد دیر رس به وجود آمده است. </w:t>
+      </w:r>
+      <w:r>
+        <w:rPr>
+          <w:rFonts w:cs="B Nazanin"/>
+          <w:sz w:val="28"/>
+          <w:szCs w:val="28"/>
+          <w:rtl/>
+          <w:lang w:bidi="fa-IR"/>
+        </w:rPr>
+        <w:br/>
+      </w:r>
+      <w:r>
+        <w:rPr>
+          <w:rFonts w:cs="B Nazanin" w:hint="cs"/>
+          <w:sz w:val="28"/>
+          <w:szCs w:val="28"/>
+          <w:rtl/>
+          <w:lang w:bidi="fa-IR"/>
+        </w:rPr>
+        <w:t>در پایتون توانایی انتخاب نوع انقیاد را داریم. در قطعه کد پایین مشکل کد بالا به کمک انقیاد زود رس حل شده است:‌</w:t>
+      </w:r>
+    </w:p>
+    <w:p>
+      <w:pPr>
+        <w:bidi/>
+        <w:rPr>
+          <w:rFonts w:cs="B Nazanin"/>
+          <w:sz w:val="28"/>
+          <w:szCs w:val="28"/>
+          <w:lang w:bidi="fa-IR"/>
+        </w:rPr>
+      </w:pPr>
+      <w:r>
+        <w:rPr>
+          <w:rFonts w:cs="B Nazanin"/>
+          <w:sz w:val="28"/>
+          <w:szCs w:val="28"/>
+          <w:rtl/>
+          <w:lang w:bidi="fa-IR"/>
+        </w:rPr>
+        <w:drawing>
+          <wp:inline distT="0" distB="0" distL="0" distR="0" wp14:anchorId="05E70036" wp14:editId="36DE38B6">
+            <wp:extent cx="5943600" cy="1684655"/>
+            <wp:effectExtent l="0" t="0" r="0" b="0"/>
+            <wp:docPr id="366377039" name="Picture 1"/>
+            <wp:cNvGraphicFramePr>
+              <a:graphicFrameLocks xmlns:a="http://schemas.openxmlformats.org/drawingml/2006/main" noChangeAspect="1"/>
+            </wp:cNvGraphicFramePr>
+            <a:graphic xmlns:a="http://schemas.openxmlformats.org/drawingml/2006/main">
+              <a:graphicData uri="http://schemas.openxmlformats.org/drawingml/2006/picture">
+                <pic:pic xmlns:pic="http://schemas.openxmlformats.org/drawingml/2006/picture">
+                  <pic:nvPicPr>
+                    <pic:cNvPr id="366377039" name=""/>
+                    <pic:cNvPicPr/>
+                  </pic:nvPicPr>
+                  <pic:blipFill>
+                    <a:blip r:embed="rId7"/>
+                    <a:stretch>
+                      <a:fillRect/>
+                    </a:stretch>
+                  </pic:blipFill>
+                  <pic:spPr>
+                    <a:xfrm>
+                      <a:off x="0" y="0"/>
+                      <a:ext cx="5943600" cy="1684655"/>
+                    </a:xfrm>
+                    <a:prstGeom prst="rect">
+                      <a:avLst/>
+                    </a:prstGeom>
+                  </pic:spPr>
+                </pic:pic>
+              </a:graphicData>
+            </a:graphic>
+          </wp:inline>
+        </w:drawing>
+      </w:r>
+    </w:p>
+    <w:p>
+      <w:pPr>
+        <w:bidi/>
+        <w:rPr>
+          <w:rFonts w:cs="B Nazanin" w:hint="cs"/>
+          <w:sz w:val="28"/>
+          <w:szCs w:val="28"/>
+          <w:rtl/>
+          <w:lang w:bidi="fa-IR"/>
+        </w:rPr>
+      </w:pPr>
+      <w:r>
+        <w:rPr>
+          <w:rFonts w:cs="B Nazanin" w:hint="cs"/>
+          <w:sz w:val="28"/>
+          <w:szCs w:val="28"/>
+          <w:rtl/>
+          <w:lang w:bidi="fa-IR"/>
+        </w:rPr>
+        <w:t xml:space="preserve">در این قطعه کد ما با نوشتن </w:t>
+      </w:r>
+      <w:r>
+        <w:rPr>
+          <w:rFonts w:cs="B Nazanin"/>
+          <w:sz w:val="28"/>
+          <w:szCs w:val="28"/>
+          <w:lang w:bidi="fa-IR"/>
+        </w:rPr>
+        <w:t>color = color</w:t>
+      </w:r>
+      <w:r>
+        <w:rPr>
+          <w:rFonts w:cs="B Nazanin" w:hint="cs"/>
+          <w:sz w:val="28"/>
+          <w:szCs w:val="28"/>
+          <w:rtl/>
+          <w:lang w:bidi="fa-IR"/>
+        </w:rPr>
+        <w:t xml:space="preserve"> به صورت دستی به برنامه گفتیم که انقیاد زود رس انجام دهد و به نوعی برای هر پرینت یه برچسب رنگ گزاشته ایم.</w:t>
+      </w:r>
+    </w:p>
+    <w:p>
+      <w:pPr>
+        <w:tabs>
+          <w:tab w:val="left" w:pos="7193"/>
+        </w:tabs>
+        <w:rPr>
+          <w:rFonts w:cs="B Nazanin"/>
+          <w:sz w:val="28"/>
+          <w:szCs w:val="28"/>
+          <w:lang w:bidi="fa-IR"/>
+        </w:rPr>
+      </w:pPr>
+      <w:r>
+        <w:rPr>
+          <w:rFonts w:cs="B Nazanin"/>
+          <w:sz w:val="28"/>
+          <w:szCs w:val="28"/>
+          <w:rtl/>
+        </w:rPr>
+        <w:br w:type="page"/>
+      </w:r>
+      <w:r>
+        <w:rPr>
+          <w:rFonts w:cs="B Nazanin"/>
+          <w:sz w:val="28"/>
+          <w:szCs w:val="28"/>
+          <w:rtl/>
         </w:rPr>
         <w:lastRenderedPageBreak/>
-        <w:t xml:space="preserve"> صورت مختصر و مفید توضیح داده شود.</w:t>
+        <w:tab/>
       </w:r>
     </w:p>
     <w:sectPr>

</xml_diff>

<commit_message>
update ta noe shomareshi poroje tarahi zaban
</commit_message>
<xml_diff>
--- a/طراحی زبان/پروژه طراحی زبان.docx
+++ b/طراحی زبان/پروژه طراحی زبان.docx
@@ -5,7 +5,6 @@
     <w:p>
       <w:pPr>
         <w:bidi/>
-        <w:jc w:val="center"/>
         <w:rPr>
           <w:rFonts w:cs="B Titr"/>
           <w:sz w:val="36"/>
@@ -28,7 +27,6 @@
     <w:p>
       <w:pPr>
         <w:bidi/>
-        <w:jc w:val="center"/>
         <w:rPr>
           <w:rFonts w:cs="B Titr"/>
           <w:sz w:val="36"/>
@@ -51,7 +49,6 @@
     <w:p>
       <w:pPr>
         <w:bidi/>
-        <w:jc w:val="center"/>
         <w:rPr>
           <w:rFonts w:cs="B Titr"/>
           <w:sz w:val="36"/>
@@ -74,7 +71,6 @@
     <w:p>
       <w:pPr>
         <w:bidi/>
-        <w:jc w:val="center"/>
         <w:rPr>
           <w:rFonts w:cs="B Titr"/>
           <w:sz w:val="36"/>
@@ -97,7 +93,6 @@
     <w:p>
       <w:pPr>
         <w:bidi/>
-        <w:jc w:val="center"/>
         <w:rPr>
           <w:rFonts w:cs="B Titr"/>
           <w:sz w:val="36"/>
@@ -120,7 +115,6 @@
     <w:p>
       <w:pPr>
         <w:bidi/>
-        <w:jc w:val="center"/>
         <w:rPr>
           <w:rFonts w:cs="B Titr"/>
           <w:sz w:val="36"/>
@@ -143,7 +137,6 @@
     <w:p>
       <w:pPr>
         <w:bidi/>
-        <w:jc w:val="center"/>
         <w:rPr>
           <w:rFonts w:cs="B Titr"/>
           <w:sz w:val="36"/>
@@ -166,7 +159,6 @@
     <w:p>
       <w:pPr>
         <w:bidi/>
-        <w:jc w:val="center"/>
         <w:rPr>
           <w:rFonts w:cs="B Titr"/>
           <w:sz w:val="36"/>
@@ -189,7 +181,6 @@
     <w:p>
       <w:pPr>
         <w:bidi/>
-        <w:jc w:val="center"/>
         <w:rPr>
           <w:rFonts w:cs="B Titr"/>
           <w:sz w:val="32"/>
@@ -212,6 +203,7 @@
     <w:p>
       <w:pPr>
         <w:bidi/>
+        <w:jc w:val="both"/>
         <w:rPr>
           <w:rFonts w:cs="B Titr"/>
           <w:rtl/>
@@ -221,6 +213,7 @@
     </w:p>
     <w:p>
       <w:pPr>
+        <w:jc w:val="right"/>
         <w:rPr>
           <w:rFonts w:cs="B Titr"/>
           <w:rtl/>
@@ -239,6 +232,7 @@
     <w:p>
       <w:pPr>
         <w:bidi/>
+        <w:jc w:val="both"/>
         <w:rPr>
           <w:rFonts w:cs="B Nazanin"/>
           <w:sz w:val="28"/>
@@ -362,6 +356,7 @@
     <w:p>
       <w:pPr>
         <w:bidi/>
+        <w:jc w:val="both"/>
         <w:rPr>
           <w:rFonts w:cs="B Nazanin"/>
           <w:sz w:val="28"/>
@@ -411,6 +406,7 @@
     <w:p>
       <w:pPr>
         <w:bidi/>
+        <w:jc w:val="both"/>
         <w:rPr>
           <w:rFonts w:cs="B Nazanin"/>
           <w:sz w:val="28"/>
@@ -430,6 +426,7 @@
     </w:p>
     <w:p>
       <w:pPr>
+        <w:jc w:val="right"/>
         <w:rPr>
           <w:rFonts w:cs="B Nazanin"/>
           <w:sz w:val="28"/>
@@ -450,6 +447,7 @@
     <w:p>
       <w:pPr>
         <w:bidi/>
+        <w:jc w:val="both"/>
         <w:rPr>
           <w:rFonts w:cs="B Titr"/>
           <w:sz w:val="28"/>
@@ -493,6 +491,7 @@
     <w:p>
       <w:pPr>
         <w:bidi/>
+        <w:jc w:val="both"/>
         <w:rPr>
           <w:rFonts w:cs="B Titr"/>
           <w:sz w:val="28"/>
@@ -525,6 +524,7 @@
     <w:p>
       <w:pPr>
         <w:bidi/>
+        <w:jc w:val="both"/>
         <w:rPr>
           <w:rFonts w:cs="B Nazanin"/>
           <w:sz w:val="28"/>
@@ -567,6 +567,7 @@
     <w:p>
       <w:pPr>
         <w:bidi/>
+        <w:jc w:val="both"/>
         <w:rPr>
           <w:rFonts w:cs="B Nazanin"/>
           <w:sz w:val="28"/>
@@ -589,6 +590,7 @@
     <w:p>
       <w:pPr>
         <w:bidi/>
+        <w:jc w:val="both"/>
         <w:rPr>
           <w:rFonts w:cs="B Titr"/>
           <w:sz w:val="28"/>
@@ -611,6 +613,7 @@
     <w:p>
       <w:pPr>
         <w:bidi/>
+        <w:jc w:val="both"/>
         <w:rPr>
           <w:rFonts w:cs="B Nazanin"/>
           <w:sz w:val="28"/>
@@ -645,6 +648,7 @@
           <w:numId w:val="3"/>
         </w:numPr>
         <w:bidi/>
+        <w:jc w:val="both"/>
         <w:rPr>
           <w:rFonts w:cs="B Nazanin"/>
           <w:sz w:val="28"/>
@@ -737,6 +741,7 @@
           <w:numId w:val="3"/>
         </w:numPr>
         <w:bidi/>
+        <w:jc w:val="both"/>
         <w:rPr>
           <w:rFonts w:cs="B Nazanin"/>
           <w:sz w:val="28"/>
@@ -786,17 +791,19 @@
     <w:p>
       <w:pPr>
         <w:bidi/>
-        <w:rPr>
-          <w:rFonts w:cs="B Nazanin" w:hint="cs"/>
-          <w:sz w:val="28"/>
-          <w:szCs w:val="28"/>
-          <w:rtl/>
-          <w:lang w:bidi="fa-IR"/>
-        </w:rPr>
-      </w:pPr>
-      <w:r>
-        <w:rPr>
-          <w:rFonts w:cs="B Nazanin"/>
+        <w:jc w:val="both"/>
+        <w:rPr>
+          <w:rFonts w:cs="B Nazanin"/>
+          <w:sz w:val="28"/>
+          <w:szCs w:val="28"/>
+          <w:rtl/>
+          <w:lang w:bidi="fa-IR"/>
+        </w:rPr>
+      </w:pPr>
+      <w:r>
+        <w:rPr>
+          <w:rFonts w:cs="B Nazanin"/>
+          <w:noProof/>
           <w:sz w:val="28"/>
           <w:szCs w:val="28"/>
           <w:rtl/>
@@ -818,7 +825,7 @@
                     <pic:cNvPicPr/>
                   </pic:nvPicPr>
                   <pic:blipFill>
-                    <a:blip r:embed="rId5"/>
+                    <a:blip r:embed="rId7"/>
                     <a:stretch>
                       <a:fillRect/>
                     </a:stretch>
@@ -842,6 +849,7 @@
     <w:p>
       <w:pPr>
         <w:bidi/>
+        <w:jc w:val="both"/>
         <w:rPr>
           <w:rFonts w:cs="B Nazanin"/>
           <w:sz w:val="28"/>
@@ -883,17 +891,19 @@
     <w:p>
       <w:pPr>
         <w:bidi/>
-        <w:rPr>
-          <w:rFonts w:cs="B Nazanin"/>
-          <w:sz w:val="28"/>
-          <w:szCs w:val="28"/>
-          <w:rtl/>
-          <w:lang w:bidi="fa-IR"/>
-        </w:rPr>
-      </w:pPr>
-    </w:p>
-    <w:p>
-      <w:pPr>
+        <w:jc w:val="both"/>
+        <w:rPr>
+          <w:rFonts w:cs="B Nazanin"/>
+          <w:sz w:val="28"/>
+          <w:szCs w:val="28"/>
+          <w:rtl/>
+          <w:lang w:bidi="fa-IR"/>
+        </w:rPr>
+      </w:pPr>
+    </w:p>
+    <w:p>
+      <w:pPr>
+        <w:jc w:val="right"/>
         <w:rPr>
           <w:rFonts w:cs="B Nazanin"/>
           <w:sz w:val="28"/>
@@ -916,6 +926,7 @@
     <w:p>
       <w:pPr>
         <w:bidi/>
+        <w:jc w:val="both"/>
         <w:rPr>
           <w:rFonts w:cs="B Titr"/>
           <w:sz w:val="28"/>
@@ -939,50 +950,135 @@
     <w:p>
       <w:pPr>
         <w:bidi/>
-        <w:rPr>
-          <w:rFonts w:cs="B Nazanin"/>
-          <w:sz w:val="28"/>
-          <w:szCs w:val="28"/>
-          <w:rtl/>
-          <w:lang w:bidi="fa-IR"/>
-        </w:rPr>
-      </w:pPr>
-      <w:r>
-        <w:rPr>
-          <w:rFonts w:cs="B Nazanin" w:hint="cs"/>
-          <w:sz w:val="28"/>
-          <w:szCs w:val="28"/>
-          <w:rtl/>
-          <w:lang w:bidi="fa-IR"/>
-        </w:rPr>
-        <w:t xml:space="preserve">زمان انقیاد به دو دسته زود رس و دیر رس تقسیم بندی میشود که در حالت زود رس یعنی در زمان کامپایل نوع و رفتار یک متغییر مشخص میشود و در حالت دیر رس به این شکل است که در زمان اجرا برنامه نوع متغییر مشخص میشود. </w:t>
-      </w:r>
-    </w:p>
-    <w:p>
-      <w:pPr>
-        <w:bidi/>
-        <w:rPr>
-          <w:rFonts w:cs="B Nazanin"/>
-          <w:sz w:val="28"/>
-          <w:szCs w:val="28"/>
-          <w:rtl/>
-          <w:lang w:bidi="fa-IR"/>
-        </w:rPr>
-      </w:pPr>
-      <w:r>
-        <w:rPr>
-          <w:rFonts w:cs="B Nazanin" w:hint="cs"/>
-          <w:sz w:val="28"/>
-          <w:szCs w:val="28"/>
-          <w:rtl/>
-          <w:lang w:bidi="fa-IR"/>
-        </w:rPr>
-        <w:t>زبان پایتون به طور کلی از انقیاد دیر رس استفاده میکند. این به این معنی است که در زمان اجرا برنامه نوع متغییر مشخص میشود این رفتار زبان رو در کد زیر بهتر درک میکنیم:</w:t>
-      </w:r>
-    </w:p>
-    <w:p>
-      <w:pPr>
-        <w:bidi/>
+        <w:jc w:val="both"/>
+        <w:rPr>
+          <w:rFonts w:cs="B Nazanin"/>
+          <w:sz w:val="28"/>
+          <w:szCs w:val="28"/>
+          <w:lang w:bidi="fa-IR"/>
+        </w:rPr>
+      </w:pPr>
+      <w:r>
+        <w:rPr>
+          <w:rFonts w:cs="B Nazanin" w:hint="cs"/>
+          <w:sz w:val="28"/>
+          <w:szCs w:val="28"/>
+          <w:rtl/>
+          <w:lang w:bidi="fa-IR"/>
+        </w:rPr>
+        <w:t xml:space="preserve">زمان انقیاد به دو دسته زود رس و دیر رس تقسیم بندی میشود که در حالت زود رس یعنی در زمان کامپایل نوع و رفتار یک </w:t>
+      </w:r>
+      <w:r>
+        <w:rPr>
+          <w:rFonts w:cs="B Nazanin" w:hint="cs"/>
+          <w:sz w:val="28"/>
+          <w:szCs w:val="28"/>
+          <w:rtl/>
+          <w:lang w:bidi="fa-IR"/>
+        </w:rPr>
+        <w:t>متغیر</w:t>
+      </w:r>
+      <w:r>
+        <w:rPr>
+          <w:rFonts w:cs="B Nazanin" w:hint="cs"/>
+          <w:sz w:val="28"/>
+          <w:szCs w:val="28"/>
+          <w:rtl/>
+          <w:lang w:bidi="fa-IR"/>
+        </w:rPr>
+        <w:t xml:space="preserve"> مشخص میشود و در حالت دیر رس به این شکل است که در زمان اجرا برنامه نوع </w:t>
+      </w:r>
+      <w:r>
+        <w:rPr>
+          <w:rFonts w:cs="B Nazanin" w:hint="cs"/>
+          <w:sz w:val="28"/>
+          <w:szCs w:val="28"/>
+          <w:rtl/>
+          <w:lang w:bidi="fa-IR"/>
+        </w:rPr>
+        <w:t>متغیر</w:t>
+      </w:r>
+      <w:r>
+        <w:rPr>
+          <w:rFonts w:cs="B Nazanin" w:hint="cs"/>
+          <w:sz w:val="28"/>
+          <w:szCs w:val="28"/>
+          <w:rtl/>
+          <w:lang w:bidi="fa-IR"/>
+        </w:rPr>
+        <w:t xml:space="preserve"> مشخص میشود. </w:t>
+      </w:r>
+    </w:p>
+    <w:p>
+      <w:pPr>
+        <w:bidi/>
+        <w:jc w:val="both"/>
+        <w:rPr>
+          <w:rFonts w:cs="B Titr" w:hint="cs"/>
+          <w:sz w:val="28"/>
+          <w:szCs w:val="28"/>
+          <w:rtl/>
+          <w:lang w:bidi="fa-IR"/>
+        </w:rPr>
+      </w:pPr>
+      <w:r>
+        <w:rPr>
+          <w:rFonts w:cs="B Titr" w:hint="cs"/>
+          <w:sz w:val="28"/>
+          <w:szCs w:val="28"/>
+          <w:rtl/>
+          <w:lang w:bidi="fa-IR"/>
+        </w:rPr>
+        <w:t>انقیاد دیر رس در پایتون:</w:t>
+      </w:r>
+    </w:p>
+    <w:p>
+      <w:pPr>
+        <w:bidi/>
+        <w:jc w:val="both"/>
+        <w:rPr>
+          <w:rFonts w:cs="B Nazanin"/>
+          <w:sz w:val="28"/>
+          <w:szCs w:val="28"/>
+          <w:rtl/>
+          <w:lang w:bidi="fa-IR"/>
+        </w:rPr>
+      </w:pPr>
+      <w:r>
+        <w:rPr>
+          <w:rFonts w:cs="B Nazanin" w:hint="cs"/>
+          <w:sz w:val="28"/>
+          <w:szCs w:val="28"/>
+          <w:rtl/>
+          <w:lang w:bidi="fa-IR"/>
+        </w:rPr>
+        <w:t xml:space="preserve">زبان پایتون به طور کلی از انقیاد دیر رس استفاده میکند. این به این معنی است که در زمان اجرا برنامه نوع </w:t>
+      </w:r>
+      <w:r>
+        <w:rPr>
+          <w:rFonts w:cs="B Nazanin" w:hint="cs"/>
+          <w:sz w:val="28"/>
+          <w:szCs w:val="28"/>
+          <w:rtl/>
+          <w:lang w:bidi="fa-IR"/>
+        </w:rPr>
+        <w:t>متغیر</w:t>
+      </w:r>
+      <w:r>
+        <w:rPr>
+          <w:rFonts w:cs="B Nazanin" w:hint="cs"/>
+          <w:sz w:val="28"/>
+          <w:szCs w:val="28"/>
+          <w:rtl/>
+          <w:lang w:bidi="fa-IR"/>
+        </w:rPr>
+        <w:t xml:space="preserve"> مشخص میشود این رفتار زبان رو در کد زیر بهتر درک میکنیم:</w:t>
+      </w:r>
+    </w:p>
+    <w:p>
+      <w:pPr>
+        <w:bidi/>
+        <w:jc w:val="both"/>
         <w:rPr>
           <w:rFonts w:cs="B Nazanin"/>
           <w:sz w:val="28"/>
@@ -1011,7 +1107,7 @@
                     <pic:cNvPicPr/>
                   </pic:nvPicPr>
                   <pic:blipFill>
-                    <a:blip r:embed="rId6"/>
+                    <a:blip r:embed="rId8"/>
                     <a:stretch>
                       <a:fillRect/>
                     </a:stretch>
@@ -1035,6 +1131,7 @@
     <w:p>
       <w:pPr>
         <w:bidi/>
+        <w:jc w:val="both"/>
         <w:rPr>
           <w:rFonts w:cs="B Nazanin"/>
           <w:sz w:val="28"/>
@@ -1091,16 +1188,76 @@
         </w:rPr>
         <w:t xml:space="preserve"> قرار گرفته است را برمیگرداند و این مشکل از انقیاد دیر رس به وجود آمده است. </w:t>
       </w:r>
-      <w:r>
-        <w:rPr>
-          <w:rFonts w:cs="B Nazanin"/>
-          <w:sz w:val="28"/>
-          <w:szCs w:val="28"/>
-          <w:rtl/>
-          <w:lang w:bidi="fa-IR"/>
-        </w:rPr>
-        <w:br/>
-      </w:r>
+    </w:p>
+    <w:p>
+      <w:pPr>
+        <w:bidi/>
+        <w:jc w:val="both"/>
+        <w:rPr>
+          <w:rFonts w:cs="B Nazanin"/>
+          <w:sz w:val="28"/>
+          <w:szCs w:val="28"/>
+          <w:rtl/>
+          <w:lang w:bidi="fa-IR"/>
+        </w:rPr>
+      </w:pPr>
+    </w:p>
+    <w:p>
+      <w:pPr>
+        <w:jc w:val="right"/>
+        <w:rPr>
+          <w:rFonts w:cs="B Nazanin"/>
+          <w:sz w:val="28"/>
+          <w:szCs w:val="28"/>
+          <w:rtl/>
+          <w:lang w:bidi="fa-IR"/>
+        </w:rPr>
+      </w:pPr>
+      <w:r>
+        <w:rPr>
+          <w:rFonts w:cs="B Nazanin"/>
+          <w:sz w:val="28"/>
+          <w:szCs w:val="28"/>
+          <w:rtl/>
+          <w:lang w:bidi="fa-IR"/>
+        </w:rPr>
+        <w:br w:type="page"/>
+      </w:r>
+    </w:p>
+    <w:p>
+      <w:pPr>
+        <w:jc w:val="right"/>
+        <w:rPr>
+          <w:rFonts w:cs="B Titr" w:hint="cs"/>
+          <w:sz w:val="28"/>
+          <w:szCs w:val="28"/>
+          <w:rtl/>
+          <w:lang w:bidi="fa-IR"/>
+        </w:rPr>
+      </w:pPr>
+      <w:r>
+        <w:rPr>
+          <w:rFonts w:cs="B Titr" w:hint="cs"/>
+          <w:sz w:val="28"/>
+          <w:szCs w:val="28"/>
+          <w:rtl/>
+          <w:lang w:bidi="fa-IR"/>
+        </w:rPr>
+        <w:lastRenderedPageBreak/>
+        <w:t>انقیاد زود رس در پایتون:</w:t>
+      </w:r>
+    </w:p>
+    <w:p>
+      <w:pPr>
+        <w:jc w:val="right"/>
+        <w:rPr>
+          <w:rFonts w:cs="B Nazanin"/>
+          <w:sz w:val="28"/>
+          <w:szCs w:val="28"/>
+          <w:rtl/>
+          <w:lang w:bidi="fa-IR"/>
+        </w:rPr>
+      </w:pPr>
       <w:r>
         <w:rPr>
           <w:rFonts w:cs="B Nazanin" w:hint="cs"/>
@@ -1115,16 +1272,18 @@
     <w:p>
       <w:pPr>
         <w:bidi/>
-        <w:rPr>
-          <w:rFonts w:cs="B Nazanin"/>
-          <w:sz w:val="28"/>
-          <w:szCs w:val="28"/>
-          <w:lang w:bidi="fa-IR"/>
-        </w:rPr>
-      </w:pPr>
-      <w:r>
-        <w:rPr>
-          <w:rFonts w:cs="B Nazanin"/>
+        <w:jc w:val="both"/>
+        <w:rPr>
+          <w:rFonts w:cs="B Nazanin"/>
+          <w:sz w:val="28"/>
+          <w:szCs w:val="28"/>
+          <w:lang w:bidi="fa-IR"/>
+        </w:rPr>
+      </w:pPr>
+      <w:r>
+        <w:rPr>
+          <w:rFonts w:cs="B Nazanin"/>
+          <w:noProof/>
           <w:sz w:val="28"/>
           <w:szCs w:val="28"/>
           <w:rtl/>
@@ -1146,7 +1305,7 @@
                     <pic:cNvPicPr/>
                   </pic:nvPicPr>
                   <pic:blipFill>
-                    <a:blip r:embed="rId7"/>
+                    <a:blip r:embed="rId9"/>
                     <a:stretch>
                       <a:fillRect/>
                     </a:stretch>
@@ -1170,8 +1329,9 @@
     <w:p>
       <w:pPr>
         <w:bidi/>
-        <w:rPr>
-          <w:rFonts w:cs="B Nazanin" w:hint="cs"/>
+        <w:jc w:val="both"/>
+        <w:rPr>
+          <w:rFonts w:cs="B Nazanin"/>
           <w:sz w:val="28"/>
           <w:szCs w:val="28"/>
           <w:rtl/>
@@ -1205,14 +1365,2582 @@
           <w:rtl/>
           <w:lang w:bidi="fa-IR"/>
         </w:rPr>
-        <w:t xml:space="preserve"> به صورت دستی به برنامه گفتیم که انقیاد زود رس انجام دهد و به نوعی برای هر پرینت یه برچسب رنگ گزاشته ایم.</w:t>
-      </w:r>
+        <w:t xml:space="preserve"> به صورت دستی به برنامه گفتیم که انقیاد زود رس انجام دهد و به نوعی برای هر پرینت ی</w:t>
+      </w:r>
+      <w:r>
+        <w:rPr>
+          <w:rFonts w:cs="B Nazanin" w:hint="cs"/>
+          <w:sz w:val="28"/>
+          <w:szCs w:val="28"/>
+          <w:rtl/>
+          <w:lang w:bidi="fa-IR"/>
+        </w:rPr>
+        <w:t>ک</w:t>
+      </w:r>
+      <w:r>
+        <w:rPr>
+          <w:rFonts w:cs="B Nazanin" w:hint="cs"/>
+          <w:sz w:val="28"/>
+          <w:szCs w:val="28"/>
+          <w:rtl/>
+          <w:lang w:bidi="fa-IR"/>
+        </w:rPr>
+        <w:t xml:space="preserve"> برچسب رنگ گزاشته ایم.</w:t>
+      </w:r>
+    </w:p>
+    <w:p>
+      <w:pPr>
+        <w:rPr>
+          <w:rFonts w:cs="B Nazanin"/>
+          <w:sz w:val="28"/>
+          <w:szCs w:val="28"/>
+          <w:rtl/>
+          <w:lang w:bidi="fa-IR"/>
+        </w:rPr>
+      </w:pPr>
+      <w:r>
+        <w:rPr>
+          <w:rFonts w:cs="B Nazanin"/>
+          <w:sz w:val="28"/>
+          <w:szCs w:val="28"/>
+          <w:rtl/>
+          <w:lang w:bidi="fa-IR"/>
+        </w:rPr>
+        <w:br w:type="page"/>
+      </w:r>
+    </w:p>
+    <w:p>
+      <w:pPr>
+        <w:bidi/>
+        <w:jc w:val="both"/>
+        <w:rPr>
+          <w:rFonts w:cs="B Titr"/>
+          <w:sz w:val="28"/>
+          <w:szCs w:val="28"/>
+          <w:rtl/>
+          <w:lang w:bidi="fa-IR"/>
+        </w:rPr>
+      </w:pPr>
+      <w:r>
+        <w:rPr>
+          <w:rFonts w:cs="B Titr" w:hint="cs"/>
+          <w:sz w:val="28"/>
+          <w:szCs w:val="28"/>
+          <w:rtl/>
+          <w:lang w:bidi="fa-IR"/>
+        </w:rPr>
+        <w:lastRenderedPageBreak/>
+        <w:t>تبدیل نوع در زبان پایتون</w:t>
+      </w:r>
+    </w:p>
+    <w:p>
+      <w:pPr>
+        <w:bidi/>
+        <w:jc w:val="both"/>
+        <w:rPr>
+          <w:rFonts w:cs="B Nazanin"/>
+          <w:sz w:val="28"/>
+          <w:szCs w:val="28"/>
+          <w:rtl/>
+          <w:lang w:bidi="fa-IR"/>
+        </w:rPr>
+      </w:pPr>
+      <w:r>
+        <w:rPr>
+          <w:rFonts w:cs="B Nazanin" w:hint="cs"/>
+          <w:sz w:val="28"/>
+          <w:szCs w:val="28"/>
+          <w:rtl/>
+          <w:lang w:bidi="fa-IR"/>
+        </w:rPr>
+        <w:t>تبدیل نوع به دو شکل اصلی در زبان ها دیده میشود:</w:t>
+      </w:r>
+    </w:p>
+    <w:p>
+      <w:pPr>
+        <w:pStyle w:val="ListParagraph"/>
+        <w:numPr>
+          <w:ilvl w:val="0"/>
+          <w:numId w:val="4"/>
+        </w:numPr>
+        <w:bidi/>
+        <w:jc w:val="both"/>
+        <w:rPr>
+          <w:rFonts w:cs="B Nazanin"/>
+          <w:sz w:val="28"/>
+          <w:szCs w:val="28"/>
+          <w:lang w:bidi="fa-IR"/>
+        </w:rPr>
+      </w:pPr>
+      <w:r>
+        <w:rPr>
+          <w:rFonts w:cs="B Nazanin" w:hint="cs"/>
+          <w:sz w:val="28"/>
+          <w:szCs w:val="28"/>
+          <w:rtl/>
+          <w:lang w:bidi="fa-IR"/>
+        </w:rPr>
+        <w:t>تبدیل نوع ضمنی:‌ این تبدیل نوع زمانی اتفاق می</w:t>
+      </w:r>
+      <w:r>
+        <w:rPr>
+          <w:rFonts w:cs="B Nazanin"/>
+          <w:sz w:val="28"/>
+          <w:szCs w:val="28"/>
+          <w:rtl/>
+          <w:lang w:bidi="fa-IR"/>
+        </w:rPr>
+        <w:softHyphen/>
+      </w:r>
+      <w:r>
+        <w:rPr>
+          <w:rFonts w:cs="B Nazanin" w:hint="cs"/>
+          <w:sz w:val="28"/>
+          <w:szCs w:val="28"/>
+          <w:rtl/>
+          <w:lang w:bidi="fa-IR"/>
+        </w:rPr>
+        <w:t>افتد که خود زبان به صورت خودکار و بدون دخالت برنامه نویس نوع داده ها را باهم تغییر بده تا بهم سازگار بشن.</w:t>
+      </w:r>
+    </w:p>
+    <w:p>
+      <w:pPr>
+        <w:pStyle w:val="ListParagraph"/>
+        <w:numPr>
+          <w:ilvl w:val="0"/>
+          <w:numId w:val="4"/>
+        </w:numPr>
+        <w:bidi/>
+        <w:jc w:val="both"/>
+        <w:rPr>
+          <w:rFonts w:cs="B Nazanin"/>
+          <w:sz w:val="28"/>
+          <w:szCs w:val="28"/>
+          <w:lang w:bidi="fa-IR"/>
+        </w:rPr>
+      </w:pPr>
+      <w:r>
+        <w:rPr>
+          <w:rFonts w:cs="B Nazanin" w:hint="cs"/>
+          <w:sz w:val="28"/>
+          <w:szCs w:val="28"/>
+          <w:rtl/>
+          <w:lang w:bidi="fa-IR"/>
+        </w:rPr>
+        <w:t>تبدیل نوع صریح:‌ این تبدیل نوع زمانی است که خود برنامه نویس به صورت دستی این سازگاری رو بین نوع داده ها ایجاد میکند</w:t>
+      </w:r>
+      <w:r>
+        <w:rPr>
+          <w:rFonts w:cs="B Nazanin" w:hint="cs"/>
+          <w:sz w:val="28"/>
+          <w:szCs w:val="28"/>
+          <w:rtl/>
+          <w:lang w:bidi="fa-IR"/>
+        </w:rPr>
+        <w:t>.</w:t>
+      </w:r>
+    </w:p>
+    <w:p>
+      <w:pPr>
+        <w:bidi/>
+        <w:jc w:val="both"/>
+        <w:rPr>
+          <w:rFonts w:cs="B Nazanin"/>
+          <w:sz w:val="28"/>
+          <w:szCs w:val="28"/>
+          <w:lang w:bidi="fa-IR"/>
+        </w:rPr>
+      </w:pPr>
+      <w:r>
+        <w:rPr>
+          <w:rFonts w:cs="B Nazanin" w:hint="cs"/>
+          <w:sz w:val="28"/>
+          <w:szCs w:val="28"/>
+          <w:rtl/>
+          <w:lang w:bidi="fa-IR"/>
+        </w:rPr>
+        <w:t>در زبان پایتون تبدیل نوع به هر دو شکل دیده میشود یعنی هم تبدیل نوع به صورت خودکار و از طریق زبان صورت میگیرد و هم اگر برنامه نویس بخواهد میتواند به صورت دستی تبدیل نوع را انجام دهد.</w:t>
+      </w:r>
+    </w:p>
+    <w:p>
+      <w:pPr>
+        <w:bidi/>
+        <w:jc w:val="both"/>
+        <w:rPr>
+          <w:rFonts w:cs="B Titr"/>
+          <w:sz w:val="28"/>
+          <w:szCs w:val="28"/>
+          <w:rtl/>
+          <w:lang w:bidi="fa-IR"/>
+        </w:rPr>
+      </w:pPr>
+      <w:r>
+        <w:rPr>
+          <w:rFonts w:cs="B Titr" w:hint="cs"/>
+          <w:sz w:val="28"/>
+          <w:szCs w:val="28"/>
+          <w:rtl/>
+          <w:lang w:bidi="fa-IR"/>
+        </w:rPr>
+        <w:t>تبدیل نوع ضمنی در پایتون</w:t>
+      </w:r>
+    </w:p>
+    <w:p>
+      <w:pPr>
+        <w:bidi/>
+        <w:jc w:val="both"/>
+        <w:rPr>
+          <w:rFonts w:cs="B Nazanin"/>
+          <w:sz w:val="28"/>
+          <w:szCs w:val="28"/>
+          <w:rtl/>
+          <w:lang w:bidi="fa-IR"/>
+        </w:rPr>
+      </w:pPr>
+      <w:r>
+        <w:rPr>
+          <w:rFonts w:cs="B Nazanin" w:hint="cs"/>
+          <w:sz w:val="28"/>
+          <w:szCs w:val="28"/>
+          <w:rtl/>
+          <w:lang w:bidi="fa-IR"/>
+        </w:rPr>
+        <w:t xml:space="preserve">در طراحی زبان های برنامه نویسی، تبدیل نوع ضمنی یکی از ویژگی های مهمی که </w:t>
+      </w:r>
+      <w:r>
+        <w:rPr>
+          <w:rFonts w:cs="B Nazanin"/>
+          <w:sz w:val="28"/>
+          <w:szCs w:val="28"/>
+          <w:rtl/>
+          <w:lang w:bidi="fa-IR"/>
+        </w:rPr>
+        <w:t>مستقیماً</w:t>
+      </w:r>
+      <w:r>
+        <w:rPr>
+          <w:sz w:val="32"/>
+          <w:szCs w:val="32"/>
+          <w:rtl/>
+        </w:rPr>
+        <w:t xml:space="preserve"> </w:t>
+      </w:r>
+      <w:r>
+        <w:rPr>
+          <w:rFonts w:cs="B Nazanin" w:hint="cs"/>
+          <w:sz w:val="28"/>
+          <w:szCs w:val="28"/>
+          <w:rtl/>
+          <w:lang w:bidi="fa-IR"/>
+        </w:rPr>
+        <w:t>با سهولت استفاده، انعطاف پذیری و رفتار داینامیک زبان ارتباط مستقیم دارد.</w:t>
+      </w:r>
+    </w:p>
+    <w:p>
+      <w:pPr>
+        <w:bidi/>
+        <w:jc w:val="both"/>
+        <w:rPr>
+          <w:rFonts w:cs="B Nazanin"/>
+          <w:sz w:val="28"/>
+          <w:szCs w:val="28"/>
+          <w:rtl/>
+          <w:lang w:bidi="fa-IR"/>
+        </w:rPr>
+      </w:pPr>
+      <w:r>
+        <w:rPr>
+          <w:rFonts w:cs="B Nazanin" w:hint="cs"/>
+          <w:sz w:val="28"/>
+          <w:szCs w:val="28"/>
+          <w:rtl/>
+          <w:lang w:bidi="fa-IR"/>
+        </w:rPr>
+        <w:t xml:space="preserve">در قطعه کد زیر یک نمونه از تبدیل نوع ضمنی در پایتون رو مشاهده میکنیم: </w:t>
+      </w:r>
+    </w:p>
+    <w:p>
+      <w:pPr>
+        <w:bidi/>
+        <w:jc w:val="both"/>
+        <w:rPr>
+          <w:rFonts w:cs="B Nazanin"/>
+          <w:sz w:val="28"/>
+          <w:szCs w:val="28"/>
+        </w:rPr>
+      </w:pPr>
+      <w:r>
+        <w:rPr>
+          <w:rFonts w:cs="B Nazanin"/>
+          <w:sz w:val="28"/>
+          <w:szCs w:val="28"/>
+          <w:rtl/>
+          <w:lang w:bidi="fa-IR"/>
+        </w:rPr>
+        <w:drawing>
+          <wp:inline distT="0" distB="0" distL="0" distR="0" wp14:anchorId="3108BBD4" wp14:editId="01A5BBB4">
+            <wp:extent cx="5943600" cy="1008380"/>
+            <wp:effectExtent l="0" t="0" r="0" b="1270"/>
+            <wp:docPr id="189165983" name="Picture 1"/>
+            <wp:cNvGraphicFramePr>
+              <a:graphicFrameLocks xmlns:a="http://schemas.openxmlformats.org/drawingml/2006/main" noChangeAspect="1"/>
+            </wp:cNvGraphicFramePr>
+            <a:graphic xmlns:a="http://schemas.openxmlformats.org/drawingml/2006/main">
+              <a:graphicData uri="http://schemas.openxmlformats.org/drawingml/2006/picture">
+                <pic:pic xmlns:pic="http://schemas.openxmlformats.org/drawingml/2006/picture">
+                  <pic:nvPicPr>
+                    <pic:cNvPr id="189165983" name=""/>
+                    <pic:cNvPicPr/>
+                  </pic:nvPicPr>
+                  <pic:blipFill>
+                    <a:blip r:embed="rId10"/>
+                    <a:stretch>
+                      <a:fillRect/>
+                    </a:stretch>
+                  </pic:blipFill>
+                  <pic:spPr>
+                    <a:xfrm>
+                      <a:off x="0" y="0"/>
+                      <a:ext cx="5943600" cy="1008380"/>
+                    </a:xfrm>
+                    <a:prstGeom prst="rect">
+                      <a:avLst/>
+                    </a:prstGeom>
+                  </pic:spPr>
+                </pic:pic>
+              </a:graphicData>
+            </a:graphic>
+          </wp:inline>
+        </w:drawing>
+      </w:r>
+    </w:p>
+    <w:p>
+      <w:pPr>
+        <w:bidi/>
+        <w:jc w:val="both"/>
+        <w:rPr>
+          <w:rFonts w:cs="B Nazanin"/>
+          <w:sz w:val="28"/>
+          <w:szCs w:val="28"/>
+          <w:rtl/>
+          <w:lang w:bidi="fa-IR"/>
+        </w:rPr>
+      </w:pPr>
+      <w:r>
+        <w:rPr>
+          <w:rFonts w:cs="B Nazanin" w:hint="cs"/>
+          <w:sz w:val="28"/>
+          <w:szCs w:val="28"/>
+          <w:rtl/>
+          <w:lang w:bidi="fa-IR"/>
+        </w:rPr>
+        <w:t xml:space="preserve">در قطعه کد بالا مشاده میکنیم که </w:t>
+      </w:r>
+      <w:r>
+        <w:rPr>
+          <w:rFonts w:cs="B Nazanin" w:hint="cs"/>
+          <w:sz w:val="28"/>
+          <w:szCs w:val="28"/>
+          <w:rtl/>
+          <w:lang w:bidi="fa-IR"/>
+        </w:rPr>
+        <w:t>متغیر</w:t>
+      </w:r>
+      <w:r>
+        <w:rPr>
+          <w:rFonts w:cs="B Nazanin" w:hint="cs"/>
+          <w:sz w:val="28"/>
+          <w:szCs w:val="28"/>
+          <w:rtl/>
+          <w:lang w:bidi="fa-IR"/>
+        </w:rPr>
+        <w:t xml:space="preserve"> </w:t>
+      </w:r>
+      <w:r>
+        <w:rPr>
+          <w:rFonts w:cs="B Nazanin"/>
+          <w:sz w:val="28"/>
+          <w:szCs w:val="28"/>
+          <w:lang w:bidi="fa-IR"/>
+        </w:rPr>
+        <w:t>A</w:t>
+      </w:r>
+      <w:r>
+        <w:rPr>
+          <w:rFonts w:cs="B Nazanin" w:hint="cs"/>
+          <w:sz w:val="28"/>
+          <w:szCs w:val="28"/>
+          <w:rtl/>
+          <w:lang w:bidi="fa-IR"/>
+        </w:rPr>
+        <w:t xml:space="preserve"> از نوع </w:t>
+      </w:r>
+      <w:r>
+        <w:rPr>
+          <w:rFonts w:cs="B Nazanin"/>
+          <w:sz w:val="28"/>
+          <w:szCs w:val="28"/>
+          <w:lang w:bidi="fa-IR"/>
+        </w:rPr>
+        <w:t>int</w:t>
+      </w:r>
+      <w:r>
+        <w:rPr>
+          <w:rFonts w:cs="B Nazanin" w:hint="cs"/>
+          <w:sz w:val="28"/>
+          <w:szCs w:val="28"/>
+          <w:rtl/>
+          <w:lang w:bidi="fa-IR"/>
+        </w:rPr>
+        <w:t xml:space="preserve"> تعریف شده است و همچنین </w:t>
+      </w:r>
+      <w:r>
+        <w:rPr>
+          <w:rFonts w:cs="B Nazanin" w:hint="cs"/>
+          <w:sz w:val="28"/>
+          <w:szCs w:val="28"/>
+          <w:rtl/>
+          <w:lang w:bidi="fa-IR"/>
+        </w:rPr>
+        <w:t>متغیر</w:t>
+      </w:r>
+      <w:r>
+        <w:rPr>
+          <w:rFonts w:cs="B Nazanin" w:hint="cs"/>
+          <w:sz w:val="28"/>
+          <w:szCs w:val="28"/>
+          <w:rtl/>
+          <w:lang w:bidi="fa-IR"/>
+        </w:rPr>
+        <w:t xml:space="preserve"> </w:t>
+      </w:r>
+      <w:r>
+        <w:rPr>
+          <w:rFonts w:cs="B Nazanin"/>
+          <w:sz w:val="28"/>
+          <w:szCs w:val="28"/>
+          <w:lang w:bidi="fa-IR"/>
+        </w:rPr>
+        <w:t>B</w:t>
+      </w:r>
+      <w:r>
+        <w:rPr>
+          <w:rFonts w:cs="B Nazanin" w:hint="cs"/>
+          <w:sz w:val="28"/>
+          <w:szCs w:val="28"/>
+          <w:rtl/>
+          <w:lang w:bidi="fa-IR"/>
+        </w:rPr>
+        <w:t xml:space="preserve"> از نوع </w:t>
+      </w:r>
+      <w:r>
+        <w:rPr>
+          <w:rFonts w:cs="B Nazanin"/>
+          <w:sz w:val="28"/>
+          <w:szCs w:val="28"/>
+          <w:lang w:bidi="fa-IR"/>
+        </w:rPr>
+        <w:t>float</w:t>
+      </w:r>
+      <w:r>
+        <w:rPr>
+          <w:rFonts w:cs="B Nazanin" w:hint="cs"/>
+          <w:sz w:val="28"/>
+          <w:szCs w:val="28"/>
+          <w:rtl/>
+          <w:lang w:bidi="fa-IR"/>
+        </w:rPr>
+        <w:t xml:space="preserve"> تعریف شده است و در قسمت </w:t>
+      </w:r>
+      <w:r>
+        <w:rPr>
+          <w:rFonts w:cs="B Nazanin"/>
+          <w:sz w:val="28"/>
+          <w:szCs w:val="28"/>
+          <w:lang w:bidi="fa-IR"/>
+        </w:rPr>
+        <w:t>print</w:t>
+      </w:r>
+      <w:r>
+        <w:rPr>
+          <w:rFonts w:cs="B Nazanin" w:hint="cs"/>
+          <w:sz w:val="28"/>
+          <w:szCs w:val="28"/>
+          <w:rtl/>
+          <w:lang w:bidi="fa-IR"/>
+        </w:rPr>
+        <w:t xml:space="preserve"> مشاهده میشود که ما دو </w:t>
+      </w:r>
+      <w:r>
+        <w:rPr>
+          <w:rFonts w:cs="B Nazanin" w:hint="cs"/>
+          <w:sz w:val="28"/>
+          <w:szCs w:val="28"/>
+          <w:rtl/>
+          <w:lang w:bidi="fa-IR"/>
+        </w:rPr>
+        <w:t>متغیر</w:t>
+      </w:r>
+      <w:r>
+        <w:rPr>
+          <w:rFonts w:cs="B Nazanin" w:hint="cs"/>
+          <w:sz w:val="28"/>
+          <w:szCs w:val="28"/>
+          <w:rtl/>
+          <w:lang w:bidi="fa-IR"/>
+        </w:rPr>
+        <w:t xml:space="preserve"> را باهم جمع کرده ایم و با اینکه دو </w:t>
+      </w:r>
+      <w:r>
+        <w:rPr>
+          <w:rFonts w:cs="B Nazanin" w:hint="cs"/>
+          <w:sz w:val="28"/>
+          <w:szCs w:val="28"/>
+          <w:rtl/>
+          <w:lang w:bidi="fa-IR"/>
+        </w:rPr>
+        <w:t>متغیر</w:t>
+      </w:r>
+      <w:r>
+        <w:rPr>
+          <w:rFonts w:cs="B Nazanin" w:hint="cs"/>
+          <w:sz w:val="28"/>
+          <w:szCs w:val="28"/>
+          <w:rtl/>
+          <w:lang w:bidi="fa-IR"/>
+        </w:rPr>
+        <w:t xml:space="preserve"> نوع های مختلفی دارن این عمل بدون خطا اجرا شده است. یعنی خود زبان به صورت خود کار (ضمنی) </w:t>
+      </w:r>
+      <w:r>
+        <w:rPr>
+          <w:rFonts w:cs="B Nazanin" w:hint="cs"/>
+          <w:sz w:val="28"/>
+          <w:szCs w:val="28"/>
+          <w:rtl/>
+          <w:lang w:bidi="fa-IR"/>
+        </w:rPr>
+        <w:t>متغیر</w:t>
+      </w:r>
+      <w:r>
+        <w:rPr>
+          <w:rFonts w:cs="B Nazanin" w:hint="cs"/>
+          <w:sz w:val="28"/>
+          <w:szCs w:val="28"/>
+          <w:rtl/>
+          <w:lang w:bidi="fa-IR"/>
+        </w:rPr>
+        <w:t xml:space="preserve"> </w:t>
+      </w:r>
+      <w:r>
+        <w:rPr>
+          <w:rFonts w:cs="B Nazanin"/>
+          <w:sz w:val="28"/>
+          <w:szCs w:val="28"/>
+          <w:lang w:bidi="fa-IR"/>
+        </w:rPr>
+        <w:t>A</w:t>
+      </w:r>
+      <w:r>
+        <w:rPr>
+          <w:rFonts w:cs="B Nazanin" w:hint="cs"/>
+          <w:sz w:val="28"/>
+          <w:szCs w:val="28"/>
+          <w:rtl/>
+          <w:lang w:bidi="fa-IR"/>
+        </w:rPr>
+        <w:t xml:space="preserve"> را به </w:t>
+      </w:r>
+      <w:r>
+        <w:rPr>
+          <w:rFonts w:cs="B Nazanin"/>
+          <w:sz w:val="28"/>
+          <w:szCs w:val="28"/>
+          <w:lang w:bidi="fa-IR"/>
+        </w:rPr>
+        <w:t>float</w:t>
+      </w:r>
+      <w:r>
+        <w:rPr>
+          <w:rFonts w:cs="B Nazanin" w:hint="cs"/>
+          <w:sz w:val="28"/>
+          <w:szCs w:val="28"/>
+          <w:rtl/>
+          <w:lang w:bidi="fa-IR"/>
+        </w:rPr>
+        <w:t xml:space="preserve"> تبدیل کرده است و سپس عمل جمع را بین دو </w:t>
+      </w:r>
+      <w:r>
+        <w:rPr>
+          <w:rFonts w:cs="B Nazanin" w:hint="cs"/>
+          <w:sz w:val="28"/>
+          <w:szCs w:val="28"/>
+          <w:rtl/>
+          <w:lang w:bidi="fa-IR"/>
+        </w:rPr>
+        <w:t>متغیر</w:t>
+      </w:r>
+      <w:r>
+        <w:rPr>
+          <w:rFonts w:cs="B Nazanin" w:hint="cs"/>
+          <w:sz w:val="28"/>
+          <w:szCs w:val="28"/>
+          <w:rtl/>
+          <w:lang w:bidi="fa-IR"/>
+        </w:rPr>
+        <w:t xml:space="preserve"> انجام داده است.</w:t>
+      </w:r>
+    </w:p>
+    <w:p>
+      <w:pPr>
+        <w:bidi/>
+        <w:jc w:val="both"/>
+        <w:rPr>
+          <w:rFonts w:cs="B Titr"/>
+          <w:sz w:val="28"/>
+          <w:szCs w:val="28"/>
+          <w:rtl/>
+          <w:lang w:bidi="fa-IR"/>
+        </w:rPr>
+      </w:pPr>
+      <w:r>
+        <w:rPr>
+          <w:rFonts w:cs="B Titr" w:hint="cs"/>
+          <w:sz w:val="28"/>
+          <w:szCs w:val="28"/>
+          <w:rtl/>
+          <w:lang w:bidi="fa-IR"/>
+        </w:rPr>
+        <w:t>تبدیل نوع صریح در پایتون</w:t>
+      </w:r>
+    </w:p>
+    <w:p>
+      <w:pPr>
+        <w:bidi/>
+        <w:jc w:val="both"/>
+        <w:rPr>
+          <w:rFonts w:cs="B Nazanin"/>
+          <w:sz w:val="28"/>
+          <w:szCs w:val="28"/>
+          <w:rtl/>
+          <w:lang w:bidi="fa-IR"/>
+        </w:rPr>
+      </w:pPr>
+      <w:r>
+        <w:rPr>
+          <w:rFonts w:cs="B Nazanin" w:hint="cs"/>
+          <w:sz w:val="28"/>
+          <w:szCs w:val="28"/>
+          <w:rtl/>
+          <w:lang w:bidi="fa-IR"/>
+        </w:rPr>
+        <w:t>همان طور که گفته شده بود پایتون از تبدیل نوع صریح نیز پشتیبانی میکند به این قابلیت زبان که از هر دو نوع تبدیل نوع پشتیبانی میکند (</w:t>
+      </w:r>
+      <w:r>
+        <w:rPr>
+          <w:rFonts w:cs="B Nazanin"/>
+          <w:sz w:val="28"/>
+          <w:szCs w:val="28"/>
+          <w:lang w:bidi="fa-IR"/>
+        </w:rPr>
+        <w:t>weakly typed</w:t>
+      </w:r>
+      <w:r>
+        <w:rPr>
+          <w:rFonts w:cs="B Nazanin" w:hint="cs"/>
+          <w:sz w:val="28"/>
+          <w:szCs w:val="28"/>
+          <w:rtl/>
+          <w:lang w:bidi="fa-IR"/>
+        </w:rPr>
+        <w:t>) گفته میشود.</w:t>
+      </w:r>
+    </w:p>
+    <w:p>
+      <w:pPr>
+        <w:bidi/>
+        <w:jc w:val="both"/>
+        <w:rPr>
+          <w:rFonts w:cs="B Nazanin"/>
+          <w:sz w:val="28"/>
+          <w:szCs w:val="28"/>
+          <w:rtl/>
+          <w:lang w:bidi="fa-IR"/>
+        </w:rPr>
+      </w:pPr>
+      <w:r>
+        <w:rPr>
+          <w:rFonts w:cs="B Nazanin" w:hint="cs"/>
+          <w:sz w:val="28"/>
+          <w:szCs w:val="28"/>
+          <w:rtl/>
+          <w:lang w:bidi="fa-IR"/>
+        </w:rPr>
+        <w:t xml:space="preserve">در قطعه کد زیر یک مثال از تبدیل نوع صریح در پایتون رو مشاده میکنیم: </w:t>
+      </w:r>
+    </w:p>
+    <w:p>
+      <w:pPr>
+        <w:bidi/>
+        <w:jc w:val="both"/>
+        <w:rPr>
+          <w:rFonts w:cs="B Nazanin"/>
+          <w:sz w:val="28"/>
+          <w:szCs w:val="28"/>
+        </w:rPr>
+      </w:pPr>
+      <w:r>
+        <w:rPr>
+          <w:rFonts w:cs="B Nazanin"/>
+          <w:sz w:val="28"/>
+          <w:szCs w:val="28"/>
+          <w:rtl/>
+        </w:rPr>
+        <w:lastRenderedPageBreak/>
+        <w:drawing>
+          <wp:inline distT="0" distB="0" distL="0" distR="0" wp14:anchorId="736FEB0B" wp14:editId="622F128B">
+            <wp:extent cx="5943600" cy="840740"/>
+            <wp:effectExtent l="0" t="0" r="0" b="0"/>
+            <wp:docPr id="1254516878" name="Picture 1"/>
+            <wp:cNvGraphicFramePr>
+              <a:graphicFrameLocks xmlns:a="http://schemas.openxmlformats.org/drawingml/2006/main" noChangeAspect="1"/>
+            </wp:cNvGraphicFramePr>
+            <a:graphic xmlns:a="http://schemas.openxmlformats.org/drawingml/2006/main">
+              <a:graphicData uri="http://schemas.openxmlformats.org/drawingml/2006/picture">
+                <pic:pic xmlns:pic="http://schemas.openxmlformats.org/drawingml/2006/picture">
+                  <pic:nvPicPr>
+                    <pic:cNvPr id="1254516878" name=""/>
+                    <pic:cNvPicPr/>
+                  </pic:nvPicPr>
+                  <pic:blipFill>
+                    <a:blip r:embed="rId11"/>
+                    <a:stretch>
+                      <a:fillRect/>
+                    </a:stretch>
+                  </pic:blipFill>
+                  <pic:spPr>
+                    <a:xfrm>
+                      <a:off x="0" y="0"/>
+                      <a:ext cx="5943600" cy="840740"/>
+                    </a:xfrm>
+                    <a:prstGeom prst="rect">
+                      <a:avLst/>
+                    </a:prstGeom>
+                  </pic:spPr>
+                </pic:pic>
+              </a:graphicData>
+            </a:graphic>
+          </wp:inline>
+        </w:drawing>
+      </w:r>
+    </w:p>
+    <w:p>
+      <w:pPr>
+        <w:tabs>
+          <w:tab w:val="left" w:pos="6273"/>
+        </w:tabs>
+        <w:bidi/>
+        <w:jc w:val="both"/>
+        <w:rPr>
+          <w:rFonts w:cs="B Nazanin"/>
+          <w:sz w:val="28"/>
+          <w:szCs w:val="28"/>
+          <w:rtl/>
+          <w:lang w:bidi="fa-IR"/>
+        </w:rPr>
+      </w:pPr>
+      <w:r>
+        <w:rPr>
+          <w:rFonts w:cs="B Nazanin" w:hint="cs"/>
+          <w:sz w:val="28"/>
+          <w:szCs w:val="28"/>
+          <w:rtl/>
+          <w:lang w:bidi="fa-IR"/>
+        </w:rPr>
+        <w:t xml:space="preserve">در قطعه کد بالا مشاده میکنیم که به صورت دستی و با تابع </w:t>
+      </w:r>
+      <w:r>
+        <w:rPr>
+          <w:rFonts w:cs="B Nazanin"/>
+          <w:sz w:val="28"/>
+          <w:szCs w:val="28"/>
+          <w:lang w:bidi="fa-IR"/>
+        </w:rPr>
+        <w:t>float()</w:t>
+      </w:r>
+      <w:r>
+        <w:rPr>
+          <w:rFonts w:cs="B Nazanin" w:hint="cs"/>
+          <w:sz w:val="28"/>
+          <w:szCs w:val="28"/>
+          <w:rtl/>
+          <w:lang w:bidi="fa-IR"/>
+        </w:rPr>
+        <w:t xml:space="preserve"> به صورت دستی </w:t>
+      </w:r>
+      <w:r>
+        <w:rPr>
+          <w:rFonts w:cs="B Nazanin" w:hint="cs"/>
+          <w:sz w:val="28"/>
+          <w:szCs w:val="28"/>
+          <w:rtl/>
+          <w:lang w:bidi="fa-IR"/>
+        </w:rPr>
+        <w:t>متغیر</w:t>
+      </w:r>
+      <w:r>
+        <w:rPr>
+          <w:rFonts w:cs="B Nazanin" w:hint="cs"/>
+          <w:sz w:val="28"/>
+          <w:szCs w:val="28"/>
+          <w:rtl/>
+          <w:lang w:bidi="fa-IR"/>
+        </w:rPr>
+        <w:t xml:space="preserve"> </w:t>
+      </w:r>
+      <w:r>
+        <w:rPr>
+          <w:rFonts w:cs="B Nazanin"/>
+          <w:sz w:val="28"/>
+          <w:szCs w:val="28"/>
+          <w:lang w:bidi="fa-IR"/>
+        </w:rPr>
+        <w:t>A</w:t>
+      </w:r>
+      <w:r>
+        <w:rPr>
+          <w:rFonts w:cs="B Nazanin" w:hint="cs"/>
+          <w:sz w:val="28"/>
+          <w:szCs w:val="28"/>
+          <w:rtl/>
+          <w:lang w:bidi="fa-IR"/>
+        </w:rPr>
+        <w:t xml:space="preserve"> را از تایپ </w:t>
+      </w:r>
+      <w:r>
+        <w:rPr>
+          <w:rFonts w:cs="B Nazanin"/>
+          <w:sz w:val="28"/>
+          <w:szCs w:val="28"/>
+          <w:lang w:bidi="fa-IR"/>
+        </w:rPr>
+        <w:t>int</w:t>
+      </w:r>
+      <w:r>
+        <w:rPr>
+          <w:rFonts w:cs="B Nazanin" w:hint="cs"/>
+          <w:sz w:val="28"/>
+          <w:szCs w:val="28"/>
+          <w:rtl/>
+          <w:lang w:bidi="fa-IR"/>
+        </w:rPr>
+        <w:t xml:space="preserve"> به </w:t>
+      </w:r>
+      <w:r>
+        <w:rPr>
+          <w:rFonts w:cs="B Nazanin"/>
+          <w:sz w:val="28"/>
+          <w:szCs w:val="28"/>
+          <w:lang w:bidi="fa-IR"/>
+        </w:rPr>
+        <w:t>float</w:t>
+      </w:r>
+      <w:r>
+        <w:rPr>
+          <w:rFonts w:cs="B Nazanin" w:hint="cs"/>
+          <w:sz w:val="28"/>
+          <w:szCs w:val="28"/>
+          <w:rtl/>
+          <w:lang w:bidi="fa-IR"/>
+        </w:rPr>
+        <w:t xml:space="preserve"> تبدیل کردیم و تبدیل نوع صریح اتفاق افتاده است، یعنی به صورت دستی تبدیل نوع انجام شده است.</w:t>
+      </w:r>
+    </w:p>
+    <w:p>
+      <w:pPr>
+        <w:tabs>
+          <w:tab w:val="left" w:pos="6273"/>
+        </w:tabs>
+        <w:bidi/>
+        <w:jc w:val="both"/>
+        <w:rPr>
+          <w:rFonts w:cs="B Titr"/>
+          <w:sz w:val="28"/>
+          <w:szCs w:val="28"/>
+          <w:rtl/>
+          <w:lang w:bidi="fa-IR"/>
+        </w:rPr>
+      </w:pPr>
+      <w:r>
+        <w:rPr>
+          <w:rFonts w:cs="B Titr" w:hint="cs"/>
+          <w:sz w:val="28"/>
+          <w:szCs w:val="28"/>
+          <w:rtl/>
+          <w:lang w:bidi="fa-IR"/>
+        </w:rPr>
+        <w:t>چالش های پشتیبانی زبان از هر دو نوع تبدیل</w:t>
+      </w:r>
+    </w:p>
+    <w:p>
+      <w:pPr>
+        <w:tabs>
+          <w:tab w:val="left" w:pos="6273"/>
+        </w:tabs>
+        <w:bidi/>
+        <w:jc w:val="both"/>
+        <w:rPr>
+          <w:rFonts w:cs="B Nazanin"/>
+          <w:sz w:val="28"/>
+          <w:szCs w:val="28"/>
+          <w:rtl/>
+          <w:lang w:bidi="fa-IR"/>
+        </w:rPr>
+      </w:pPr>
+      <w:r>
+        <w:rPr>
+          <w:rFonts w:cs="B Nazanin" w:hint="cs"/>
+          <w:sz w:val="28"/>
+          <w:szCs w:val="28"/>
+          <w:rtl/>
+          <w:lang w:bidi="fa-IR"/>
+        </w:rPr>
+        <w:t>اینکه زبان پایتون هم از تبدیل نوع صریح و هم ضمنی پشتیبانی میکند دچار چالش ها و پیچیدگی هایی میشود که میتوان به این موارد اشاره کرد:</w:t>
+      </w:r>
+    </w:p>
+    <w:p>
+      <w:pPr>
+        <w:pStyle w:val="ListParagraph"/>
+        <w:numPr>
+          <w:ilvl w:val="0"/>
+          <w:numId w:val="5"/>
+        </w:numPr>
+        <w:tabs>
+          <w:tab w:val="left" w:pos="900"/>
+        </w:tabs>
+        <w:bidi/>
+        <w:jc w:val="both"/>
+        <w:rPr>
+          <w:rFonts w:cs="B Nazanin"/>
+          <w:sz w:val="28"/>
+          <w:szCs w:val="28"/>
+          <w:lang w:bidi="fa-IR"/>
+        </w:rPr>
+      </w:pPr>
+      <w:r>
+        <w:rPr>
+          <w:rFonts w:cs="B Nazanin" w:hint="cs"/>
+          <w:sz w:val="28"/>
+          <w:szCs w:val="28"/>
+          <w:rtl/>
+          <w:lang w:bidi="fa-IR"/>
+        </w:rPr>
+        <w:t xml:space="preserve">جمع </w:t>
+      </w:r>
+      <w:r>
+        <w:rPr>
+          <w:rFonts w:cs="B Nazanin" w:hint="cs"/>
+          <w:sz w:val="28"/>
+          <w:szCs w:val="28"/>
+          <w:rtl/>
+          <w:lang w:bidi="fa-IR"/>
+        </w:rPr>
+        <w:t>متغیر</w:t>
+      </w:r>
+      <w:r>
+        <w:rPr>
+          <w:rFonts w:cs="B Nazanin" w:hint="cs"/>
+          <w:sz w:val="28"/>
+          <w:szCs w:val="28"/>
+          <w:rtl/>
+          <w:lang w:bidi="fa-IR"/>
+        </w:rPr>
+        <w:t xml:space="preserve"> </w:t>
+      </w:r>
+      <w:r>
+        <w:rPr>
+          <w:rFonts w:cs="B Nazanin"/>
+          <w:sz w:val="28"/>
+          <w:szCs w:val="28"/>
+          <w:lang w:bidi="fa-IR"/>
+        </w:rPr>
+        <w:t>bool</w:t>
+      </w:r>
+      <w:r>
+        <w:rPr>
+          <w:rFonts w:cs="B Nazanin" w:hint="cs"/>
+          <w:sz w:val="28"/>
+          <w:szCs w:val="28"/>
+          <w:rtl/>
+          <w:lang w:bidi="fa-IR"/>
+        </w:rPr>
+        <w:t xml:space="preserve"> با </w:t>
+      </w:r>
+      <w:r>
+        <w:rPr>
+          <w:rFonts w:cs="B Nazanin"/>
+          <w:sz w:val="28"/>
+          <w:szCs w:val="28"/>
+          <w:lang w:bidi="fa-IR"/>
+        </w:rPr>
+        <w:t>int</w:t>
+      </w:r>
+      <w:r>
+        <w:rPr>
+          <w:rFonts w:cs="B Nazanin" w:hint="cs"/>
+          <w:sz w:val="28"/>
+          <w:szCs w:val="28"/>
+          <w:rtl/>
+          <w:lang w:bidi="fa-IR"/>
+        </w:rPr>
+        <w:t xml:space="preserve">: در زبان پایتون عبارت </w:t>
+      </w:r>
+      <w:r>
+        <w:rPr>
+          <w:rFonts w:cs="B Nazanin"/>
+          <w:sz w:val="28"/>
+          <w:szCs w:val="28"/>
+          <w:lang w:bidi="fa-IR"/>
+        </w:rPr>
+        <w:t>True</w:t>
+      </w:r>
+      <w:r>
+        <w:rPr>
+          <w:rFonts w:cs="B Nazanin" w:hint="cs"/>
+          <w:sz w:val="28"/>
+          <w:szCs w:val="28"/>
+          <w:rtl/>
+          <w:lang w:bidi="fa-IR"/>
+        </w:rPr>
+        <w:t xml:space="preserve"> برابر ۱ تعریف شده است و از این رو میتواند دچار خطا های محاسباتی بشه.</w:t>
+      </w:r>
+    </w:p>
+    <w:p>
+      <w:pPr>
+        <w:pStyle w:val="ListParagraph"/>
+        <w:tabs>
+          <w:tab w:val="left" w:pos="900"/>
+        </w:tabs>
+        <w:bidi/>
+        <w:jc w:val="both"/>
+        <w:rPr>
+          <w:rFonts w:cs="B Nazanin"/>
+          <w:sz w:val="28"/>
+          <w:szCs w:val="28"/>
+          <w:lang w:bidi="fa-IR"/>
+        </w:rPr>
+      </w:pPr>
+      <w:r>
+        <w:rPr>
+          <w:rFonts w:cs="B Nazanin"/>
+          <w:sz w:val="28"/>
+          <w:szCs w:val="28"/>
+          <w:rtl/>
+          <w:lang w:bidi="fa-IR"/>
+        </w:rPr>
+        <w:drawing>
+          <wp:inline distT="0" distB="0" distL="0" distR="0" wp14:anchorId="20B69E3A" wp14:editId="7EC3993D">
+            <wp:extent cx="5943600" cy="835660"/>
+            <wp:effectExtent l="0" t="0" r="0" b="2540"/>
+            <wp:docPr id="99596950" name="Picture 1"/>
+            <wp:cNvGraphicFramePr>
+              <a:graphicFrameLocks xmlns:a="http://schemas.openxmlformats.org/drawingml/2006/main" noChangeAspect="1"/>
+            </wp:cNvGraphicFramePr>
+            <a:graphic xmlns:a="http://schemas.openxmlformats.org/drawingml/2006/main">
+              <a:graphicData uri="http://schemas.openxmlformats.org/drawingml/2006/picture">
+                <pic:pic xmlns:pic="http://schemas.openxmlformats.org/drawingml/2006/picture">
+                  <pic:nvPicPr>
+                    <pic:cNvPr id="99596950" name=""/>
+                    <pic:cNvPicPr/>
+                  </pic:nvPicPr>
+                  <pic:blipFill>
+                    <a:blip r:embed="rId12"/>
+                    <a:stretch>
+                      <a:fillRect/>
+                    </a:stretch>
+                  </pic:blipFill>
+                  <pic:spPr>
+                    <a:xfrm>
+                      <a:off x="0" y="0"/>
+                      <a:ext cx="5943600" cy="835660"/>
+                    </a:xfrm>
+                    <a:prstGeom prst="rect">
+                      <a:avLst/>
+                    </a:prstGeom>
+                  </pic:spPr>
+                </pic:pic>
+              </a:graphicData>
+            </a:graphic>
+          </wp:inline>
+        </w:drawing>
+      </w:r>
+    </w:p>
+    <w:p>
+      <w:pPr>
+        <w:pStyle w:val="ListParagraph"/>
+        <w:numPr>
+          <w:ilvl w:val="0"/>
+          <w:numId w:val="5"/>
+        </w:numPr>
+        <w:tabs>
+          <w:tab w:val="left" w:pos="900"/>
+        </w:tabs>
+        <w:bidi/>
+        <w:jc w:val="both"/>
+        <w:rPr>
+          <w:rFonts w:cs="B Nazanin"/>
+          <w:sz w:val="28"/>
+          <w:szCs w:val="28"/>
+          <w:lang w:bidi="fa-IR"/>
+        </w:rPr>
+      </w:pPr>
+      <w:r>
+        <w:rPr>
+          <w:rFonts w:cs="B Nazanin" w:hint="cs"/>
+          <w:sz w:val="28"/>
+          <w:szCs w:val="28"/>
+          <w:rtl/>
+          <w:lang w:bidi="fa-IR"/>
+        </w:rPr>
+        <w:t>کاهش شفافیت کد: پیچیدگی دیگری که این رفتار زبان ایجاد کرده است این هست که برنامه نویس دقیق نمیداند که در هر لحظه داده چه نوعی است.</w:t>
+      </w:r>
+    </w:p>
+    <w:p>
+      <w:pPr>
+        <w:pStyle w:val="ListParagraph"/>
+        <w:numPr>
+          <w:ilvl w:val="0"/>
+          <w:numId w:val="5"/>
+        </w:numPr>
+        <w:tabs>
+          <w:tab w:val="left" w:pos="900"/>
+        </w:tabs>
+        <w:bidi/>
+        <w:jc w:val="both"/>
+        <w:rPr>
+          <w:rFonts w:cs="B Nazanin"/>
+          <w:sz w:val="28"/>
+          <w:szCs w:val="28"/>
+          <w:lang w:bidi="fa-IR"/>
+        </w:rPr>
+      </w:pPr>
+      <w:r>
+        <w:rPr>
+          <w:rFonts w:cs="B Nazanin" w:hint="cs"/>
+          <w:sz w:val="28"/>
+          <w:szCs w:val="28"/>
+          <w:rtl/>
+          <w:lang w:bidi="fa-IR"/>
+        </w:rPr>
+        <w:t xml:space="preserve">سختی تست و دیباگ: از آنجایی که در هنگام اجرای برنامه امکان دارد نوع داده ها به صورت ضمنی تغییر کنند این چالش ایجاد میشود که در هنگام تست و دیباگ برنامه </w:t>
+      </w:r>
+      <w:r>
+        <w:rPr>
+          <w:rFonts w:cs="B Nazanin" w:hint="cs"/>
+          <w:sz w:val="28"/>
+          <w:szCs w:val="28"/>
+          <w:rtl/>
+          <w:lang w:bidi="fa-IR"/>
+        </w:rPr>
+        <w:t>نوع متغیر ها سختی در فهم برنامه ایجاد کنند</w:t>
+      </w:r>
+    </w:p>
+    <w:p>
+      <w:pPr>
+        <w:tabs>
+          <w:tab w:val="left" w:pos="900"/>
+        </w:tabs>
+        <w:bidi/>
+        <w:ind w:left="360"/>
+        <w:jc w:val="both"/>
+        <w:rPr>
+          <w:rFonts w:cs="B Nazanin"/>
+          <w:sz w:val="28"/>
+          <w:szCs w:val="28"/>
+          <w:rtl/>
+          <w:lang w:bidi="fa-IR"/>
+        </w:rPr>
+      </w:pPr>
+    </w:p>
+    <w:p>
+      <w:pPr>
+        <w:rPr>
+          <w:rFonts w:cs="B Nazanin"/>
+          <w:sz w:val="28"/>
+          <w:szCs w:val="28"/>
+          <w:rtl/>
+          <w:lang w:bidi="fa-IR"/>
+        </w:rPr>
+      </w:pPr>
+      <w:r>
+        <w:rPr>
+          <w:rFonts w:cs="B Nazanin"/>
+          <w:sz w:val="28"/>
+          <w:szCs w:val="28"/>
+          <w:rtl/>
+          <w:lang w:bidi="fa-IR"/>
+        </w:rPr>
+        <w:br w:type="page"/>
+      </w:r>
+    </w:p>
+    <w:p>
+      <w:pPr>
+        <w:tabs>
+          <w:tab w:val="left" w:pos="900"/>
+        </w:tabs>
+        <w:bidi/>
+        <w:ind w:left="360"/>
+        <w:jc w:val="both"/>
+        <w:rPr>
+          <w:rFonts w:cs="B Titr"/>
+          <w:sz w:val="28"/>
+          <w:szCs w:val="28"/>
+          <w:rtl/>
+          <w:lang w:bidi="fa-IR"/>
+        </w:rPr>
+      </w:pPr>
+      <w:r>
+        <w:rPr>
+          <w:rFonts w:cs="B Titr" w:hint="cs"/>
+          <w:sz w:val="28"/>
+          <w:szCs w:val="28"/>
+          <w:rtl/>
+          <w:lang w:bidi="fa-IR"/>
+        </w:rPr>
+        <w:lastRenderedPageBreak/>
+        <w:t>کنترل نوع در پایتون</w:t>
+      </w:r>
+    </w:p>
+    <w:p>
+      <w:pPr>
+        <w:tabs>
+          <w:tab w:val="left" w:pos="900"/>
+        </w:tabs>
+        <w:bidi/>
+        <w:ind w:left="360"/>
+        <w:jc w:val="both"/>
+        <w:rPr>
+          <w:rFonts w:cs="B Nazanin"/>
+          <w:sz w:val="28"/>
+          <w:szCs w:val="28"/>
+          <w:rtl/>
+          <w:lang w:bidi="fa-IR"/>
+        </w:rPr>
+      </w:pPr>
+      <w:r>
+        <w:rPr>
+          <w:rFonts w:cs="B Nazanin" w:hint="cs"/>
+          <w:sz w:val="28"/>
+          <w:szCs w:val="28"/>
+          <w:rtl/>
+          <w:lang w:bidi="fa-IR"/>
+        </w:rPr>
+        <w:t>به طور کلی کنترل نوع در زبان ها به دو دسته ایستا و پویا (</w:t>
+      </w:r>
+      <w:r>
+        <w:rPr>
+          <w:rFonts w:cs="B Nazanin"/>
+          <w:sz w:val="28"/>
+          <w:szCs w:val="28"/>
+          <w:lang w:bidi="fa-IR"/>
+        </w:rPr>
+        <w:t>static typing – dynamic typing</w:t>
+      </w:r>
+      <w:r>
+        <w:rPr>
+          <w:rFonts w:cs="B Nazanin" w:hint="cs"/>
+          <w:sz w:val="28"/>
+          <w:szCs w:val="28"/>
+          <w:rtl/>
+          <w:lang w:bidi="fa-IR"/>
+        </w:rPr>
+        <w:t>) طبقه بندی میشوند:</w:t>
+      </w:r>
+    </w:p>
+    <w:p>
+      <w:pPr>
+        <w:pStyle w:val="ListParagraph"/>
+        <w:numPr>
+          <w:ilvl w:val="0"/>
+          <w:numId w:val="6"/>
+        </w:numPr>
+        <w:tabs>
+          <w:tab w:val="left" w:pos="900"/>
+        </w:tabs>
+        <w:bidi/>
+        <w:jc w:val="both"/>
+        <w:rPr>
+          <w:rFonts w:cs="B Nazanin"/>
+          <w:sz w:val="28"/>
+          <w:szCs w:val="28"/>
+          <w:lang w:bidi="fa-IR"/>
+        </w:rPr>
+      </w:pPr>
+      <w:r>
+        <w:rPr>
+          <w:rFonts w:cs="B Nazanin" w:hint="cs"/>
+          <w:sz w:val="28"/>
+          <w:szCs w:val="28"/>
+          <w:rtl/>
+          <w:lang w:bidi="fa-IR"/>
+        </w:rPr>
+        <w:t xml:space="preserve">کنترل نوع ایستا: نوع متغیر ها در زمان کامپایل بررسی میشوند و هر متغیر قبل از استفاده باید نوع مشخصی داشته باشد. زبان هایی مانند </w:t>
+      </w:r>
+      <w:r>
+        <w:rPr>
+          <w:rFonts w:cs="B Nazanin"/>
+          <w:sz w:val="28"/>
+          <w:szCs w:val="28"/>
+          <w:lang w:bidi="fa-IR"/>
+        </w:rPr>
+        <w:t>C</w:t>
+      </w:r>
+      <w:r>
+        <w:rPr>
+          <w:rFonts w:cs="B Nazanin" w:hint="cs"/>
+          <w:sz w:val="28"/>
+          <w:szCs w:val="28"/>
+          <w:rtl/>
+          <w:lang w:bidi="fa-IR"/>
+        </w:rPr>
+        <w:t xml:space="preserve"> ، </w:t>
+      </w:r>
+      <w:r>
+        <w:rPr>
+          <w:rFonts w:cs="B Nazanin"/>
+          <w:sz w:val="28"/>
+          <w:szCs w:val="28"/>
+          <w:lang w:bidi="fa-IR"/>
+        </w:rPr>
+        <w:t>Java</w:t>
+      </w:r>
+      <w:r>
+        <w:rPr>
+          <w:rFonts w:cs="B Nazanin" w:hint="cs"/>
+          <w:sz w:val="28"/>
+          <w:szCs w:val="28"/>
+          <w:rtl/>
+          <w:lang w:bidi="fa-IR"/>
+        </w:rPr>
+        <w:t xml:space="preserve"> و </w:t>
+      </w:r>
+      <w:r>
+        <w:rPr>
+          <w:rFonts w:cs="B Nazanin"/>
+          <w:sz w:val="28"/>
+          <w:szCs w:val="28"/>
+          <w:lang w:bidi="fa-IR"/>
+        </w:rPr>
+        <w:t>Rust</w:t>
+      </w:r>
+      <w:r>
+        <w:rPr>
+          <w:rFonts w:cs="B Nazanin" w:hint="cs"/>
+          <w:sz w:val="28"/>
+          <w:szCs w:val="28"/>
+          <w:rtl/>
+          <w:lang w:bidi="fa-IR"/>
+        </w:rPr>
+        <w:t xml:space="preserve"> از این روش استفاده میکنند.</w:t>
+      </w:r>
+    </w:p>
+    <w:p>
+      <w:pPr>
+        <w:pStyle w:val="ListParagraph"/>
+        <w:numPr>
+          <w:ilvl w:val="0"/>
+          <w:numId w:val="6"/>
+        </w:numPr>
+        <w:tabs>
+          <w:tab w:val="left" w:pos="900"/>
+        </w:tabs>
+        <w:bidi/>
+        <w:jc w:val="both"/>
+        <w:rPr>
+          <w:rFonts w:cs="B Nazanin"/>
+          <w:sz w:val="28"/>
+          <w:szCs w:val="28"/>
+          <w:lang w:bidi="fa-IR"/>
+        </w:rPr>
+      </w:pPr>
+      <w:r>
+        <w:rPr>
+          <w:rFonts w:cs="B Nazanin" w:hint="cs"/>
+          <w:sz w:val="28"/>
+          <w:szCs w:val="28"/>
+          <w:rtl/>
+          <w:lang w:bidi="fa-IR"/>
+        </w:rPr>
+        <w:t xml:space="preserve">کنترل نوع پویا: </w:t>
+      </w:r>
+      <w:r>
+        <w:rPr>
+          <w:rFonts w:cs="B Nazanin" w:hint="cs"/>
+          <w:sz w:val="28"/>
+          <w:szCs w:val="28"/>
+          <w:rtl/>
+          <w:lang w:bidi="fa-IR"/>
+        </w:rPr>
+        <w:t xml:space="preserve">نوع متغیر ها در زمان اجرا بررسی میشوند. نیازی به تعریف نوع هنگام اعلان ندارند. زبان هایی که از این نوع کنترل نوع پشتیبانی میکنند میتوان اشاره کرد به:‌ </w:t>
+      </w:r>
+      <w:r>
+        <w:rPr>
+          <w:rFonts w:cs="B Nazanin"/>
+          <w:sz w:val="28"/>
+          <w:szCs w:val="28"/>
+          <w:lang w:bidi="fa-IR"/>
+        </w:rPr>
+        <w:t>Python</w:t>
+      </w:r>
+      <w:r>
+        <w:rPr>
+          <w:rFonts w:cs="B Nazanin" w:hint="cs"/>
+          <w:sz w:val="28"/>
+          <w:szCs w:val="28"/>
+          <w:rtl/>
+          <w:lang w:bidi="fa-IR"/>
+        </w:rPr>
+        <w:t xml:space="preserve"> و </w:t>
+      </w:r>
+      <w:r>
+        <w:rPr>
+          <w:rFonts w:cs="B Nazanin"/>
+          <w:sz w:val="28"/>
+          <w:szCs w:val="28"/>
+          <w:lang w:bidi="fa-IR"/>
+        </w:rPr>
+        <w:t>JavaScript</w:t>
+      </w:r>
+    </w:p>
+    <w:p>
+      <w:pPr>
+        <w:tabs>
+          <w:tab w:val="left" w:pos="900"/>
+        </w:tabs>
+        <w:bidi/>
+        <w:ind w:left="360"/>
+        <w:jc w:val="both"/>
+        <w:rPr>
+          <w:rFonts w:cs="B Titr"/>
+          <w:sz w:val="28"/>
+          <w:szCs w:val="28"/>
+          <w:rtl/>
+          <w:lang w:bidi="fa-IR"/>
+        </w:rPr>
+      </w:pPr>
+      <w:r>
+        <w:rPr>
+          <w:rFonts w:cs="B Titr" w:hint="cs"/>
+          <w:sz w:val="28"/>
+          <w:szCs w:val="28"/>
+          <w:rtl/>
+          <w:lang w:bidi="fa-IR"/>
+        </w:rPr>
+        <w:t>کنترل نوع پویا در پایتون</w:t>
+      </w:r>
+    </w:p>
+    <w:p>
+      <w:pPr>
+        <w:tabs>
+          <w:tab w:val="left" w:pos="900"/>
+        </w:tabs>
+        <w:bidi/>
+        <w:ind w:left="360"/>
+        <w:jc w:val="both"/>
+        <w:rPr>
+          <w:rFonts w:cs="B Nazanin"/>
+          <w:sz w:val="28"/>
+          <w:szCs w:val="28"/>
+          <w:rtl/>
+          <w:lang w:bidi="fa-IR"/>
+        </w:rPr>
+      </w:pPr>
+      <w:r>
+        <w:rPr>
+          <w:rFonts w:cs="B Nazanin" w:hint="cs"/>
+          <w:sz w:val="28"/>
+          <w:szCs w:val="28"/>
+          <w:rtl/>
+          <w:lang w:bidi="fa-IR"/>
+        </w:rPr>
+        <w:t>در پایتون گفته شد که از کنترل نوع پویا استفاده میکند و این به این معنا است که در هنگام نوشتن برنامه نیازی به تعریف نوع متغیر نیست و کنترل نوع در زمان اجرای برنامه صورت میگیرد.</w:t>
+      </w:r>
+    </w:p>
+    <w:p>
+      <w:pPr>
+        <w:tabs>
+          <w:tab w:val="left" w:pos="900"/>
+        </w:tabs>
+        <w:bidi/>
+        <w:ind w:left="360"/>
+        <w:jc w:val="both"/>
+        <w:rPr>
+          <w:rFonts w:cs="B Nazanin"/>
+          <w:sz w:val="28"/>
+          <w:szCs w:val="28"/>
+          <w:lang w:bidi="fa-IR"/>
+        </w:rPr>
+      </w:pPr>
+      <w:r>
+        <w:rPr>
+          <w:rFonts w:cs="B Nazanin"/>
+          <w:sz w:val="28"/>
+          <w:szCs w:val="28"/>
+          <w:rtl/>
+          <w:lang w:bidi="fa-IR"/>
+        </w:rPr>
+        <w:drawing>
+          <wp:inline distT="0" distB="0" distL="0" distR="0" wp14:anchorId="5053B1D0" wp14:editId="12E549F5">
+            <wp:extent cx="5943600" cy="1871980"/>
+            <wp:effectExtent l="0" t="0" r="0" b="0"/>
+            <wp:docPr id="1967621023" name="Picture 1"/>
+            <wp:cNvGraphicFramePr>
+              <a:graphicFrameLocks xmlns:a="http://schemas.openxmlformats.org/drawingml/2006/main" noChangeAspect="1"/>
+            </wp:cNvGraphicFramePr>
+            <a:graphic xmlns:a="http://schemas.openxmlformats.org/drawingml/2006/main">
+              <a:graphicData uri="http://schemas.openxmlformats.org/drawingml/2006/picture">
+                <pic:pic xmlns:pic="http://schemas.openxmlformats.org/drawingml/2006/picture">
+                  <pic:nvPicPr>
+                    <pic:cNvPr id="1967621023" name=""/>
+                    <pic:cNvPicPr/>
+                  </pic:nvPicPr>
+                  <pic:blipFill>
+                    <a:blip r:embed="rId13"/>
+                    <a:stretch>
+                      <a:fillRect/>
+                    </a:stretch>
+                  </pic:blipFill>
+                  <pic:spPr>
+                    <a:xfrm>
+                      <a:off x="0" y="0"/>
+                      <a:ext cx="5943600" cy="1871980"/>
+                    </a:xfrm>
+                    <a:prstGeom prst="rect">
+                      <a:avLst/>
+                    </a:prstGeom>
+                  </pic:spPr>
+                </pic:pic>
+              </a:graphicData>
+            </a:graphic>
+          </wp:inline>
+        </w:drawing>
+      </w:r>
+    </w:p>
+    <w:p>
+      <w:pPr>
+        <w:tabs>
+          <w:tab w:val="left" w:pos="900"/>
+        </w:tabs>
+        <w:bidi/>
+        <w:ind w:left="360"/>
+        <w:jc w:val="both"/>
+        <w:rPr>
+          <w:rFonts w:cs="B Nazanin"/>
+          <w:sz w:val="28"/>
+          <w:szCs w:val="28"/>
+          <w:rtl/>
+          <w:lang w:bidi="fa-IR"/>
+        </w:rPr>
+      </w:pPr>
+      <w:r>
+        <w:rPr>
+          <w:rFonts w:cs="B Nazanin" w:hint="cs"/>
+          <w:sz w:val="28"/>
+          <w:szCs w:val="28"/>
+          <w:rtl/>
+          <w:lang w:bidi="fa-IR"/>
+        </w:rPr>
+        <w:t xml:space="preserve">در کد بالا مشاهده میشود که در مرحله اول </w:t>
+      </w:r>
+      <w:r>
+        <w:rPr>
+          <w:rFonts w:cs="B Nazanin"/>
+          <w:sz w:val="28"/>
+          <w:szCs w:val="28"/>
+          <w:lang w:bidi="fa-IR"/>
+        </w:rPr>
+        <w:t>A</w:t>
+      </w:r>
+      <w:r>
+        <w:rPr>
+          <w:rFonts w:cs="B Nazanin" w:hint="cs"/>
+          <w:sz w:val="28"/>
+          <w:szCs w:val="28"/>
+          <w:rtl/>
+          <w:lang w:bidi="fa-IR"/>
+        </w:rPr>
+        <w:t xml:space="preserve"> از نوع </w:t>
+      </w:r>
+      <w:r>
+        <w:rPr>
+          <w:rFonts w:cs="B Nazanin"/>
+          <w:sz w:val="28"/>
+          <w:szCs w:val="28"/>
+          <w:lang w:bidi="fa-IR"/>
+        </w:rPr>
+        <w:t>int</w:t>
+      </w:r>
+      <w:r>
+        <w:rPr>
+          <w:rFonts w:cs="B Nazanin" w:hint="cs"/>
+          <w:sz w:val="28"/>
+          <w:szCs w:val="28"/>
+          <w:rtl/>
+          <w:lang w:bidi="fa-IR"/>
+        </w:rPr>
+        <w:t xml:space="preserve"> تعریف شده است ولی سپس به </w:t>
+      </w:r>
+      <w:r>
+        <w:rPr>
+          <w:rFonts w:cs="B Nazanin"/>
+          <w:sz w:val="28"/>
+          <w:szCs w:val="28"/>
+          <w:lang w:bidi="fa-IR"/>
+        </w:rPr>
+        <w:t>str</w:t>
+      </w:r>
+      <w:r>
+        <w:rPr>
+          <w:rFonts w:cs="B Nazanin" w:hint="cs"/>
+          <w:sz w:val="28"/>
+          <w:szCs w:val="28"/>
+          <w:rtl/>
+          <w:lang w:bidi="fa-IR"/>
+        </w:rPr>
+        <w:t xml:space="preserve"> تغییر پیدا کرده است و برنامه بدون مشکل این قسمت رو اجرا کرده است ولی زمانی که خواستیم این متغیر رو با یک </w:t>
+      </w:r>
+      <w:r>
+        <w:rPr>
+          <w:rFonts w:cs="B Nazanin"/>
+          <w:sz w:val="28"/>
+          <w:szCs w:val="28"/>
+          <w:lang w:bidi="fa-IR"/>
+        </w:rPr>
+        <w:t>int</w:t>
+      </w:r>
+      <w:r>
+        <w:rPr>
+          <w:rFonts w:cs="B Nazanin" w:hint="cs"/>
+          <w:sz w:val="28"/>
+          <w:szCs w:val="28"/>
+          <w:rtl/>
+          <w:lang w:bidi="fa-IR"/>
+        </w:rPr>
+        <w:t xml:space="preserve"> جمع کنیم خطای نا هماهنگی متغیر ها رو برنامه به ما نمایش داده است.</w:t>
+      </w:r>
+    </w:p>
+    <w:p>
+      <w:pPr>
+        <w:rPr>
+          <w:rFonts w:cs="B Nazanin"/>
+          <w:sz w:val="28"/>
+          <w:szCs w:val="28"/>
+          <w:rtl/>
+          <w:lang w:bidi="fa-IR"/>
+        </w:rPr>
+      </w:pPr>
+      <w:r>
+        <w:rPr>
+          <w:rFonts w:cs="B Nazanin"/>
+          <w:sz w:val="28"/>
+          <w:szCs w:val="28"/>
+          <w:rtl/>
+          <w:lang w:bidi="fa-IR"/>
+        </w:rPr>
+        <w:br w:type="page"/>
+      </w:r>
+    </w:p>
+    <w:p>
+      <w:pPr>
+        <w:tabs>
+          <w:tab w:val="left" w:pos="900"/>
+        </w:tabs>
+        <w:bidi/>
+        <w:ind w:left="360"/>
+        <w:jc w:val="both"/>
+        <w:rPr>
+          <w:rFonts w:cs="B Titr"/>
+          <w:sz w:val="28"/>
+          <w:szCs w:val="28"/>
+          <w:rtl/>
+          <w:lang w:bidi="fa-IR"/>
+        </w:rPr>
+      </w:pPr>
+      <w:r>
+        <w:rPr>
+          <w:rFonts w:cs="B Titr" w:hint="cs"/>
+          <w:sz w:val="28"/>
+          <w:szCs w:val="28"/>
+          <w:rtl/>
+          <w:lang w:bidi="fa-IR"/>
+        </w:rPr>
+        <w:lastRenderedPageBreak/>
+        <w:t>توصیف گر در پایتون</w:t>
+      </w:r>
+    </w:p>
+    <w:p>
+      <w:pPr>
+        <w:tabs>
+          <w:tab w:val="left" w:pos="900"/>
+        </w:tabs>
+        <w:bidi/>
+        <w:ind w:left="360"/>
+        <w:jc w:val="both"/>
+        <w:rPr>
+          <w:rFonts w:cs="B Nazanin"/>
+          <w:sz w:val="28"/>
+          <w:szCs w:val="28"/>
+          <w:rtl/>
+          <w:lang w:bidi="fa-IR"/>
+        </w:rPr>
+      </w:pPr>
+      <w:r>
+        <w:rPr>
+          <w:rFonts w:cs="B Nazanin" w:hint="cs"/>
+          <w:sz w:val="28"/>
+          <w:szCs w:val="28"/>
+          <w:rtl/>
+          <w:lang w:bidi="fa-IR"/>
+        </w:rPr>
+        <w:t xml:space="preserve">در زبان پایتون به صورت صریح اشاره گر وجود ندارد و مانند زبان هایی مثل </w:t>
+      </w:r>
+      <w:r>
+        <w:rPr>
+          <w:rFonts w:cs="B Nazanin"/>
+          <w:sz w:val="28"/>
+          <w:szCs w:val="28"/>
+          <w:lang w:bidi="fa-IR"/>
+        </w:rPr>
+        <w:t>C</w:t>
+      </w:r>
+      <w:r>
+        <w:rPr>
+          <w:rFonts w:cs="B Nazanin" w:hint="cs"/>
+          <w:sz w:val="28"/>
+          <w:szCs w:val="28"/>
+          <w:rtl/>
+          <w:lang w:bidi="fa-IR"/>
+        </w:rPr>
+        <w:t xml:space="preserve"> و </w:t>
+      </w:r>
+      <w:r>
+        <w:rPr>
+          <w:rFonts w:cs="B Nazanin"/>
+          <w:sz w:val="28"/>
+          <w:szCs w:val="28"/>
+          <w:lang w:bidi="fa-IR"/>
+        </w:rPr>
+        <w:t>C++</w:t>
+      </w:r>
+      <w:r>
+        <w:rPr>
+          <w:rFonts w:cs="B Nazanin" w:hint="cs"/>
+          <w:sz w:val="28"/>
+          <w:szCs w:val="28"/>
+          <w:rtl/>
+          <w:lang w:bidi="fa-IR"/>
+        </w:rPr>
+        <w:t xml:space="preserve"> از علا</w:t>
+      </w:r>
+      <w:r>
+        <w:rPr>
+          <w:rFonts w:cs="B Nazanin" w:hint="cs"/>
+          <w:sz w:val="28"/>
+          <w:szCs w:val="28"/>
+          <w:rtl/>
+          <w:lang w:bidi="fa-IR"/>
+        </w:rPr>
+        <w:t>ئم اشاره گر (</w:t>
+      </w:r>
+      <w:r>
+        <w:rPr>
+          <w:rFonts w:cs="B Nazanin"/>
+          <w:sz w:val="28"/>
+          <w:szCs w:val="28"/>
+          <w:lang w:bidi="fa-IR"/>
+        </w:rPr>
+        <w:t>&amp;</w:t>
+      </w:r>
+      <w:r>
+        <w:rPr>
+          <w:rFonts w:cs="B Nazanin" w:hint="cs"/>
+          <w:sz w:val="28"/>
+          <w:szCs w:val="28"/>
+          <w:rtl/>
+          <w:lang w:bidi="fa-IR"/>
+        </w:rPr>
+        <w:t xml:space="preserve"> و </w:t>
+      </w:r>
+      <w:r>
+        <w:rPr>
+          <w:rFonts w:cs="B Nazanin"/>
+          <w:sz w:val="28"/>
+          <w:szCs w:val="28"/>
+          <w:lang w:bidi="fa-IR"/>
+        </w:rPr>
+        <w:t>*</w:t>
+      </w:r>
+      <w:r>
+        <w:rPr>
+          <w:rFonts w:cs="B Nazanin" w:hint="cs"/>
+          <w:sz w:val="28"/>
+          <w:szCs w:val="28"/>
+          <w:rtl/>
+          <w:lang w:bidi="fa-IR"/>
+        </w:rPr>
+        <w:t>) استفاده نمیکند.</w:t>
+      </w:r>
+    </w:p>
+    <w:p>
+      <w:pPr>
+        <w:tabs>
+          <w:tab w:val="left" w:pos="900"/>
+        </w:tabs>
+        <w:bidi/>
+        <w:ind w:left="360"/>
+        <w:jc w:val="both"/>
+        <w:rPr>
+          <w:rFonts w:cs="B Nazanin"/>
+          <w:sz w:val="28"/>
+          <w:szCs w:val="28"/>
+          <w:rtl/>
+          <w:lang w:bidi="fa-IR"/>
+        </w:rPr>
+      </w:pPr>
+      <w:r>
+        <w:rPr>
+          <w:rFonts w:cs="B Nazanin" w:hint="cs"/>
+          <w:sz w:val="28"/>
+          <w:szCs w:val="28"/>
+          <w:rtl/>
+          <w:lang w:bidi="fa-IR"/>
+        </w:rPr>
+        <w:t>در زبان پایتون از مرجع دهی اشیاء (</w:t>
+      </w:r>
+      <w:r>
+        <w:rPr>
+          <w:rFonts w:cs="B Nazanin"/>
+          <w:sz w:val="28"/>
+          <w:szCs w:val="28"/>
+          <w:lang w:bidi="fa-IR"/>
+        </w:rPr>
+        <w:t>object references</w:t>
+      </w:r>
+      <w:r>
+        <w:rPr>
+          <w:rFonts w:cs="B Nazanin" w:hint="cs"/>
+          <w:sz w:val="28"/>
+          <w:szCs w:val="28"/>
+          <w:rtl/>
+          <w:lang w:bidi="fa-IR"/>
+        </w:rPr>
+        <w:t>) استفاده میشود که رفتاری مشابه با اشاره گر ها رو داره یعنی زمانی که یک متغیر رو به متغیر دیگه ای نسبت میدیم در واقع هر دو به همان شئ در حافظه اشاره میکنن.</w:t>
+      </w:r>
+    </w:p>
+    <w:p>
+      <w:pPr>
+        <w:tabs>
+          <w:tab w:val="left" w:pos="900"/>
+        </w:tabs>
+        <w:bidi/>
+        <w:ind w:left="360"/>
+        <w:jc w:val="both"/>
+        <w:rPr>
+          <w:rFonts w:cs="B Nazanin"/>
+          <w:sz w:val="28"/>
+          <w:szCs w:val="28"/>
+          <w:rtl/>
+          <w:lang w:bidi="fa-IR"/>
+        </w:rPr>
+      </w:pPr>
+      <w:r>
+        <w:rPr>
+          <w:rFonts w:cs="B Nazanin" w:hint="cs"/>
+          <w:sz w:val="28"/>
+          <w:szCs w:val="28"/>
+          <w:rtl/>
+          <w:lang w:bidi="fa-IR"/>
+        </w:rPr>
+        <w:t xml:space="preserve">با مثال زیر درک این موضوع راحت تر میشه: </w:t>
+      </w:r>
+    </w:p>
+    <w:p>
+      <w:pPr>
+        <w:tabs>
+          <w:tab w:val="left" w:pos="900"/>
+        </w:tabs>
+        <w:bidi/>
+        <w:ind w:left="360"/>
+        <w:jc w:val="both"/>
+        <w:rPr>
+          <w:rFonts w:cs="B Nazanin"/>
+          <w:sz w:val="28"/>
+          <w:szCs w:val="28"/>
+          <w:lang w:bidi="fa-IR"/>
+        </w:rPr>
+      </w:pPr>
+      <w:r>
+        <w:rPr>
+          <w:rFonts w:cs="B Nazanin"/>
+          <w:sz w:val="28"/>
+          <w:szCs w:val="28"/>
+          <w:rtl/>
+          <w:lang w:bidi="fa-IR"/>
+        </w:rPr>
+        <w:drawing>
+          <wp:inline distT="0" distB="0" distL="0" distR="0" wp14:anchorId="7F1FABB7" wp14:editId="6B55F106">
+            <wp:extent cx="5943600" cy="1109980"/>
+            <wp:effectExtent l="0" t="0" r="0" b="0"/>
+            <wp:docPr id="1063699887" name="Picture 1"/>
+            <wp:cNvGraphicFramePr>
+              <a:graphicFrameLocks xmlns:a="http://schemas.openxmlformats.org/drawingml/2006/main" noChangeAspect="1"/>
+            </wp:cNvGraphicFramePr>
+            <a:graphic xmlns:a="http://schemas.openxmlformats.org/drawingml/2006/main">
+              <a:graphicData uri="http://schemas.openxmlformats.org/drawingml/2006/picture">
+                <pic:pic xmlns:pic="http://schemas.openxmlformats.org/drawingml/2006/picture">
+                  <pic:nvPicPr>
+                    <pic:cNvPr id="1063699887" name=""/>
+                    <pic:cNvPicPr/>
+                  </pic:nvPicPr>
+                  <pic:blipFill>
+                    <a:blip r:embed="rId14"/>
+                    <a:stretch>
+                      <a:fillRect/>
+                    </a:stretch>
+                  </pic:blipFill>
+                  <pic:spPr>
+                    <a:xfrm>
+                      <a:off x="0" y="0"/>
+                      <a:ext cx="5943600" cy="1109980"/>
+                    </a:xfrm>
+                    <a:prstGeom prst="rect">
+                      <a:avLst/>
+                    </a:prstGeom>
+                  </pic:spPr>
+                </pic:pic>
+              </a:graphicData>
+            </a:graphic>
+          </wp:inline>
+        </w:drawing>
+      </w:r>
+    </w:p>
+    <w:p>
+      <w:pPr>
+        <w:tabs>
+          <w:tab w:val="left" w:pos="900"/>
+        </w:tabs>
+        <w:bidi/>
+        <w:ind w:left="360"/>
+        <w:jc w:val="both"/>
+        <w:rPr>
+          <w:rFonts w:cs="B Nazanin"/>
+          <w:sz w:val="28"/>
+          <w:szCs w:val="28"/>
+          <w:rtl/>
+          <w:lang w:bidi="fa-IR"/>
+        </w:rPr>
+      </w:pPr>
+      <w:r>
+        <w:rPr>
+          <w:rFonts w:cs="B Nazanin" w:hint="cs"/>
+          <w:sz w:val="28"/>
+          <w:szCs w:val="28"/>
+          <w:rtl/>
+          <w:lang w:bidi="fa-IR"/>
+        </w:rPr>
+        <w:t xml:space="preserve">در کد بالا یک لیست به نام </w:t>
+      </w:r>
+      <w:r>
+        <w:rPr>
+          <w:rFonts w:cs="B Nazanin"/>
+          <w:sz w:val="28"/>
+          <w:szCs w:val="28"/>
+          <w:lang w:bidi="fa-IR"/>
+        </w:rPr>
+        <w:t>A</w:t>
+      </w:r>
+      <w:r>
+        <w:rPr>
+          <w:rFonts w:cs="B Nazanin" w:hint="cs"/>
+          <w:sz w:val="28"/>
+          <w:szCs w:val="28"/>
+          <w:rtl/>
+          <w:lang w:bidi="fa-IR"/>
+        </w:rPr>
+        <w:t xml:space="preserve"> تعریف کردیم و سپس متغیر </w:t>
+      </w:r>
+      <w:r>
+        <w:rPr>
+          <w:rFonts w:cs="B Nazanin"/>
+          <w:sz w:val="28"/>
+          <w:szCs w:val="28"/>
+          <w:lang w:bidi="fa-IR"/>
+        </w:rPr>
+        <w:t>B</w:t>
+      </w:r>
+      <w:r>
+        <w:rPr>
+          <w:rFonts w:cs="B Nazanin" w:hint="cs"/>
+          <w:sz w:val="28"/>
+          <w:szCs w:val="28"/>
+          <w:rtl/>
+          <w:lang w:bidi="fa-IR"/>
+        </w:rPr>
+        <w:t xml:space="preserve"> رو به </w:t>
+      </w:r>
+      <w:r>
+        <w:rPr>
+          <w:rFonts w:cs="B Nazanin"/>
+          <w:sz w:val="28"/>
+          <w:szCs w:val="28"/>
+          <w:lang w:bidi="fa-IR"/>
+        </w:rPr>
+        <w:t>A</w:t>
+      </w:r>
+      <w:r>
+        <w:rPr>
+          <w:rFonts w:cs="B Nazanin" w:hint="cs"/>
+          <w:sz w:val="28"/>
+          <w:szCs w:val="28"/>
+          <w:rtl/>
+          <w:lang w:bidi="fa-IR"/>
+        </w:rPr>
+        <w:t xml:space="preserve"> نسبت دادیم. در این حالت </w:t>
+      </w:r>
+      <w:r>
+        <w:rPr>
+          <w:rFonts w:cs="B Nazanin"/>
+          <w:sz w:val="28"/>
+          <w:szCs w:val="28"/>
+          <w:lang w:bidi="fa-IR"/>
+        </w:rPr>
+        <w:t>B</w:t>
+      </w:r>
+      <w:r>
+        <w:rPr>
+          <w:rFonts w:cs="B Nazanin" w:hint="cs"/>
+          <w:sz w:val="28"/>
+          <w:szCs w:val="28"/>
+          <w:rtl/>
+          <w:lang w:bidi="fa-IR"/>
+        </w:rPr>
+        <w:t xml:space="preserve"> دقیقا به همان جایی از حافظه اشاره میکند که </w:t>
+      </w:r>
+      <w:r>
+        <w:rPr>
+          <w:rFonts w:cs="B Nazanin"/>
+          <w:sz w:val="28"/>
+          <w:szCs w:val="28"/>
+          <w:lang w:bidi="fa-IR"/>
+        </w:rPr>
+        <w:t>A</w:t>
+      </w:r>
+      <w:r>
+        <w:rPr>
+          <w:rFonts w:cs="B Nazanin" w:hint="cs"/>
+          <w:sz w:val="28"/>
+          <w:szCs w:val="28"/>
+          <w:rtl/>
+          <w:lang w:bidi="fa-IR"/>
+        </w:rPr>
+        <w:t xml:space="preserve"> اشاره میکند و در واقع کپی از روی </w:t>
+      </w:r>
+      <w:r>
+        <w:rPr>
+          <w:rFonts w:cs="B Nazanin"/>
+          <w:sz w:val="28"/>
+          <w:szCs w:val="28"/>
+          <w:lang w:bidi="fa-IR"/>
+        </w:rPr>
+        <w:t>A</w:t>
+      </w:r>
+      <w:r>
+        <w:rPr>
+          <w:rFonts w:cs="B Nazanin" w:hint="cs"/>
+          <w:sz w:val="28"/>
+          <w:szCs w:val="28"/>
+          <w:rtl/>
+          <w:lang w:bidi="fa-IR"/>
+        </w:rPr>
+        <w:t xml:space="preserve"> صورت نگرفته شده است. در خط سوم ما به لیست </w:t>
+      </w:r>
+      <w:r>
+        <w:rPr>
+          <w:rFonts w:cs="B Nazanin"/>
+          <w:sz w:val="28"/>
+          <w:szCs w:val="28"/>
+          <w:lang w:bidi="fa-IR"/>
+        </w:rPr>
+        <w:t>B</w:t>
+      </w:r>
+      <w:r>
+        <w:rPr>
+          <w:rFonts w:cs="B Nazanin" w:hint="cs"/>
+          <w:sz w:val="28"/>
+          <w:szCs w:val="28"/>
+          <w:rtl/>
+          <w:lang w:bidi="fa-IR"/>
+        </w:rPr>
+        <w:t xml:space="preserve"> یک عنصر اضافه میکنیم و مشاهده میکنیم که با نمایش لیست </w:t>
+      </w:r>
+      <w:r>
+        <w:rPr>
+          <w:rFonts w:cs="B Nazanin"/>
+          <w:sz w:val="28"/>
+          <w:szCs w:val="28"/>
+          <w:lang w:bidi="fa-IR"/>
+        </w:rPr>
+        <w:t>A</w:t>
+      </w:r>
+      <w:r>
+        <w:rPr>
+          <w:rFonts w:cs="B Nazanin" w:hint="cs"/>
+          <w:sz w:val="28"/>
+          <w:szCs w:val="28"/>
+          <w:rtl/>
+          <w:lang w:bidi="fa-IR"/>
+        </w:rPr>
+        <w:t xml:space="preserve"> مقدار جدید به این لیست هم اضافه شده است. این رفتار برای ما کاملاً شفاف میکند که هر دو لیست </w:t>
+      </w:r>
+      <w:r>
+        <w:rPr>
+          <w:rFonts w:cs="B Nazanin"/>
+          <w:sz w:val="28"/>
+          <w:szCs w:val="28"/>
+          <w:lang w:bidi="fa-IR"/>
+        </w:rPr>
+        <w:t>A</w:t>
+      </w:r>
+      <w:r>
+        <w:rPr>
+          <w:rFonts w:cs="B Nazanin" w:hint="cs"/>
+          <w:sz w:val="28"/>
+          <w:szCs w:val="28"/>
+          <w:rtl/>
+          <w:lang w:bidi="fa-IR"/>
+        </w:rPr>
+        <w:t xml:space="preserve">‌ و </w:t>
+      </w:r>
+      <w:r>
+        <w:rPr>
+          <w:rFonts w:cs="B Nazanin"/>
+          <w:sz w:val="28"/>
+          <w:szCs w:val="28"/>
+          <w:lang w:bidi="fa-IR"/>
+        </w:rPr>
+        <w:t>B</w:t>
+      </w:r>
+      <w:r>
+        <w:rPr>
+          <w:rFonts w:cs="B Nazanin" w:hint="cs"/>
+          <w:sz w:val="28"/>
+          <w:szCs w:val="28"/>
+          <w:rtl/>
+          <w:lang w:bidi="fa-IR"/>
+        </w:rPr>
+        <w:t xml:space="preserve"> به یک جا از حافظه اشاره میکنند.</w:t>
+      </w:r>
+    </w:p>
+    <w:p>
+      <w:pPr>
+        <w:rPr>
+          <w:rFonts w:cs="B Nazanin"/>
+          <w:sz w:val="28"/>
+          <w:szCs w:val="28"/>
+          <w:rtl/>
+          <w:lang w:bidi="fa-IR"/>
+        </w:rPr>
+      </w:pPr>
+      <w:r>
+        <w:rPr>
+          <w:rFonts w:cs="B Nazanin"/>
+          <w:sz w:val="28"/>
+          <w:szCs w:val="28"/>
+          <w:rtl/>
+          <w:lang w:bidi="fa-IR"/>
+        </w:rPr>
+        <w:br w:type="page"/>
+      </w:r>
+    </w:p>
+    <w:p>
+      <w:pPr>
+        <w:tabs>
+          <w:tab w:val="left" w:pos="900"/>
+        </w:tabs>
+        <w:bidi/>
+        <w:ind w:left="360"/>
+        <w:jc w:val="both"/>
+        <w:rPr>
+          <w:rFonts w:cs="B Titr"/>
+          <w:sz w:val="28"/>
+          <w:szCs w:val="28"/>
+          <w:rtl/>
+          <w:lang w:bidi="fa-IR"/>
+        </w:rPr>
+      </w:pPr>
+      <w:r>
+        <w:rPr>
+          <w:rFonts w:cs="B Titr" w:hint="cs"/>
+          <w:sz w:val="28"/>
+          <w:szCs w:val="28"/>
+          <w:rtl/>
+          <w:lang w:bidi="fa-IR"/>
+        </w:rPr>
+        <w:lastRenderedPageBreak/>
+        <w:t>نوع شمارش در پایتون</w:t>
+      </w:r>
+    </w:p>
+    <w:p>
+      <w:pPr>
+        <w:tabs>
+          <w:tab w:val="left" w:pos="900"/>
+        </w:tabs>
+        <w:bidi/>
+        <w:ind w:left="360"/>
+        <w:jc w:val="both"/>
+        <w:rPr>
+          <w:rFonts w:cs="B Nazanin"/>
+          <w:sz w:val="28"/>
+          <w:szCs w:val="28"/>
+          <w:rtl/>
+          <w:lang w:bidi="fa-IR"/>
+        </w:rPr>
+      </w:pPr>
+      <w:r>
+        <w:rPr>
+          <w:rFonts w:cs="B Nazanin" w:hint="cs"/>
+          <w:sz w:val="28"/>
+          <w:szCs w:val="28"/>
+          <w:rtl/>
+          <w:lang w:bidi="fa-IR"/>
+        </w:rPr>
+        <w:t>نوع شمارش یا (</w:t>
+      </w:r>
+      <w:r>
+        <w:rPr>
+          <w:rFonts w:cs="B Nazanin"/>
+          <w:sz w:val="28"/>
+          <w:szCs w:val="28"/>
+          <w:lang w:bidi="fa-IR"/>
+        </w:rPr>
+        <w:t>Enumeration</w:t>
+      </w:r>
+      <w:r>
+        <w:rPr>
+          <w:rFonts w:cs="B Nazanin" w:hint="cs"/>
+          <w:sz w:val="28"/>
+          <w:szCs w:val="28"/>
+          <w:rtl/>
+          <w:lang w:bidi="fa-IR"/>
+        </w:rPr>
+        <w:t xml:space="preserve">) در زبان ها به شیوه های گوناگون تعریف شده است مثلا در زبان </w:t>
+      </w:r>
+      <w:r>
+        <w:rPr>
+          <w:rFonts w:cs="B Nazanin"/>
+          <w:sz w:val="28"/>
+          <w:szCs w:val="28"/>
+          <w:lang w:bidi="fa-IR"/>
+        </w:rPr>
+        <w:t>C</w:t>
+      </w:r>
+      <w:r>
+        <w:rPr>
+          <w:rFonts w:cs="B Nazanin" w:hint="cs"/>
+          <w:sz w:val="28"/>
+          <w:szCs w:val="28"/>
+          <w:rtl/>
+          <w:lang w:bidi="fa-IR"/>
+        </w:rPr>
+        <w:t xml:space="preserve"> با کلیدواژه (</w:t>
+      </w:r>
+      <w:proofErr w:type="spellStart"/>
+      <w:r>
+        <w:rPr>
+          <w:rFonts w:cs="B Nazanin"/>
+          <w:sz w:val="28"/>
+          <w:szCs w:val="28"/>
+          <w:lang w:bidi="fa-IR"/>
+        </w:rPr>
+        <w:t>enum</w:t>
+      </w:r>
+      <w:proofErr w:type="spellEnd"/>
+      <w:r>
+        <w:rPr>
+          <w:rFonts w:cs="B Nazanin" w:hint="cs"/>
+          <w:sz w:val="28"/>
+          <w:szCs w:val="28"/>
+          <w:rtl/>
+          <w:lang w:bidi="fa-IR"/>
+        </w:rPr>
+        <w:t xml:space="preserve">) میتوانیم که نوع شمارشی از داده رو تولید بکنیم یا در زبان </w:t>
+      </w:r>
+      <w:r>
+        <w:rPr>
+          <w:rFonts w:cs="B Nazanin"/>
+          <w:sz w:val="28"/>
+          <w:szCs w:val="28"/>
+          <w:lang w:bidi="fa-IR"/>
+        </w:rPr>
+        <w:t>java</w:t>
+      </w:r>
+      <w:r>
+        <w:rPr>
+          <w:rFonts w:cs="B Nazanin" w:hint="cs"/>
+          <w:sz w:val="28"/>
+          <w:szCs w:val="28"/>
+          <w:rtl/>
+          <w:lang w:bidi="fa-IR"/>
+        </w:rPr>
+        <w:t xml:space="preserve"> این عمل به صورت کلاس تعریف شده است و با خواندن کلاس (</w:t>
+      </w:r>
+      <w:proofErr w:type="spellStart"/>
+      <w:r>
+        <w:rPr>
+          <w:rFonts w:cs="B Nazanin"/>
+          <w:sz w:val="28"/>
+          <w:szCs w:val="28"/>
+          <w:lang w:bidi="fa-IR"/>
+        </w:rPr>
+        <w:t>enum</w:t>
+      </w:r>
+      <w:proofErr w:type="spellEnd"/>
+      <w:r>
+        <w:rPr>
+          <w:rFonts w:cs="B Nazanin" w:hint="cs"/>
+          <w:sz w:val="28"/>
+          <w:szCs w:val="28"/>
+          <w:rtl/>
+          <w:lang w:bidi="fa-IR"/>
+        </w:rPr>
+        <w:t>) نوع شمارشی میتوان تولید کرد.</w:t>
+      </w:r>
+    </w:p>
+    <w:p>
+      <w:pPr>
+        <w:tabs>
+          <w:tab w:val="left" w:pos="900"/>
+        </w:tabs>
+        <w:bidi/>
+        <w:ind w:left="360"/>
+        <w:jc w:val="both"/>
+        <w:rPr>
+          <w:rFonts w:cs="B Nazanin"/>
+          <w:sz w:val="28"/>
+          <w:szCs w:val="28"/>
+          <w:rtl/>
+          <w:lang w:bidi="fa-IR"/>
+        </w:rPr>
+      </w:pPr>
+      <w:r>
+        <w:rPr>
+          <w:rFonts w:cs="B Nazanin" w:hint="cs"/>
+          <w:sz w:val="28"/>
+          <w:szCs w:val="28"/>
+          <w:rtl/>
+          <w:lang w:bidi="fa-IR"/>
+        </w:rPr>
+        <w:t xml:space="preserve">در زبان پایتون برای ساخت نوع شمارشی از کتابخانه </w:t>
+      </w:r>
+      <w:r>
+        <w:rPr>
+          <w:rFonts w:cs="B Nazanin" w:hint="cs"/>
+          <w:sz w:val="28"/>
+          <w:szCs w:val="28"/>
+          <w:rtl/>
+          <w:lang w:bidi="fa-IR"/>
+        </w:rPr>
+        <w:t>(</w:t>
+      </w:r>
+      <w:proofErr w:type="spellStart"/>
+      <w:r>
+        <w:rPr>
+          <w:rFonts w:cs="B Nazanin"/>
+          <w:sz w:val="28"/>
+          <w:szCs w:val="28"/>
+          <w:lang w:bidi="fa-IR"/>
+        </w:rPr>
+        <w:t>enum</w:t>
+      </w:r>
+      <w:proofErr w:type="spellEnd"/>
+      <w:r>
+        <w:rPr>
+          <w:rFonts w:cs="B Nazanin" w:hint="cs"/>
+          <w:sz w:val="28"/>
+          <w:szCs w:val="28"/>
+          <w:rtl/>
+          <w:lang w:bidi="fa-IR"/>
+        </w:rPr>
+        <w:t>) و متود (</w:t>
+      </w:r>
+      <w:r>
+        <w:rPr>
+          <w:rFonts w:cs="B Nazanin"/>
+          <w:sz w:val="28"/>
+          <w:szCs w:val="28"/>
+          <w:lang w:bidi="fa-IR"/>
+        </w:rPr>
+        <w:t>Enum</w:t>
+      </w:r>
+      <w:r>
+        <w:rPr>
+          <w:rFonts w:cs="B Nazanin" w:hint="cs"/>
+          <w:sz w:val="28"/>
+          <w:szCs w:val="28"/>
+          <w:rtl/>
+          <w:lang w:bidi="fa-IR"/>
+        </w:rPr>
+        <w:t>) استفاده میکنیم:</w:t>
+      </w:r>
+    </w:p>
+    <w:p>
+      <w:pPr>
+        <w:tabs>
+          <w:tab w:val="left" w:pos="900"/>
+        </w:tabs>
+        <w:bidi/>
+        <w:ind w:left="360"/>
+        <w:jc w:val="both"/>
+        <w:rPr>
+          <w:rFonts w:cs="B Nazanin"/>
+          <w:sz w:val="28"/>
+          <w:szCs w:val="28"/>
+          <w:rtl/>
+          <w:lang w:bidi="fa-IR"/>
+        </w:rPr>
+      </w:pPr>
+      <w:r>
+        <w:rPr>
+          <w:rFonts w:cs="B Nazanin"/>
+          <w:sz w:val="28"/>
+          <w:szCs w:val="28"/>
+          <w:rtl/>
+          <w:lang w:bidi="fa-IR"/>
+        </w:rPr>
+        <w:drawing>
+          <wp:inline distT="0" distB="0" distL="0" distR="0" wp14:anchorId="03FCAE03" wp14:editId="47257FDA">
+            <wp:extent cx="5943600" cy="1090930"/>
+            <wp:effectExtent l="0" t="0" r="0" b="0"/>
+            <wp:docPr id="1532133025" name="Picture 1"/>
+            <wp:cNvGraphicFramePr>
+              <a:graphicFrameLocks xmlns:a="http://schemas.openxmlformats.org/drawingml/2006/main" noChangeAspect="1"/>
+            </wp:cNvGraphicFramePr>
+            <a:graphic xmlns:a="http://schemas.openxmlformats.org/drawingml/2006/main">
+              <a:graphicData uri="http://schemas.openxmlformats.org/drawingml/2006/picture">
+                <pic:pic xmlns:pic="http://schemas.openxmlformats.org/drawingml/2006/picture">
+                  <pic:nvPicPr>
+                    <pic:cNvPr id="1532133025" name=""/>
+                    <pic:cNvPicPr/>
+                  </pic:nvPicPr>
+                  <pic:blipFill>
+                    <a:blip r:embed="rId15"/>
+                    <a:stretch>
+                      <a:fillRect/>
+                    </a:stretch>
+                  </pic:blipFill>
+                  <pic:spPr>
+                    <a:xfrm>
+                      <a:off x="0" y="0"/>
+                      <a:ext cx="5943600" cy="1090930"/>
+                    </a:xfrm>
+                    <a:prstGeom prst="rect">
+                      <a:avLst/>
+                    </a:prstGeom>
+                  </pic:spPr>
+                </pic:pic>
+              </a:graphicData>
+            </a:graphic>
+          </wp:inline>
+        </w:drawing>
+      </w:r>
+    </w:p>
+    <w:p>
+      <w:pPr>
+        <w:tabs>
+          <w:tab w:val="left" w:pos="900"/>
+        </w:tabs>
+        <w:bidi/>
+        <w:ind w:left="360"/>
+        <w:jc w:val="both"/>
+        <w:rPr>
+          <w:rFonts w:cs="B Nazanin"/>
+          <w:sz w:val="28"/>
+          <w:szCs w:val="28"/>
+          <w:rtl/>
+          <w:lang w:bidi="fa-IR"/>
+        </w:rPr>
+      </w:pPr>
+      <w:r>
+        <w:rPr>
+          <w:rFonts w:cs="B Nazanin" w:hint="cs"/>
+          <w:sz w:val="28"/>
+          <w:szCs w:val="28"/>
+          <w:rtl/>
+          <w:lang w:bidi="fa-IR"/>
+        </w:rPr>
+        <w:t>در قطعه کد بالا در مرحله اول متود (</w:t>
+      </w:r>
+      <w:r>
+        <w:rPr>
+          <w:rFonts w:cs="B Nazanin"/>
+          <w:sz w:val="28"/>
+          <w:szCs w:val="28"/>
+          <w:lang w:bidi="fa-IR"/>
+        </w:rPr>
+        <w:t>Enum</w:t>
+      </w:r>
+      <w:r>
+        <w:rPr>
+          <w:rFonts w:cs="B Nazanin" w:hint="cs"/>
+          <w:sz w:val="28"/>
+          <w:szCs w:val="28"/>
+          <w:rtl/>
+          <w:lang w:bidi="fa-IR"/>
+        </w:rPr>
+        <w:t>) به برنامه اضافه شد و سپس یک کلاس فرزند ساخته شده است که والد این کلاس، کلاس (</w:t>
+      </w:r>
+      <w:r>
+        <w:rPr>
+          <w:rFonts w:cs="B Nazanin"/>
+          <w:sz w:val="28"/>
+          <w:szCs w:val="28"/>
+          <w:lang w:bidi="fa-IR"/>
+        </w:rPr>
+        <w:t>Enum</w:t>
+      </w:r>
+      <w:r>
+        <w:rPr>
+          <w:rFonts w:cs="B Nazanin" w:hint="cs"/>
+          <w:sz w:val="28"/>
+          <w:szCs w:val="28"/>
+          <w:rtl/>
+          <w:lang w:bidi="fa-IR"/>
+        </w:rPr>
+        <w:t>) قرار داده شده است و به این شکل میتوان در زبان پایتون نوع شمارشی خود را ایجاد کنید.</w:t>
+      </w:r>
+    </w:p>
+    <w:p>
+      <w:pPr>
+        <w:tabs>
+          <w:tab w:val="left" w:pos="900"/>
+        </w:tabs>
+        <w:bidi/>
+        <w:ind w:left="360"/>
+        <w:jc w:val="both"/>
+        <w:rPr>
+          <w:rFonts w:cs="B Nazanin" w:hint="cs"/>
+          <w:sz w:val="28"/>
+          <w:szCs w:val="28"/>
+          <w:rtl/>
+          <w:lang w:bidi="fa-IR"/>
+        </w:rPr>
+      </w:pPr>
     </w:p>
     <w:p>
       <w:pPr>
         <w:tabs>
           <w:tab w:val="left" w:pos="7193"/>
         </w:tabs>
+        <w:jc w:val="right"/>
         <w:rPr>
           <w:rFonts w:cs="B Nazanin"/>
           <w:sz w:val="28"/>
@@ -1248,6 +3976,56 @@
     </w:sectPr>
   </w:body>
 </w:document>
+</file>
+
+<file path=word/endnotes.xml><?xml version="1.0" encoding="utf-8"?>
+<w:endnotes xmlns:wpc="http://schemas.microsoft.com/office/word/2010/wordprocessingCanvas" xmlns:cx="http://schemas.microsoft.com/office/drawing/2014/chartex" xmlns:cx1="http://schemas.microsoft.com/office/drawing/2015/9/8/chartex" xmlns:cx2="http://schemas.microsoft.com/office/drawing/2015/10/21/chartex" xmlns:cx3="http://schemas.microsoft.com/office/drawing/2016/5/9/chartex" xmlns:cx4="http://schemas.microsoft.com/office/drawing/2016/5/10/chartex" xmlns:cx5="http://schemas.microsoft.com/office/drawing/2016/5/11/chartex" xmlns:cx6="http://schemas.microsoft.com/office/drawing/2016/5/12/chartex" xmlns:cx7="http://schemas.microsoft.com/office/drawing/2016/5/13/chartex" xmlns:cx8="http://schemas.microsoft.com/office/drawing/2016/5/14/chartex" xmlns:mc="http://schemas.openxmlformats.org/markup-compatibility/2006" xmlns:aink="http://schemas.microsoft.com/office/drawing/2016/ink" xmlns:am3d="http://schemas.microsoft.com/office/drawing/2017/model3d" xmlns:o="urn:schemas-microsoft-com:office:office" xmlns:oel="http://schemas.microsoft.com/office/2019/extlst" xmlns:r="http://schemas.openxmlformats.org/officeDocument/2006/relationships" xmlns:m="http://schemas.openxmlformats.org/officeDocument/2006/math" xmlns:v="urn:schemas-microsoft-com:vml" xmlns:wp14="http://schemas.microsoft.com/office/word/2010/wordprocessingDrawing" xmlns:wp="http://schemas.openxmlformats.org/drawingml/2006/wordprocessingDrawing" xmlns:w10="urn:schemas-microsoft-com:office:word" xmlns:w="http://schemas.openxmlformats.org/wordprocessingml/2006/main" xmlns:w14="http://schemas.microsoft.com/office/word/2010/wordml" xmlns:w15="http://schemas.microsoft.com/office/word/2012/wordml" xmlns:w16cex="http://schemas.microsoft.com/office/word/2018/wordml/cex" xmlns:w16cid="http://schemas.microsoft.com/office/word/2016/wordml/cid" xmlns:w16="http://schemas.microsoft.com/office/word/2018/wordml" xmlns:w16sdtdh="http://schemas.microsoft.com/office/word/2020/wordml/sdtdatahash" xmlns:w16se="http://schemas.microsoft.com/office/word/2015/wordml/symex" xmlns:wpg="http://schemas.microsoft.com/office/word/2010/wordprocessingGroup" xmlns:wpi="http://schemas.microsoft.com/office/word/2010/wordprocessingInk" xmlns:wne="http://schemas.microsoft.com/office/word/2006/wordml" xmlns:wps="http://schemas.microsoft.com/office/word/2010/wordprocessingShape" mc:Ignorable="w14 w15 w16se w16cid w16 w16cex w16sdtdh wp14">
+  <w:endnote w:type="separator" w:id="-1">
+    <w:p>
+      <w:pPr>
+        <w:spacing w:after="0" w:line="240" w:lineRule="auto"/>
+      </w:pPr>
+      <w:r>
+        <w:separator/>
+      </w:r>
+    </w:p>
+  </w:endnote>
+  <w:endnote w:type="continuationSeparator" w:id="0">
+    <w:p>
+      <w:pPr>
+        <w:spacing w:after="0" w:line="240" w:lineRule="auto"/>
+      </w:pPr>
+      <w:r>
+        <w:continuationSeparator/>
+      </w:r>
+    </w:p>
+  </w:endnote>
+</w:endnotes>
+</file>
+
+<file path=word/footnotes.xml><?xml version="1.0" encoding="utf-8"?>
+<w:footnotes xmlns:wpc="http://schemas.microsoft.com/office/word/2010/wordprocessingCanvas" xmlns:cx="http://schemas.microsoft.com/office/drawing/2014/chartex" xmlns:cx1="http://schemas.microsoft.com/office/drawing/2015/9/8/chartex" xmlns:cx2="http://schemas.microsoft.com/office/drawing/2015/10/21/chartex" xmlns:cx3="http://schemas.microsoft.com/office/drawing/2016/5/9/chartex" xmlns:cx4="http://schemas.microsoft.com/office/drawing/2016/5/10/chartex" xmlns:cx5="http://schemas.microsoft.com/office/drawing/2016/5/11/chartex" xmlns:cx6="http://schemas.microsoft.com/office/drawing/2016/5/12/chartex" xmlns:cx7="http://schemas.microsoft.com/office/drawing/2016/5/13/chartex" xmlns:cx8="http://schemas.microsoft.com/office/drawing/2016/5/14/chartex" xmlns:mc="http://schemas.openxmlformats.org/markup-compatibility/2006" xmlns:aink="http://schemas.microsoft.com/office/drawing/2016/ink" xmlns:am3d="http://schemas.microsoft.com/office/drawing/2017/model3d" xmlns:o="urn:schemas-microsoft-com:office:office" xmlns:oel="http://schemas.microsoft.com/office/2019/extlst" xmlns:r="http://schemas.openxmlformats.org/officeDocument/2006/relationships" xmlns:m="http://schemas.openxmlformats.org/officeDocument/2006/math" xmlns:v="urn:schemas-microsoft-com:vml" xmlns:wp14="http://schemas.microsoft.com/office/word/2010/wordprocessingDrawing" xmlns:wp="http://schemas.openxmlformats.org/drawingml/2006/wordprocessingDrawing" xmlns:w10="urn:schemas-microsoft-com:office:word" xmlns:w="http://schemas.openxmlformats.org/wordprocessingml/2006/main" xmlns:w14="http://schemas.microsoft.com/office/word/2010/wordml" xmlns:w15="http://schemas.microsoft.com/office/word/2012/wordml" xmlns:w16cex="http://schemas.microsoft.com/office/word/2018/wordml/cex" xmlns:w16cid="http://schemas.microsoft.com/office/word/2016/wordml/cid" xmlns:w16="http://schemas.microsoft.com/office/word/2018/wordml" xmlns:w16sdtdh="http://schemas.microsoft.com/office/word/2020/wordml/sdtdatahash" xmlns:w16se="http://schemas.microsoft.com/office/word/2015/wordml/symex" xmlns:wpg="http://schemas.microsoft.com/office/word/2010/wordprocessingGroup" xmlns:wpi="http://schemas.microsoft.com/office/word/2010/wordprocessingInk" xmlns:wne="http://schemas.microsoft.com/office/word/2006/wordml" xmlns:wps="http://schemas.microsoft.com/office/word/2010/wordprocessingShape" mc:Ignorable="w14 w15 w16se w16cid w16 w16cex w16sdtdh wp14">
+  <w:footnote w:type="separator" w:id="-1">
+    <w:p>
+      <w:pPr>
+        <w:spacing w:after="0" w:line="240" w:lineRule="auto"/>
+      </w:pPr>
+      <w:r>
+        <w:separator/>
+      </w:r>
+    </w:p>
+  </w:footnote>
+  <w:footnote w:type="continuationSeparator" w:id="0">
+    <w:p>
+      <w:pPr>
+        <w:spacing w:after="0" w:line="240" w:lineRule="auto"/>
+      </w:pPr>
+      <w:r>
+        <w:continuationSeparator/>
+      </w:r>
+    </w:p>
+  </w:footnote>
+</w:footnotes>
 </file>
 
 <file path=word/numbering.xml><?xml version="1.0" encoding="utf-8"?>
@@ -1551,6 +4329,184 @@
     </w:lvl>
   </w:abstractNum>
   <w:abstractNum w:abstractNumId="2" w15:restartNumberingAfterBreak="0">
+    <w:nsid w:val="355B27CE"/>
+    <w:multiLevelType w:val="hybridMultilevel"/>
+    <w:tmpl w:val="FCFE22FC"/>
+    <w:lvl w:ilvl="0" w:tplc="4072E800">
+      <w:start w:val="1"/>
+      <w:numFmt w:val="decimalFullWidth"/>
+      <w:lvlText w:val="%1-"/>
+      <w:lvlJc w:val="left"/>
+      <w:pPr>
+        <w:ind w:left="720" w:hanging="360"/>
+      </w:pPr>
+      <w:rPr>
+        <w:rFonts w:hint="default"/>
+      </w:rPr>
+    </w:lvl>
+    <w:lvl w:ilvl="1" w:tplc="04090019" w:tentative="1">
+      <w:start w:val="1"/>
+      <w:numFmt w:val="lowerLetter"/>
+      <w:lvlText w:val="%2."/>
+      <w:lvlJc w:val="left"/>
+      <w:pPr>
+        <w:ind w:left="1440" w:hanging="360"/>
+      </w:pPr>
+    </w:lvl>
+    <w:lvl w:ilvl="2" w:tplc="0409001B" w:tentative="1">
+      <w:start w:val="1"/>
+      <w:numFmt w:val="lowerRoman"/>
+      <w:lvlText w:val="%3."/>
+      <w:lvlJc w:val="right"/>
+      <w:pPr>
+        <w:ind w:left="2160" w:hanging="180"/>
+      </w:pPr>
+    </w:lvl>
+    <w:lvl w:ilvl="3" w:tplc="0409000F" w:tentative="1">
+      <w:start w:val="1"/>
+      <w:numFmt w:val="decimal"/>
+      <w:lvlText w:val="%4."/>
+      <w:lvlJc w:val="left"/>
+      <w:pPr>
+        <w:ind w:left="2880" w:hanging="360"/>
+      </w:pPr>
+    </w:lvl>
+    <w:lvl w:ilvl="4" w:tplc="04090019" w:tentative="1">
+      <w:start w:val="1"/>
+      <w:numFmt w:val="lowerLetter"/>
+      <w:lvlText w:val="%5."/>
+      <w:lvlJc w:val="left"/>
+      <w:pPr>
+        <w:ind w:left="3600" w:hanging="360"/>
+      </w:pPr>
+    </w:lvl>
+    <w:lvl w:ilvl="5" w:tplc="0409001B" w:tentative="1">
+      <w:start w:val="1"/>
+      <w:numFmt w:val="lowerRoman"/>
+      <w:lvlText w:val="%6."/>
+      <w:lvlJc w:val="right"/>
+      <w:pPr>
+        <w:ind w:left="4320" w:hanging="180"/>
+      </w:pPr>
+    </w:lvl>
+    <w:lvl w:ilvl="6" w:tplc="0409000F" w:tentative="1">
+      <w:start w:val="1"/>
+      <w:numFmt w:val="decimal"/>
+      <w:lvlText w:val="%7."/>
+      <w:lvlJc w:val="left"/>
+      <w:pPr>
+        <w:ind w:left="5040" w:hanging="360"/>
+      </w:pPr>
+    </w:lvl>
+    <w:lvl w:ilvl="7" w:tplc="04090019" w:tentative="1">
+      <w:start w:val="1"/>
+      <w:numFmt w:val="lowerLetter"/>
+      <w:lvlText w:val="%8."/>
+      <w:lvlJc w:val="left"/>
+      <w:pPr>
+        <w:ind w:left="5760" w:hanging="360"/>
+      </w:pPr>
+    </w:lvl>
+    <w:lvl w:ilvl="8" w:tplc="0409001B" w:tentative="1">
+      <w:start w:val="1"/>
+      <w:numFmt w:val="lowerRoman"/>
+      <w:lvlText w:val="%9."/>
+      <w:lvlJc w:val="right"/>
+      <w:pPr>
+        <w:ind w:left="6480" w:hanging="180"/>
+      </w:pPr>
+    </w:lvl>
+  </w:abstractNum>
+  <w:abstractNum w:abstractNumId="3" w15:restartNumberingAfterBreak="0">
+    <w:nsid w:val="4E445B81"/>
+    <w:multiLevelType w:val="hybridMultilevel"/>
+    <w:tmpl w:val="72E40D1C"/>
+    <w:lvl w:ilvl="0" w:tplc="5A8035BA">
+      <w:start w:val="1"/>
+      <w:numFmt w:val="decimalFullWidth"/>
+      <w:lvlText w:val="%1-"/>
+      <w:lvlJc w:val="left"/>
+      <w:pPr>
+        <w:ind w:left="720" w:hanging="360"/>
+      </w:pPr>
+      <w:rPr>
+        <w:rFonts w:hint="default"/>
+      </w:rPr>
+    </w:lvl>
+    <w:lvl w:ilvl="1" w:tplc="04090019" w:tentative="1">
+      <w:start w:val="1"/>
+      <w:numFmt w:val="lowerLetter"/>
+      <w:lvlText w:val="%2."/>
+      <w:lvlJc w:val="left"/>
+      <w:pPr>
+        <w:ind w:left="1440" w:hanging="360"/>
+      </w:pPr>
+    </w:lvl>
+    <w:lvl w:ilvl="2" w:tplc="0409001B" w:tentative="1">
+      <w:start w:val="1"/>
+      <w:numFmt w:val="lowerRoman"/>
+      <w:lvlText w:val="%3."/>
+      <w:lvlJc w:val="right"/>
+      <w:pPr>
+        <w:ind w:left="2160" w:hanging="180"/>
+      </w:pPr>
+    </w:lvl>
+    <w:lvl w:ilvl="3" w:tplc="0409000F" w:tentative="1">
+      <w:start w:val="1"/>
+      <w:numFmt w:val="decimal"/>
+      <w:lvlText w:val="%4."/>
+      <w:lvlJc w:val="left"/>
+      <w:pPr>
+        <w:ind w:left="2880" w:hanging="360"/>
+      </w:pPr>
+    </w:lvl>
+    <w:lvl w:ilvl="4" w:tplc="04090019" w:tentative="1">
+      <w:start w:val="1"/>
+      <w:numFmt w:val="lowerLetter"/>
+      <w:lvlText w:val="%5."/>
+      <w:lvlJc w:val="left"/>
+      <w:pPr>
+        <w:ind w:left="3600" w:hanging="360"/>
+      </w:pPr>
+    </w:lvl>
+    <w:lvl w:ilvl="5" w:tplc="0409001B" w:tentative="1">
+      <w:start w:val="1"/>
+      <w:numFmt w:val="lowerRoman"/>
+      <w:lvlText w:val="%6."/>
+      <w:lvlJc w:val="right"/>
+      <w:pPr>
+        <w:ind w:left="4320" w:hanging="180"/>
+      </w:pPr>
+    </w:lvl>
+    <w:lvl w:ilvl="6" w:tplc="0409000F" w:tentative="1">
+      <w:start w:val="1"/>
+      <w:numFmt w:val="decimal"/>
+      <w:lvlText w:val="%7."/>
+      <w:lvlJc w:val="left"/>
+      <w:pPr>
+        <w:ind w:left="5040" w:hanging="360"/>
+      </w:pPr>
+    </w:lvl>
+    <w:lvl w:ilvl="7" w:tplc="04090019" w:tentative="1">
+      <w:start w:val="1"/>
+      <w:numFmt w:val="lowerLetter"/>
+      <w:lvlText w:val="%8."/>
+      <w:lvlJc w:val="left"/>
+      <w:pPr>
+        <w:ind w:left="5760" w:hanging="360"/>
+      </w:pPr>
+    </w:lvl>
+    <w:lvl w:ilvl="8" w:tplc="0409001B" w:tentative="1">
+      <w:start w:val="1"/>
+      <w:numFmt w:val="lowerRoman"/>
+      <w:lvlText w:val="%9."/>
+      <w:lvlJc w:val="right"/>
+      <w:pPr>
+        <w:ind w:left="6480" w:hanging="180"/>
+      </w:pPr>
+    </w:lvl>
+  </w:abstractNum>
+  <w:abstractNum w:abstractNumId="4" w15:restartNumberingAfterBreak="0">
     <w:nsid w:val="4E4B53A1"/>
     <w:multiLevelType w:val="multilevel"/>
     <w:tmpl w:val="05923100"/>
@@ -1699,14 +4655,112 @@
       </w:rPr>
     </w:lvl>
   </w:abstractNum>
+  <w:abstractNum w:abstractNumId="5" w15:restartNumberingAfterBreak="0">
+    <w:nsid w:val="58242117"/>
+    <w:multiLevelType w:val="hybridMultilevel"/>
+    <w:tmpl w:val="E3D295DA"/>
+    <w:lvl w:ilvl="0" w:tplc="26A855BE">
+      <w:start w:val="1"/>
+      <w:numFmt w:val="decimalFullWidth"/>
+      <w:lvlText w:val="%1-"/>
+      <w:lvlJc w:val="left"/>
+      <w:pPr>
+        <w:ind w:left="720" w:hanging="360"/>
+      </w:pPr>
+      <w:rPr>
+        <w:rFonts w:hint="default"/>
+      </w:rPr>
+    </w:lvl>
+    <w:lvl w:ilvl="1" w:tplc="04090019" w:tentative="1">
+      <w:start w:val="1"/>
+      <w:numFmt w:val="lowerLetter"/>
+      <w:lvlText w:val="%2."/>
+      <w:lvlJc w:val="left"/>
+      <w:pPr>
+        <w:ind w:left="1440" w:hanging="360"/>
+      </w:pPr>
+    </w:lvl>
+    <w:lvl w:ilvl="2" w:tplc="0409001B" w:tentative="1">
+      <w:start w:val="1"/>
+      <w:numFmt w:val="lowerRoman"/>
+      <w:lvlText w:val="%3."/>
+      <w:lvlJc w:val="right"/>
+      <w:pPr>
+        <w:ind w:left="2160" w:hanging="180"/>
+      </w:pPr>
+    </w:lvl>
+    <w:lvl w:ilvl="3" w:tplc="0409000F" w:tentative="1">
+      <w:start w:val="1"/>
+      <w:numFmt w:val="decimal"/>
+      <w:lvlText w:val="%4."/>
+      <w:lvlJc w:val="left"/>
+      <w:pPr>
+        <w:ind w:left="2880" w:hanging="360"/>
+      </w:pPr>
+    </w:lvl>
+    <w:lvl w:ilvl="4" w:tplc="04090019" w:tentative="1">
+      <w:start w:val="1"/>
+      <w:numFmt w:val="lowerLetter"/>
+      <w:lvlText w:val="%5."/>
+      <w:lvlJc w:val="left"/>
+      <w:pPr>
+        <w:ind w:left="3600" w:hanging="360"/>
+      </w:pPr>
+    </w:lvl>
+    <w:lvl w:ilvl="5" w:tplc="0409001B" w:tentative="1">
+      <w:start w:val="1"/>
+      <w:numFmt w:val="lowerRoman"/>
+      <w:lvlText w:val="%6."/>
+      <w:lvlJc w:val="right"/>
+      <w:pPr>
+        <w:ind w:left="4320" w:hanging="180"/>
+      </w:pPr>
+    </w:lvl>
+    <w:lvl w:ilvl="6" w:tplc="0409000F" w:tentative="1">
+      <w:start w:val="1"/>
+      <w:numFmt w:val="decimal"/>
+      <w:lvlText w:val="%7."/>
+      <w:lvlJc w:val="left"/>
+      <w:pPr>
+        <w:ind w:left="5040" w:hanging="360"/>
+      </w:pPr>
+    </w:lvl>
+    <w:lvl w:ilvl="7" w:tplc="04090019" w:tentative="1">
+      <w:start w:val="1"/>
+      <w:numFmt w:val="lowerLetter"/>
+      <w:lvlText w:val="%8."/>
+      <w:lvlJc w:val="left"/>
+      <w:pPr>
+        <w:ind w:left="5760" w:hanging="360"/>
+      </w:pPr>
+    </w:lvl>
+    <w:lvl w:ilvl="8" w:tplc="0409001B" w:tentative="1">
+      <w:start w:val="1"/>
+      <w:numFmt w:val="lowerRoman"/>
+      <w:lvlText w:val="%9."/>
+      <w:lvlJc w:val="right"/>
+      <w:pPr>
+        <w:ind w:left="6480" w:hanging="180"/>
+      </w:pPr>
+    </w:lvl>
+  </w:abstractNum>
   <w:num w:numId="1" w16cid:durableId="754787207">
-    <w:abstractNumId w:val="2"/>
+    <w:abstractNumId w:val="4"/>
   </w:num>
   <w:num w:numId="2" w16cid:durableId="807086169">
     <w:abstractNumId w:val="1"/>
   </w:num>
   <w:num w:numId="3" w16cid:durableId="489759637">
     <w:abstractNumId w:val="0"/>
+  </w:num>
+  <w:num w:numId="4" w16cid:durableId="387072171">
+    <w:abstractNumId w:val="2"/>
+  </w:num>
+  <w:num w:numId="5" w16cid:durableId="325937416">
+    <w:abstractNumId w:val="5"/>
+  </w:num>
+  <w:num w:numId="6" w16cid:durableId="180778776">
+    <w:abstractNumId w:val="3"/>
   </w:num>
 </w:numbering>
 </file>
@@ -2140,6 +5194,7 @@
   <w:style w:type="character" w:default="1" w:styleId="DefaultParagraphFont">
     <w:name w:val="Default Paragraph Font"/>
     <w:uiPriority w:val="1"/>
+    <w:semiHidden/>
     <w:unhideWhenUsed/>
   </w:style>
   <w:style w:type="table" w:default="1" w:styleId="TableNormal">
@@ -2189,6 +5244,61 @@
       <w:sz w:val="24"/>
       <w:szCs w:val="24"/>
     </w:rPr>
+  </w:style>
+  <w:style w:type="paragraph" w:styleId="ListParagraph">
+    <w:name w:val="List Paragraph"/>
+    <w:basedOn w:val="Normal"/>
+    <w:uiPriority w:val="34"/>
+    <w:qFormat/>
+    <w:rsid w:val="00087FF9"/>
+    <w:pPr>
+      <w:ind w:left="720"/>
+      <w:contextualSpacing/>
+    </w:pPr>
+  </w:style>
+  <w:style w:type="paragraph" w:styleId="Header">
+    <w:name w:val="header"/>
+    <w:basedOn w:val="Normal"/>
+    <w:link w:val="HeaderChar"/>
+    <w:uiPriority w:val="99"/>
+    <w:unhideWhenUsed/>
+    <w:rsid w:val="00180087"/>
+    <w:pPr>
+      <w:tabs>
+        <w:tab w:val="center" w:pos="4680"/>
+        <w:tab w:val="right" w:pos="9360"/>
+      </w:tabs>
+      <w:spacing w:after="0" w:line="240" w:lineRule="auto"/>
+    </w:pPr>
+  </w:style>
+  <w:style w:type="character" w:customStyle="1" w:styleId="HeaderChar">
+    <w:name w:val="Header Char"/>
+    <w:basedOn w:val="DefaultParagraphFont"/>
+    <w:link w:val="Header"/>
+    <w:uiPriority w:val="99"/>
+    <w:rsid w:val="00180087"/>
+  </w:style>
+  <w:style w:type="paragraph" w:styleId="Footer">
+    <w:name w:val="footer"/>
+    <w:basedOn w:val="Normal"/>
+    <w:link w:val="FooterChar"/>
+    <w:uiPriority w:val="99"/>
+    <w:unhideWhenUsed/>
+    <w:rsid w:val="00180087"/>
+    <w:pPr>
+      <w:tabs>
+        <w:tab w:val="center" w:pos="4680"/>
+        <w:tab w:val="right" w:pos="9360"/>
+      </w:tabs>
+      <w:spacing w:after="0" w:line="240" w:lineRule="auto"/>
+    </w:pPr>
+  </w:style>
+  <w:style w:type="character" w:customStyle="1" w:styleId="FooterChar">
+    <w:name w:val="Footer Char"/>
+    <w:basedOn w:val="DefaultParagraphFont"/>
+    <w:link w:val="Footer"/>
+    <w:uiPriority w:val="99"/>
+    <w:rsid w:val="00180087"/>
   </w:style>
 </w:styles>
 </file>

</xml_diff>

<commit_message>
update proje tarahi zaban ta akhar kapsol sazi
</commit_message>
<xml_diff>
--- a/طراحی زبان/پروژه طراحی زبان.docx
+++ b/طراحی زبان/پروژه طراحی زبان.docx
@@ -692,27 +692,7 @@
           <w:szCs w:val="28"/>
           <w:lang w:bidi="fa-IR"/>
         </w:rPr>
-        <w:t>.</w:t>
-      </w:r>
-      <w:proofErr w:type="spellStart"/>
-      <w:r>
-        <w:rPr>
-          <w:rFonts w:cs="B Nazanin"/>
-          <w:sz w:val="28"/>
-          <w:szCs w:val="28"/>
-          <w:lang w:bidi="fa-IR"/>
-        </w:rPr>
-        <w:t>pyc</w:t>
-      </w:r>
-      <w:proofErr w:type="spellEnd"/>
-      <w:r>
-        <w:rPr>
-          <w:rFonts w:cs="B Nazanin"/>
-          <w:sz w:val="28"/>
-          <w:szCs w:val="28"/>
-          <w:lang w:bidi="fa-IR"/>
-        </w:rPr>
-        <w:t xml:space="preserve">) </w:t>
+        <w:t xml:space="preserve">.pyc) </w:t>
       </w:r>
       <w:r>
         <w:rPr>
@@ -1014,7 +994,7 @@
         <w:bidi/>
         <w:jc w:val="both"/>
         <w:rPr>
-          <w:rFonts w:cs="B Titr" w:hint="cs"/>
+          <w:rFonts w:cs="B Titr"/>
           <w:sz w:val="28"/>
           <w:szCs w:val="28"/>
           <w:rtl/>
@@ -1228,7 +1208,7 @@
       <w:pPr>
         <w:jc w:val="right"/>
         <w:rPr>
-          <w:rFonts w:cs="B Titr" w:hint="cs"/>
+          <w:rFonts w:cs="B Titr"/>
           <w:sz w:val="28"/>
           <w:szCs w:val="28"/>
           <w:rtl/>
@@ -1672,6 +1652,7 @@
       <w:r>
         <w:rPr>
           <w:rFonts w:cs="B Nazanin"/>
+          <w:noProof/>
           <w:sz w:val="28"/>
           <w:szCs w:val="28"/>
           <w:rtl/>
@@ -2091,6 +2072,7 @@
       <w:r>
         <w:rPr>
           <w:rFonts w:cs="B Nazanin"/>
+          <w:noProof/>
           <w:sz w:val="28"/>
           <w:szCs w:val="28"/>
           <w:rtl/>
@@ -2278,7 +2260,17 @@
           <w:rtl/>
           <w:lang w:bidi="fa-IR"/>
         </w:rPr>
-        <w:t>چالش های پشتیبانی زبان از هر دو نوع تبدیل</w:t>
+        <w:t>چالش های پشتیبانی زبان از هر دو تبدیل</w:t>
+      </w:r>
+      <w:r>
+        <w:rPr>
+          <w:rFonts w:cs="B Titr" w:hint="cs"/>
+          <w:sz w:val="28"/>
+          <w:szCs w:val="28"/>
+          <w:rtl/>
+          <w:lang w:bidi="fa-IR"/>
+        </w:rPr>
+        <w:t xml:space="preserve"> نوع</w:t>
       </w:r>
     </w:p>
     <w:p>
@@ -2432,6 +2424,7 @@
       <w:r>
         <w:rPr>
           <w:rFonts w:cs="B Nazanin"/>
+          <w:noProof/>
           <w:sz w:val="28"/>
           <w:szCs w:val="28"/>
           <w:rtl/>
@@ -2883,6 +2876,7 @@
       <w:r>
         <w:rPr>
           <w:rFonts w:cs="B Nazanin"/>
+          <w:noProof/>
           <w:sz w:val="28"/>
           <w:szCs w:val="28"/>
           <w:rtl/>
@@ -3281,6 +3275,7 @@
       <w:r>
         <w:rPr>
           <w:rFonts w:cs="B Nazanin"/>
+          <w:noProof/>
           <w:sz w:val="28"/>
           <w:szCs w:val="28"/>
           <w:rtl/>
@@ -3653,7 +3648,6 @@
         </w:rPr>
         <w:t xml:space="preserve"> با کلیدواژه (</w:t>
       </w:r>
-      <w:proofErr w:type="spellStart"/>
       <w:r>
         <w:rPr>
           <w:rFonts w:cs="B Nazanin"/>
@@ -3663,7 +3657,6 @@
         </w:rPr>
         <w:t>enum</w:t>
       </w:r>
-      <w:proofErr w:type="spellEnd"/>
       <w:r>
         <w:rPr>
           <w:rFonts w:cs="B Nazanin" w:hint="cs"/>
@@ -3693,7 +3686,6 @@
         </w:rPr>
         <w:t xml:space="preserve"> این عمل به صورت کلاس تعریف شده است و با خواندن کلاس (</w:t>
       </w:r>
-      <w:proofErr w:type="spellStart"/>
       <w:r>
         <w:rPr>
           <w:rFonts w:cs="B Nazanin"/>
@@ -3703,7 +3695,6 @@
         </w:rPr>
         <w:t>enum</w:t>
       </w:r>
-      <w:proofErr w:type="spellEnd"/>
       <w:r>
         <w:rPr>
           <w:rFonts w:cs="B Nazanin" w:hint="cs"/>
@@ -3751,7 +3742,6 @@
         </w:rPr>
         <w:t>(</w:t>
       </w:r>
-      <w:proofErr w:type="spellStart"/>
       <w:r>
         <w:rPr>
           <w:rFonts w:cs="B Nazanin"/>
@@ -3761,7 +3751,6 @@
         </w:rPr>
         <w:t>enum</w:t>
       </w:r>
-      <w:proofErr w:type="spellEnd"/>
       <w:r>
         <w:rPr>
           <w:rFonts w:cs="B Nazanin" w:hint="cs"/>
@@ -3811,6 +3800,7 @@
       <w:r>
         <w:rPr>
           <w:rFonts w:cs="B Nazanin"/>
+          <w:noProof/>
           <w:sz w:val="28"/>
           <w:szCs w:val="28"/>
           <w:rtl/>
@@ -3865,7 +3855,6 @@
           <w:rFonts w:cs="B Nazanin"/>
           <w:sz w:val="28"/>
           <w:szCs w:val="28"/>
-          <w:rtl/>
           <w:lang w:bidi="fa-IR"/>
         </w:rPr>
       </w:pPr>
@@ -3927,13 +3916,764 @@
         <w:ind w:left="360"/>
         <w:jc w:val="both"/>
         <w:rPr>
-          <w:rFonts w:cs="B Nazanin" w:hint="cs"/>
-          <w:sz w:val="28"/>
-          <w:szCs w:val="28"/>
-          <w:rtl/>
-          <w:lang w:bidi="fa-IR"/>
-        </w:rPr>
-      </w:pPr>
+          <w:rFonts w:cs="B Nazanin"/>
+          <w:sz w:val="28"/>
+          <w:szCs w:val="28"/>
+          <w:rtl/>
+          <w:lang w:bidi="fa-IR"/>
+        </w:rPr>
+      </w:pPr>
+      <w:r>
+        <w:rPr>
+          <w:rFonts w:cs="B Nazanin" w:hint="cs"/>
+          <w:sz w:val="28"/>
+          <w:szCs w:val="28"/>
+          <w:rtl/>
+          <w:lang w:bidi="fa-IR"/>
+        </w:rPr>
+        <w:t>علاوه بر کلاس (</w:t>
+      </w:r>
+      <w:r>
+        <w:rPr>
+          <w:rFonts w:cs="B Nazanin"/>
+          <w:sz w:val="28"/>
+          <w:szCs w:val="28"/>
+          <w:lang w:bidi="fa-IR"/>
+        </w:rPr>
+        <w:t>Enum</w:t>
+      </w:r>
+      <w:r>
+        <w:rPr>
+          <w:rFonts w:cs="B Nazanin" w:hint="cs"/>
+          <w:sz w:val="28"/>
+          <w:szCs w:val="28"/>
+          <w:rtl/>
+          <w:lang w:bidi="fa-IR"/>
+        </w:rPr>
+        <w:t>) میتوان از تابع (</w:t>
+      </w:r>
+      <w:r>
+        <w:rPr>
+          <w:rFonts w:cs="B Nazanin"/>
+          <w:sz w:val="28"/>
+          <w:szCs w:val="28"/>
+          <w:lang w:bidi="fa-IR"/>
+        </w:rPr>
+        <w:t>eunumerate</w:t>
+      </w:r>
+      <w:r>
+        <w:rPr>
+          <w:rFonts w:cs="B Nazanin" w:hint="cs"/>
+          <w:sz w:val="28"/>
+          <w:szCs w:val="28"/>
+          <w:rtl/>
+          <w:lang w:bidi="fa-IR"/>
+        </w:rPr>
+        <w:t>)</w:t>
+      </w:r>
+      <w:r>
+        <w:rPr>
+          <w:rFonts w:cs="B Nazanin" w:hint="cs"/>
+          <w:sz w:val="28"/>
+          <w:szCs w:val="28"/>
+          <w:rtl/>
+          <w:lang w:bidi="fa-IR"/>
+        </w:rPr>
+        <w:t xml:space="preserve"> که به صورت پیشفرض در زبان پایتون تعریف شده است استفاده کرد.</w:t>
+      </w:r>
+    </w:p>
+    <w:p>
+      <w:pPr>
+        <w:tabs>
+          <w:tab w:val="left" w:pos="900"/>
+        </w:tabs>
+        <w:bidi/>
+        <w:ind w:left="360"/>
+        <w:jc w:val="both"/>
+        <w:rPr>
+          <w:rFonts w:cs="B Nazanin" w:hint="cs"/>
+          <w:sz w:val="28"/>
+          <w:szCs w:val="28"/>
+          <w:rtl/>
+          <w:lang w:bidi="fa-IR"/>
+        </w:rPr>
+      </w:pPr>
+      <w:r>
+        <w:rPr>
+          <w:noProof/>
+        </w:rPr>
+        <w:drawing>
+          <wp:inline distT="0" distB="0" distL="0" distR="0" wp14:anchorId="16E23BF8" wp14:editId="5EB18413">
+            <wp:extent cx="5943600" cy="1045845"/>
+            <wp:effectExtent l="0" t="0" r="0" b="1905"/>
+            <wp:docPr id="313881978" name="Picture 1"/>
+            <wp:cNvGraphicFramePr>
+              <a:graphicFrameLocks xmlns:a="http://schemas.openxmlformats.org/drawingml/2006/main" noChangeAspect="1"/>
+            </wp:cNvGraphicFramePr>
+            <a:graphic xmlns:a="http://schemas.openxmlformats.org/drawingml/2006/main">
+              <a:graphicData uri="http://schemas.openxmlformats.org/drawingml/2006/picture">
+                <pic:pic xmlns:pic="http://schemas.openxmlformats.org/drawingml/2006/picture">
+                  <pic:nvPicPr>
+                    <pic:cNvPr id="313881978" name=""/>
+                    <pic:cNvPicPr/>
+                  </pic:nvPicPr>
+                  <pic:blipFill>
+                    <a:blip r:embed="rId16"/>
+                    <a:stretch>
+                      <a:fillRect/>
+                    </a:stretch>
+                  </pic:blipFill>
+                  <pic:spPr>
+                    <a:xfrm>
+                      <a:off x="0" y="0"/>
+                      <a:ext cx="5943600" cy="1045845"/>
+                    </a:xfrm>
+                    <a:prstGeom prst="rect">
+                      <a:avLst/>
+                    </a:prstGeom>
+                  </pic:spPr>
+                </pic:pic>
+              </a:graphicData>
+            </a:graphic>
+          </wp:inline>
+        </w:drawing>
+      </w:r>
+      <w:r>
+        <w:rPr>
+          <w:rFonts w:cs="B Nazanin" w:hint="cs"/>
+          <w:sz w:val="28"/>
+          <w:szCs w:val="28"/>
+          <w:rtl/>
+          <w:lang w:bidi="fa-IR"/>
+        </w:rPr>
+        <w:t xml:space="preserve"> </w:t>
+      </w:r>
+    </w:p>
+    <w:p>
+      <w:pPr>
+        <w:tabs>
+          <w:tab w:val="left" w:pos="2127"/>
+        </w:tabs>
+        <w:bidi/>
+        <w:ind w:left="360"/>
+        <w:jc w:val="both"/>
+        <w:rPr>
+          <w:rFonts w:cs="B Nazanin"/>
+          <w:sz w:val="28"/>
+          <w:szCs w:val="28"/>
+          <w:rtl/>
+          <w:lang w:bidi="fa-IR"/>
+        </w:rPr>
+      </w:pPr>
+      <w:r>
+        <w:rPr>
+          <w:rFonts w:cs="B Nazanin"/>
+          <w:sz w:val="28"/>
+          <w:szCs w:val="28"/>
+          <w:rtl/>
+          <w:lang w:bidi="fa-IR"/>
+        </w:rPr>
+        <w:tab/>
+      </w:r>
+    </w:p>
+    <w:p>
+      <w:pPr>
+        <w:rPr>
+          <w:rFonts w:cs="B Nazanin"/>
+          <w:sz w:val="28"/>
+          <w:szCs w:val="28"/>
+          <w:rtl/>
+          <w:lang w:bidi="fa-IR"/>
+        </w:rPr>
+      </w:pPr>
+      <w:r>
+        <w:rPr>
+          <w:rFonts w:cs="B Nazanin"/>
+          <w:sz w:val="28"/>
+          <w:szCs w:val="28"/>
+          <w:rtl/>
+          <w:lang w:bidi="fa-IR"/>
+        </w:rPr>
+        <w:br w:type="page"/>
+      </w:r>
+    </w:p>
+    <w:p>
+      <w:pPr>
+        <w:tabs>
+          <w:tab w:val="left" w:pos="2127"/>
+        </w:tabs>
+        <w:bidi/>
+        <w:ind w:left="360"/>
+        <w:jc w:val="both"/>
+        <w:rPr>
+          <w:rFonts w:cs="B Titr"/>
+          <w:sz w:val="28"/>
+          <w:szCs w:val="28"/>
+          <w:rtl/>
+          <w:lang w:bidi="fa-IR"/>
+        </w:rPr>
+      </w:pPr>
+      <w:r>
+        <w:rPr>
+          <w:rFonts w:cs="B Titr" w:hint="cs"/>
+          <w:sz w:val="28"/>
+          <w:szCs w:val="28"/>
+          <w:rtl/>
+          <w:lang w:bidi="fa-IR"/>
+        </w:rPr>
+        <w:lastRenderedPageBreak/>
+        <w:t>انواع رشته های ورودی در پایتون</w:t>
+      </w:r>
+    </w:p>
+    <w:p>
+      <w:pPr>
+        <w:tabs>
+          <w:tab w:val="left" w:pos="2127"/>
+        </w:tabs>
+        <w:bidi/>
+        <w:ind w:left="360"/>
+        <w:jc w:val="both"/>
+        <w:rPr>
+          <w:rFonts w:cs="B Nazanin"/>
+          <w:sz w:val="28"/>
+          <w:szCs w:val="28"/>
+          <w:rtl/>
+          <w:lang w:bidi="fa-IR"/>
+        </w:rPr>
+      </w:pPr>
+      <w:r>
+        <w:rPr>
+          <w:rFonts w:cs="B Nazanin" w:hint="cs"/>
+          <w:sz w:val="28"/>
+          <w:szCs w:val="28"/>
+          <w:rtl/>
+          <w:lang w:bidi="fa-IR"/>
+        </w:rPr>
+        <w:t xml:space="preserve">زبان پایتون بعنوان یک زبان سطح بالا و داینامیک انواع داده های زیادی رو پشتیبانی میکند این نوع داده ها عبارت است از: </w:t>
+      </w:r>
+    </w:p>
+    <w:p>
+      <w:pPr>
+        <w:tabs>
+          <w:tab w:val="left" w:pos="2127"/>
+        </w:tabs>
+        <w:bidi/>
+        <w:ind w:left="360"/>
+        <w:jc w:val="both"/>
+        <w:rPr>
+          <w:rFonts w:cs="B Nazanin"/>
+          <w:sz w:val="28"/>
+          <w:szCs w:val="28"/>
+          <w:lang w:bidi="fa-IR"/>
+        </w:rPr>
+      </w:pPr>
+      <w:r>
+        <w:rPr>
+          <w:rFonts w:cs="B Nazanin"/>
+          <w:sz w:val="28"/>
+          <w:szCs w:val="28"/>
+          <w:rtl/>
+          <w:lang w:bidi="fa-IR"/>
+        </w:rPr>
+        <w:drawing>
+          <wp:inline distT="0" distB="0" distL="0" distR="0" wp14:anchorId="3E1FFBE9" wp14:editId="50D68B79">
+            <wp:extent cx="5943600" cy="2488565"/>
+            <wp:effectExtent l="0" t="0" r="0" b="6985"/>
+            <wp:docPr id="403095899" name="Picture 1"/>
+            <wp:cNvGraphicFramePr>
+              <a:graphicFrameLocks xmlns:a="http://schemas.openxmlformats.org/drawingml/2006/main" noChangeAspect="1"/>
+            </wp:cNvGraphicFramePr>
+            <a:graphic xmlns:a="http://schemas.openxmlformats.org/drawingml/2006/main">
+              <a:graphicData uri="http://schemas.openxmlformats.org/drawingml/2006/picture">
+                <pic:pic xmlns:pic="http://schemas.openxmlformats.org/drawingml/2006/picture">
+                  <pic:nvPicPr>
+                    <pic:cNvPr id="403095899" name=""/>
+                    <pic:cNvPicPr/>
+                  </pic:nvPicPr>
+                  <pic:blipFill>
+                    <a:blip r:embed="rId17"/>
+                    <a:stretch>
+                      <a:fillRect/>
+                    </a:stretch>
+                  </pic:blipFill>
+                  <pic:spPr>
+                    <a:xfrm>
+                      <a:off x="0" y="0"/>
+                      <a:ext cx="5943600" cy="2488565"/>
+                    </a:xfrm>
+                    <a:prstGeom prst="rect">
+                      <a:avLst/>
+                    </a:prstGeom>
+                  </pic:spPr>
+                </pic:pic>
+              </a:graphicData>
+            </a:graphic>
+          </wp:inline>
+        </w:drawing>
+      </w:r>
+    </w:p>
+    <w:p>
+      <w:pPr>
+        <w:tabs>
+          <w:tab w:val="left" w:pos="2127"/>
+        </w:tabs>
+        <w:bidi/>
+        <w:ind w:left="360"/>
+        <w:jc w:val="both"/>
+        <w:rPr>
+          <w:rFonts w:cs="B Nazanin"/>
+          <w:sz w:val="28"/>
+          <w:szCs w:val="28"/>
+          <w:rtl/>
+          <w:lang w:bidi="fa-IR"/>
+        </w:rPr>
+      </w:pPr>
+      <w:r>
+        <w:rPr>
+          <w:rFonts w:cs="B Nazanin" w:hint="cs"/>
+          <w:sz w:val="28"/>
+          <w:szCs w:val="28"/>
+          <w:rtl/>
+          <w:lang w:bidi="fa-IR"/>
+        </w:rPr>
+        <w:t>در بین نوع داده های گفته شده، لیست یکی از پر کاربرد ترین نوع داده های پایتون است که میتواند بعنوان هر عضو خود هر نوع داده ای رو داخل خودش نگهداری بکند.</w:t>
+      </w:r>
+    </w:p>
+    <w:p>
+      <w:pPr>
+        <w:tabs>
+          <w:tab w:val="left" w:pos="2127"/>
+        </w:tabs>
+        <w:bidi/>
+        <w:ind w:left="360"/>
+        <w:jc w:val="both"/>
+        <w:rPr>
+          <w:rFonts w:cs="B Nazanin"/>
+          <w:sz w:val="28"/>
+          <w:szCs w:val="28"/>
+          <w:rtl/>
+          <w:lang w:bidi="fa-IR"/>
+        </w:rPr>
+      </w:pPr>
+      <w:r>
+        <w:rPr>
+          <w:rFonts w:cs="B Nazanin" w:hint="cs"/>
+          <w:sz w:val="28"/>
+          <w:szCs w:val="28"/>
+          <w:rtl/>
+          <w:lang w:bidi="fa-IR"/>
+        </w:rPr>
+        <w:t xml:space="preserve">در واقع رفتار لیست مانند یک آرایه از نشانگر ها است </w:t>
+      </w:r>
+      <w:r>
+        <w:rPr>
+          <w:rFonts w:cs="B Nazanin" w:hint="cs"/>
+          <w:sz w:val="28"/>
+          <w:szCs w:val="28"/>
+          <w:rtl/>
+          <w:lang w:bidi="fa-IR"/>
+        </w:rPr>
+        <w:t>که هر نشانگر به یک فضای خالی در حافظه اشاره میکند و زمانی که داده جدیدی به لیست اضافه کنیم، یک نشانگر از لیست به داده جدید اشاره میکند.</w:t>
+      </w:r>
+    </w:p>
+    <w:p>
+      <w:pPr>
+        <w:tabs>
+          <w:tab w:val="left" w:pos="2127"/>
+        </w:tabs>
+        <w:bidi/>
+        <w:ind w:left="360"/>
+        <w:jc w:val="both"/>
+        <w:rPr>
+          <w:rFonts w:cs="B Nazanin"/>
+          <w:sz w:val="28"/>
+          <w:szCs w:val="28"/>
+          <w:lang w:bidi="fa-IR"/>
+        </w:rPr>
+      </w:pPr>
+    </w:p>
+    <w:p>
+      <w:pPr>
+        <w:rPr>
+          <w:rFonts w:cs="B Nazanin"/>
+          <w:sz w:val="28"/>
+          <w:szCs w:val="28"/>
+          <w:lang w:bidi="fa-IR"/>
+        </w:rPr>
+      </w:pPr>
+      <w:r>
+        <w:rPr>
+          <w:rFonts w:cs="B Nazanin"/>
+          <w:sz w:val="28"/>
+          <w:szCs w:val="28"/>
+          <w:lang w:bidi="fa-IR"/>
+        </w:rPr>
+        <w:br w:type="page"/>
+      </w:r>
+    </w:p>
+    <w:p>
+      <w:pPr>
+        <w:tabs>
+          <w:tab w:val="left" w:pos="2127"/>
+        </w:tabs>
+        <w:bidi/>
+        <w:ind w:left="360"/>
+        <w:jc w:val="both"/>
+        <w:rPr>
+          <w:rFonts w:cs="B Titr"/>
+          <w:sz w:val="28"/>
+          <w:szCs w:val="28"/>
+          <w:rtl/>
+          <w:lang w:bidi="fa-IR"/>
+        </w:rPr>
+      </w:pPr>
+      <w:r>
+        <w:rPr>
+          <w:rFonts w:cs="B Titr" w:hint="cs"/>
+          <w:sz w:val="28"/>
+          <w:szCs w:val="28"/>
+          <w:rtl/>
+          <w:lang w:bidi="fa-IR"/>
+        </w:rPr>
+        <w:lastRenderedPageBreak/>
+        <w:t>کپسول سازی در پایتون</w:t>
+      </w:r>
+    </w:p>
+    <w:p>
+      <w:pPr>
+        <w:tabs>
+          <w:tab w:val="left" w:pos="2127"/>
+        </w:tabs>
+        <w:bidi/>
+        <w:ind w:left="360"/>
+        <w:jc w:val="both"/>
+        <w:rPr>
+          <w:rFonts w:cs="B Nazanin"/>
+          <w:sz w:val="28"/>
+          <w:szCs w:val="28"/>
+          <w:rtl/>
+          <w:lang w:bidi="fa-IR"/>
+        </w:rPr>
+      </w:pPr>
+      <w:r>
+        <w:rPr>
+          <w:rFonts w:cs="B Nazanin" w:hint="cs"/>
+          <w:sz w:val="28"/>
+          <w:szCs w:val="28"/>
+          <w:rtl/>
+          <w:lang w:bidi="fa-IR"/>
+        </w:rPr>
+        <w:t>یکی از چهار اصل برنامه نویسی پویا کپسول سازی یا (</w:t>
+      </w:r>
+      <w:r>
+        <w:rPr>
+          <w:rFonts w:cs="B Nazanin"/>
+          <w:sz w:val="28"/>
+          <w:szCs w:val="28"/>
+          <w:lang w:bidi="fa-IR"/>
+        </w:rPr>
+        <w:t>Encapsulation</w:t>
+      </w:r>
+      <w:r>
+        <w:rPr>
+          <w:rFonts w:cs="B Nazanin" w:hint="cs"/>
+          <w:sz w:val="28"/>
+          <w:szCs w:val="28"/>
+          <w:rtl/>
+          <w:lang w:bidi="fa-IR"/>
+        </w:rPr>
+        <w:t>) هست و به این هست که در کلاسی که نوشته شده است چه متود هایی دسترسی عمومی دارند و چه متود هایی دسترسی خصوصی دارند.</w:t>
+      </w:r>
+    </w:p>
+    <w:p>
+      <w:pPr>
+        <w:tabs>
+          <w:tab w:val="left" w:pos="2127"/>
+        </w:tabs>
+        <w:bidi/>
+        <w:ind w:left="360"/>
+        <w:jc w:val="both"/>
+        <w:rPr>
+          <w:rFonts w:cs="B Nazanin"/>
+          <w:sz w:val="28"/>
+          <w:szCs w:val="28"/>
+          <w:rtl/>
+          <w:lang w:bidi="fa-IR"/>
+        </w:rPr>
+      </w:pPr>
+      <w:r>
+        <w:rPr>
+          <w:rFonts w:cs="B Nazanin" w:hint="cs"/>
+          <w:sz w:val="28"/>
+          <w:szCs w:val="28"/>
+          <w:rtl/>
+          <w:lang w:bidi="fa-IR"/>
+        </w:rPr>
+        <w:t>دسترسی خصوصی (</w:t>
+      </w:r>
+      <w:r>
+        <w:rPr>
+          <w:rFonts w:cs="B Nazanin"/>
+          <w:sz w:val="28"/>
+          <w:szCs w:val="28"/>
+          <w:lang w:bidi="fa-IR"/>
+        </w:rPr>
+        <w:t>private</w:t>
+      </w:r>
+      <w:r>
+        <w:rPr>
+          <w:rFonts w:cs="B Nazanin" w:hint="cs"/>
+          <w:sz w:val="28"/>
+          <w:szCs w:val="28"/>
+          <w:rtl/>
+          <w:lang w:bidi="fa-IR"/>
+        </w:rPr>
+        <w:t>): این متود ها فقط از داخل کلاس حق دسترسی دارن و خارج از کلاس قابل فراخوانی نیستند.</w:t>
+      </w:r>
+    </w:p>
+    <w:p>
+      <w:pPr>
+        <w:tabs>
+          <w:tab w:val="left" w:pos="2127"/>
+        </w:tabs>
+        <w:bidi/>
+        <w:ind w:left="360"/>
+        <w:jc w:val="both"/>
+        <w:rPr>
+          <w:rFonts w:cs="B Nazanin"/>
+          <w:sz w:val="28"/>
+          <w:szCs w:val="28"/>
+          <w:rtl/>
+          <w:lang w:bidi="fa-IR"/>
+        </w:rPr>
+      </w:pPr>
+      <w:r>
+        <w:rPr>
+          <w:rFonts w:cs="B Nazanin" w:hint="cs"/>
+          <w:sz w:val="28"/>
+          <w:szCs w:val="28"/>
+          <w:rtl/>
+          <w:lang w:bidi="fa-IR"/>
+        </w:rPr>
+        <w:t>دسترسی عمومی(</w:t>
+      </w:r>
+      <w:r>
+        <w:rPr>
+          <w:rFonts w:cs="B Nazanin"/>
+          <w:sz w:val="28"/>
+          <w:szCs w:val="28"/>
+          <w:lang w:bidi="fa-IR"/>
+        </w:rPr>
+        <w:t>public</w:t>
+      </w:r>
+      <w:r>
+        <w:rPr>
+          <w:rFonts w:cs="B Nazanin" w:hint="cs"/>
+          <w:sz w:val="28"/>
+          <w:szCs w:val="28"/>
+          <w:rtl/>
+          <w:lang w:bidi="fa-IR"/>
+        </w:rPr>
+        <w:t>): این دسته از متود ها علاوه بر دسترسی از داخل خود کلاس، خارج کلاس نیز فراخوانی میشوند.</w:t>
+      </w:r>
+    </w:p>
+    <w:p>
+      <w:pPr>
+        <w:tabs>
+          <w:tab w:val="left" w:pos="2127"/>
+        </w:tabs>
+        <w:bidi/>
+        <w:ind w:left="360"/>
+        <w:jc w:val="both"/>
+        <w:rPr>
+          <w:rFonts w:cs="B Nazanin"/>
+          <w:sz w:val="28"/>
+          <w:szCs w:val="28"/>
+          <w:rtl/>
+          <w:lang w:bidi="fa-IR"/>
+        </w:rPr>
+      </w:pPr>
+      <w:r>
+        <w:rPr>
+          <w:rFonts w:cs="B Nazanin" w:hint="cs"/>
+          <w:sz w:val="28"/>
+          <w:szCs w:val="28"/>
+          <w:rtl/>
+          <w:lang w:bidi="fa-IR"/>
+        </w:rPr>
+        <w:t>در زبان پایتون برای نوشتن اسم متود خصوصی پیشوند (</w:t>
+      </w:r>
+      <w:r>
+        <w:rPr>
+          <w:rFonts w:cs="B Nazanin"/>
+          <w:sz w:val="28"/>
+          <w:szCs w:val="28"/>
+          <w:lang w:bidi="fa-IR"/>
+        </w:rPr>
+        <w:t>__</w:t>
+      </w:r>
+      <w:r>
+        <w:rPr>
+          <w:rFonts w:cs="B Nazanin" w:hint="cs"/>
+          <w:sz w:val="28"/>
+          <w:szCs w:val="28"/>
+          <w:rtl/>
+          <w:lang w:bidi="fa-IR"/>
+        </w:rPr>
+        <w:t>) استفاده میشود و زبان از این مورد متوجه میشود که متود نوشته شده از نوع خصوصی (</w:t>
+      </w:r>
+      <w:r>
+        <w:rPr>
+          <w:rFonts w:cs="B Nazanin"/>
+          <w:sz w:val="28"/>
+          <w:szCs w:val="28"/>
+          <w:lang w:bidi="fa-IR"/>
+        </w:rPr>
+        <w:t>private</w:t>
+      </w:r>
+      <w:r>
+        <w:rPr>
+          <w:rFonts w:cs="B Nazanin" w:hint="cs"/>
+          <w:sz w:val="28"/>
+          <w:szCs w:val="28"/>
+          <w:rtl/>
+          <w:lang w:bidi="fa-IR"/>
+        </w:rPr>
+        <w:t>) است. اما برای نوشتن متود عمومی (</w:t>
+      </w:r>
+      <w:r>
+        <w:rPr>
+          <w:rFonts w:cs="B Nazanin"/>
+          <w:sz w:val="28"/>
+          <w:szCs w:val="28"/>
+          <w:lang w:bidi="fa-IR"/>
+        </w:rPr>
+        <w:t>public</w:t>
+      </w:r>
+      <w:r>
+        <w:rPr>
+          <w:rFonts w:cs="B Nazanin" w:hint="cs"/>
+          <w:sz w:val="28"/>
+          <w:szCs w:val="28"/>
+          <w:rtl/>
+          <w:lang w:bidi="fa-IR"/>
+        </w:rPr>
+        <w:t>) نیاز به پیشوندی ندارد و اسم متود به صورت عادی نوشته میشود.</w:t>
+      </w:r>
+    </w:p>
+    <w:p>
+      <w:pPr>
+        <w:tabs>
+          <w:tab w:val="left" w:pos="2127"/>
+        </w:tabs>
+        <w:bidi/>
+        <w:ind w:left="360"/>
+        <w:jc w:val="both"/>
+        <w:rPr>
+          <w:rFonts w:cs="B Nazanin"/>
+          <w:sz w:val="28"/>
+          <w:szCs w:val="28"/>
+          <w:rtl/>
+          <w:lang w:bidi="fa-IR"/>
+        </w:rPr>
+      </w:pPr>
+      <w:r>
+        <w:rPr>
+          <w:rFonts w:cs="B Nazanin" w:hint="cs"/>
+          <w:sz w:val="28"/>
+          <w:szCs w:val="28"/>
+          <w:rtl/>
+          <w:lang w:bidi="fa-IR"/>
+        </w:rPr>
+        <w:t xml:space="preserve">در قطعه کد زیر تعریف این دو دسته از سطح دستری رو در پایتون میبینیم: </w:t>
+      </w:r>
+    </w:p>
+    <w:p>
+      <w:pPr>
+        <w:tabs>
+          <w:tab w:val="left" w:pos="2127"/>
+        </w:tabs>
+        <w:bidi/>
+        <w:ind w:left="360"/>
+        <w:jc w:val="both"/>
+        <w:rPr>
+          <w:rFonts w:cs="B Nazanin"/>
+          <w:sz w:val="28"/>
+          <w:szCs w:val="28"/>
+          <w:lang w:bidi="fa-IR"/>
+        </w:rPr>
+      </w:pPr>
+      <w:r>
+        <w:rPr>
+          <w:rFonts w:cs="B Nazanin"/>
+          <w:sz w:val="28"/>
+          <w:szCs w:val="28"/>
+          <w:rtl/>
+          <w:lang w:bidi="fa-IR"/>
+        </w:rPr>
+        <w:drawing>
+          <wp:inline distT="0" distB="0" distL="0" distR="0" wp14:anchorId="245982FA" wp14:editId="556C263F">
+            <wp:extent cx="5943600" cy="2353310"/>
+            <wp:effectExtent l="0" t="0" r="0" b="8890"/>
+            <wp:docPr id="2076713456" name="Picture 1"/>
+            <wp:cNvGraphicFramePr>
+              <a:graphicFrameLocks xmlns:a="http://schemas.openxmlformats.org/drawingml/2006/main" noChangeAspect="1"/>
+            </wp:cNvGraphicFramePr>
+            <a:graphic xmlns:a="http://schemas.openxmlformats.org/drawingml/2006/main">
+              <a:graphicData uri="http://schemas.openxmlformats.org/drawingml/2006/picture">
+                <pic:pic xmlns:pic="http://schemas.openxmlformats.org/drawingml/2006/picture">
+                  <pic:nvPicPr>
+                    <pic:cNvPr id="2076713456" name=""/>
+                    <pic:cNvPicPr/>
+                  </pic:nvPicPr>
+                  <pic:blipFill>
+                    <a:blip r:embed="rId18"/>
+                    <a:stretch>
+                      <a:fillRect/>
+                    </a:stretch>
+                  </pic:blipFill>
+                  <pic:spPr>
+                    <a:xfrm>
+                      <a:off x="0" y="0"/>
+                      <a:ext cx="5943600" cy="2353310"/>
+                    </a:xfrm>
+                    <a:prstGeom prst="rect">
+                      <a:avLst/>
+                    </a:prstGeom>
+                  </pic:spPr>
+                </pic:pic>
+              </a:graphicData>
+            </a:graphic>
+          </wp:inline>
+        </w:drawing>
+      </w:r>
+    </w:p>
+    <w:p>
+      <w:pPr>
+        <w:tabs>
+          <w:tab w:val="left" w:pos="2127"/>
+        </w:tabs>
+        <w:bidi/>
+        <w:ind w:left="360"/>
+        <w:jc w:val="both"/>
+        <w:rPr>
+          <w:rFonts w:cs="B Nazanin" w:hint="cs"/>
+          <w:sz w:val="28"/>
+          <w:szCs w:val="28"/>
+          <w:rtl/>
+          <w:lang w:bidi="fa-IR"/>
+        </w:rPr>
+      </w:pPr>
+      <w:r>
+        <w:rPr>
+          <w:rFonts w:cs="B Nazanin" w:hint="cs"/>
+          <w:sz w:val="28"/>
+          <w:szCs w:val="28"/>
+          <w:rtl/>
+          <w:lang w:bidi="fa-IR"/>
+        </w:rPr>
+        <w:t>همانطور که در قطعه کد میبینیم تابع عمومی بدون هیچ خطایی اجرا شده است ولی زمانی که خواستیم متود خصوصی رو خارج از کلاس خودش فراخوانی کنیم به ارور برخورد کردیم.</w:t>
+      </w:r>
     </w:p>
     <w:p>
       <w:pPr>
@@ -5194,7 +5934,6 @@
   <w:style w:type="character" w:default="1" w:styleId="DefaultParagraphFont">
     <w:name w:val="Default Paragraph Font"/>
     <w:uiPriority w:val="1"/>
-    <w:semiHidden/>
     <w:unhideWhenUsed/>
   </w:style>
   <w:style w:type="table" w:default="1" w:styleId="TableNormal">

</xml_diff>

<commit_message>
creat pdf file from tarahi zaban project
</commit_message>
<xml_diff>
--- a/طراحی زبان/پروژه طراحی زبان.docx
+++ b/طراحی زبان/پروژه طراحی زبان.docx
@@ -293,10 +293,9 @@
         <w:spacing w:line="480" w:lineRule="auto"/>
         <w:jc w:val="center"/>
         <w:rPr>
-          <w:rFonts w:cs="B Titr"/>
+          <w:rFonts w:asciiTheme="minorHAnsi" w:hAnsiTheme="minorHAnsi" w:cs="B Titr"/>
           <w:sz w:val="36"/>
           <w:szCs w:val="36"/>
-          <w:rtl/>
           <w:lang w:bidi="fa-IR"/>
         </w:rPr>
       </w:pPr>
@@ -453,6 +452,7 @@
               <w:rPr>
                 <w:noProof/>
                 <w:webHidden/>
+                <w:rtl/>
               </w:rPr>
               <w:t>4</w:t>
             </w:r>
@@ -582,6 +582,7 @@
               <w:rPr>
                 <w:noProof/>
                 <w:webHidden/>
+                <w:rtl/>
               </w:rPr>
               <w:t>5</w:t>
             </w:r>
@@ -699,6 +700,7 @@
               <w:rPr>
                 <w:noProof/>
                 <w:webHidden/>
+                <w:rtl/>
               </w:rPr>
               <w:t>5</w:t>
             </w:r>
@@ -842,6 +844,7 @@
               <w:rPr>
                 <w:noProof/>
                 <w:webHidden/>
+                <w:rtl/>
               </w:rPr>
               <w:t>5</w:t>
             </w:r>
@@ -962,6 +965,7 @@
               <w:rPr>
                 <w:noProof/>
                 <w:webHidden/>
+                <w:rtl/>
               </w:rPr>
               <w:t>6</w:t>
             </w:r>
@@ -1114,6 +1118,7 @@
               <w:rPr>
                 <w:noProof/>
                 <w:webHidden/>
+                <w:rtl/>
               </w:rPr>
               <w:t>6</w:t>
             </w:r>
@@ -1237,6 +1242,7 @@
               <w:rPr>
                 <w:noProof/>
                 <w:webHidden/>
+                <w:rtl/>
               </w:rPr>
               <w:t>7</w:t>
             </w:r>
@@ -1357,6 +1363,7 @@
               <w:rPr>
                 <w:noProof/>
                 <w:webHidden/>
+                <w:rtl/>
               </w:rPr>
               <w:t>8</w:t>
             </w:r>
@@ -1499,6 +1506,7 @@
               <w:rPr>
                 <w:noProof/>
                 <w:webHidden/>
+                <w:rtl/>
               </w:rPr>
               <w:t>8</w:t>
             </w:r>
@@ -1651,6 +1659,7 @@
               <w:rPr>
                 <w:noProof/>
                 <w:webHidden/>
+                <w:rtl/>
               </w:rPr>
               <w:t>8</w:t>
             </w:r>
@@ -1812,6 +1821,7 @@
               <w:rPr>
                 <w:noProof/>
                 <w:webHidden/>
+                <w:rtl/>
               </w:rPr>
               <w:t>9</w:t>
             </w:r>
@@ -1903,6 +1913,7 @@
               <w:rPr>
                 <w:noProof/>
                 <w:webHidden/>
+                <w:rtl/>
               </w:rPr>
               <w:t>10</w:t>
             </w:r>
@@ -2026,6 +2037,7 @@
               <w:rPr>
                 <w:noProof/>
                 <w:webHidden/>
+                <w:rtl/>
               </w:rPr>
               <w:t>10</w:t>
             </w:r>
@@ -2146,6 +2158,7 @@
               <w:rPr>
                 <w:noProof/>
                 <w:webHidden/>
+                <w:rtl/>
               </w:rPr>
               <w:t>11</w:t>
             </w:r>
@@ -2237,6 +2250,7 @@
               <w:rPr>
                 <w:noProof/>
                 <w:webHidden/>
+                <w:rtl/>
               </w:rPr>
               <w:t>12</w:t>
             </w:r>
@@ -2366,6 +2380,7 @@
               <w:rPr>
                 <w:noProof/>
                 <w:webHidden/>
+                <w:rtl/>
               </w:rPr>
               <w:t>13</w:t>
             </w:r>
@@ -2476,6 +2491,7 @@
               <w:rPr>
                 <w:noProof/>
                 <w:webHidden/>
+                <w:rtl/>
               </w:rPr>
               <w:t>14</w:t>
             </w:r>
@@ -2616,6 +2632,7 @@
               <w:rPr>
                 <w:noProof/>
                 <w:webHidden/>
+                <w:rtl/>
               </w:rPr>
               <w:t>15</w:t>
             </w:r>
@@ -2726,6 +2743,7 @@
               <w:rPr>
                 <w:noProof/>
                 <w:webHidden/>
+                <w:rtl/>
               </w:rPr>
               <w:t>16</w:t>
             </w:r>
@@ -2846,6 +2864,7 @@
               <w:rPr>
                 <w:noProof/>
                 <w:webHidden/>
+                <w:rtl/>
               </w:rPr>
               <w:t>17</w:t>
             </w:r>

</xml_diff>